<commit_message>
Se agregan calcCRC(), calcCRCNS(), facNS, facFH para generar CHKSUM por registros Hx de la prueba
</commit_message>
<xml_diff>
--- a/OpusIMCleanOBD_061125.docx
+++ b/OpusIMCleanOBD_061125.docx
@@ -180,8 +180,6 @@
         </w:rPr>
         <w:t>IMClean</w:t>
       </w:r>
-      <w:bookmarkStart w:id="0" w:name="_GoBack"/>
-      <w:bookmarkEnd w:id="0"/>
       <w:proofErr w:type="spellEnd"/>
       <w:r>
         <w:rPr>
@@ -217,8 +215,10 @@
       </w:pPr>
       <w:r>
         <w:rPr>
+          <w:noProof/>
           <w:sz w:val="24"/>
           <w:szCs w:val="24"/>
+          <w:lang w:eastAsia="es-MX"/>
         </w:rPr>
         <w:drawing>
           <wp:inline distT="0" distB="0" distL="0" distR="0" wp14:anchorId="1D73B203" wp14:editId="18C65DBD">
@@ -347,15 +347,7 @@
           <w:szCs w:val="24"/>
           <w:lang w:val="en-US"/>
         </w:rPr>
-        <w:t>Opus</w:t>
-      </w:r>
-      <w:r>
-        <w:rPr>
-          <w:sz w:val="24"/>
-          <w:szCs w:val="24"/>
-          <w:lang w:val="en-US"/>
-        </w:rPr>
-        <w:t>IMClean</w:t>
+        <w:t>OpusIMClean</w:t>
       </w:r>
       <w:proofErr w:type="spellEnd"/>
       <w:r>
@@ -408,15 +400,7 @@
           <w:szCs w:val="24"/>
           <w:lang w:val="en-US"/>
         </w:rPr>
-        <w:t>\</w:t>
-      </w:r>
-      <w:r>
-        <w:rPr>
-          <w:sz w:val="24"/>
-          <w:szCs w:val="24"/>
-          <w:lang w:val="en-US"/>
-        </w:rPr>
-        <w:t>IMCleanDriver.dll</w:t>
+        <w:t>\IMCleanDriver.dll</w:t>
       </w:r>
     </w:p>
     <w:p>
@@ -914,14 +898,26 @@
               <w:rPr>
                 <w:sz w:val="24"/>
                 <w:szCs w:val="24"/>
+                <w:lang w:val="en-US"/>
               </w:rPr>
             </w:pPr>
-            <w:r>
-              <w:rPr>
-                <w:sz w:val="24"/>
-                <w:szCs w:val="24"/>
-              </w:rPr>
-              <w:t>Ejemplo:</w:t>
+            <w:proofErr w:type="spellStart"/>
+            <w:r>
+              <w:rPr>
+                <w:sz w:val="24"/>
+                <w:szCs w:val="24"/>
+                <w:lang w:val="en-US"/>
+              </w:rPr>
+              <w:t>Ejemplo</w:t>
+            </w:r>
+            <w:proofErr w:type="spellEnd"/>
+            <w:r>
+              <w:rPr>
+                <w:sz w:val="24"/>
+                <w:szCs w:val="24"/>
+                <w:lang w:val="en-US"/>
+              </w:rPr>
+              <w:t>:</w:t>
             </w:r>
           </w:p>
           <w:p>
@@ -930,6 +926,7 @@
               <w:rPr>
                 <w:sz w:val="24"/>
                 <w:szCs w:val="24"/>
+                <w:lang w:val="en-US"/>
               </w:rPr>
             </w:pPr>
           </w:p>
@@ -939,6 +936,7 @@
               <w:rPr>
                 <w:sz w:val="24"/>
                 <w:szCs w:val="24"/>
+                <w:lang w:val="en-US"/>
               </w:rPr>
             </w:pPr>
             <w:proofErr w:type="spellStart"/>
@@ -946,6 +944,7 @@
               <w:rPr>
                 <w:sz w:val="24"/>
                 <w:szCs w:val="24"/>
+                <w:lang w:val="en-US"/>
               </w:rPr>
               <w:t>ReviewDevicePlug</w:t>
             </w:r>
@@ -954,15 +953,9 @@
               <w:rPr>
                 <w:sz w:val="24"/>
                 <w:szCs w:val="24"/>
-              </w:rPr>
-              <w:t xml:space="preserve">: Key? </w:t>
-            </w:r>
-            <w:r>
-              <w:rPr>
-                <w:sz w:val="24"/>
-                <w:szCs w:val="24"/>
-              </w:rPr>
-              <w:t>207393E-FC5CEE1157CC</w:t>
+                <w:lang w:val="en-US"/>
+              </w:rPr>
+              <w:t>: Key? 207393E-FC5CEE1157CC</w:t>
             </w:r>
           </w:p>
           <w:p>
@@ -1084,21 +1077,7 @@
                 <w:sz w:val="24"/>
                 <w:szCs w:val="24"/>
               </w:rPr>
-              <w:t xml:space="preserve">un año a partir de la fecha de emisión, esto con la finalidad de controlar y asegurar siempre cuente con la versión del </w:t>
-            </w:r>
-            <w:r>
-              <w:rPr>
-                <w:sz w:val="24"/>
-                <w:szCs w:val="24"/>
-              </w:rPr>
-              <w:t>driver</w:t>
-            </w:r>
-            <w:r>
-              <w:rPr>
-                <w:sz w:val="24"/>
-                <w:szCs w:val="24"/>
-              </w:rPr>
-              <w:t xml:space="preserve"> vigente más actualizada.</w:t>
+              <w:t>un año a partir de la fecha de emisión, esto con la finalidad de controlar y asegurar siempre cuente con la versión del driver vigente más actualizada.</w:t>
             </w:r>
           </w:p>
           <w:p>
@@ -1614,15 +1593,15 @@
                 <w:szCs w:val="24"/>
               </w:rPr>
             </w:pPr>
-            <w:proofErr w:type="spellStart"/>
-            <w:r>
-              <w:rPr>
-                <w:sz w:val="24"/>
-                <w:szCs w:val="24"/>
-              </w:rPr>
-              <w:t>OBDdata_VINhx</w:t>
-            </w:r>
-            <w:proofErr w:type="spellEnd"/>
+            <w:r>
+              <w:rPr>
+                <w:sz w:val="24"/>
+                <w:szCs w:val="24"/>
+              </w:rPr>
+              <w:t>Fecha_Test</w:t>
+            </w:r>
+            <w:bookmarkStart w:id="0" w:name="_GoBack"/>
+            <w:bookmarkEnd w:id="0"/>
           </w:p>
         </w:tc>
         <w:tc>
@@ -1637,20 +1616,6 @@
                 <w:szCs w:val="24"/>
               </w:rPr>
             </w:pPr>
-            <w:r>
-              <w:rPr>
-                <w:sz w:val="24"/>
-                <w:szCs w:val="24"/>
-              </w:rPr>
-              <w:t xml:space="preserve">Número de serie del vehículo en formato hexadecimal, </w:t>
-            </w:r>
-            <w:r>
-              <w:rPr>
-                <w:sz w:val="24"/>
-                <w:szCs w:val="24"/>
-              </w:rPr>
-              <w:t>lectura fiel del ECU.</w:t>
-            </w:r>
           </w:p>
         </w:tc>
       </w:tr>
@@ -1673,7 +1638,7 @@
                 <w:sz w:val="24"/>
                 <w:szCs w:val="24"/>
               </w:rPr>
-              <w:t>OBDdata_VIN</w:t>
+              <w:t>OBDdata_VINhx</w:t>
             </w:r>
             <w:proofErr w:type="spellEnd"/>
           </w:p>
@@ -1695,21 +1660,14 @@
                 <w:sz w:val="24"/>
                 <w:szCs w:val="24"/>
               </w:rPr>
-              <w:t>Número de serie del veh</w:t>
-            </w:r>
-            <w:r>
-              <w:rPr>
-                <w:sz w:val="24"/>
-                <w:szCs w:val="24"/>
-              </w:rPr>
-              <w:t>ículo</w:t>
-            </w:r>
-            <w:r>
-              <w:rPr>
-                <w:sz w:val="24"/>
-                <w:szCs w:val="24"/>
-              </w:rPr>
-              <w:t>.</w:t>
+              <w:t xml:space="preserve">Número de serie del vehículo en formato hexadecimal, </w:t>
+            </w:r>
+            <w:r>
+              <w:rPr>
+                <w:sz w:val="24"/>
+                <w:szCs w:val="24"/>
+              </w:rPr>
+              <w:t>lectura fiel del ECU.</w:t>
             </w:r>
           </w:p>
         </w:tc>
@@ -1733,7 +1691,7 @@
                 <w:sz w:val="24"/>
                 <w:szCs w:val="24"/>
               </w:rPr>
-              <w:t>OBDdata_MILhx</w:t>
+              <w:t>OBDdata_VIN</w:t>
             </w:r>
             <w:proofErr w:type="spellEnd"/>
           </w:p>
@@ -1755,21 +1713,7 @@
                 <w:sz w:val="24"/>
                 <w:szCs w:val="24"/>
               </w:rPr>
-              <w:t xml:space="preserve">Lectura de monitores y luz MIL, </w:t>
-            </w:r>
-            <w:r>
-              <w:rPr>
-                <w:sz w:val="24"/>
-                <w:szCs w:val="24"/>
-              </w:rPr>
-              <w:t>formato hexadecimal, lectura fiel del ECU.</w:t>
-            </w:r>
-            <w:r>
-              <w:rPr>
-                <w:sz w:val="24"/>
-                <w:szCs w:val="24"/>
-              </w:rPr>
-              <w:t xml:space="preserve"> </w:t>
+              <w:t>Número de serie del vehículo.</w:t>
             </w:r>
           </w:p>
         </w:tc>
@@ -1793,7 +1737,7 @@
                 <w:sz w:val="24"/>
                 <w:szCs w:val="24"/>
               </w:rPr>
-              <w:t>OBDdata_MIL</w:t>
+              <w:t>OBDdata_MILhx</w:t>
             </w:r>
             <w:proofErr w:type="spellEnd"/>
           </w:p>
@@ -1815,54 +1759,7 @@
                 <w:sz w:val="24"/>
                 <w:szCs w:val="24"/>
               </w:rPr>
-              <w:t>Estatus de</w:t>
-            </w:r>
-            <w:r>
-              <w:rPr>
-                <w:sz w:val="24"/>
-                <w:szCs w:val="24"/>
-              </w:rPr>
-              <w:t xml:space="preserve"> luz MIL</w:t>
-            </w:r>
-            <w:r>
-              <w:rPr>
-                <w:sz w:val="24"/>
-                <w:szCs w:val="24"/>
-              </w:rPr>
-              <w:t xml:space="preserve">. </w:t>
-            </w:r>
-          </w:p>
-          <w:p>
-            <w:pPr>
-              <w:jc w:val="both"/>
-              <w:rPr>
-                <w:sz w:val="24"/>
-                <w:szCs w:val="24"/>
-              </w:rPr>
-            </w:pPr>
-            <w:r>
-              <w:rPr>
-                <w:sz w:val="24"/>
-                <w:szCs w:val="24"/>
-              </w:rPr>
-              <w:lastRenderedPageBreak/>
-              <w:t xml:space="preserve">“0” = Apagada </w:t>
-            </w:r>
-          </w:p>
-          <w:p>
-            <w:pPr>
-              <w:jc w:val="both"/>
-              <w:rPr>
-                <w:sz w:val="24"/>
-                <w:szCs w:val="24"/>
-              </w:rPr>
-            </w:pPr>
-            <w:r>
-              <w:rPr>
-                <w:sz w:val="24"/>
-                <w:szCs w:val="24"/>
-              </w:rPr>
-              <w:t>“1” = Encendida.</w:t>
+              <w:t xml:space="preserve">Lectura de monitores y luz MIL, formato hexadecimal, lectura fiel del ECU. </w:t>
             </w:r>
           </w:p>
         </w:tc>
@@ -1887,7 +1784,7 @@
                 <w:szCs w:val="24"/>
               </w:rPr>
               <w:lastRenderedPageBreak/>
-              <w:t>OBDdata_DTChx</w:t>
+              <w:t>OBDdata_MIL</w:t>
             </w:r>
             <w:proofErr w:type="spellEnd"/>
           </w:p>
@@ -1909,21 +1806,39 @@
                 <w:sz w:val="24"/>
                 <w:szCs w:val="24"/>
               </w:rPr>
-              <w:t xml:space="preserve">Lectura de </w:t>
-            </w:r>
-            <w:r>
-              <w:rPr>
-                <w:sz w:val="24"/>
-                <w:szCs w:val="24"/>
-              </w:rPr>
-              <w:t>códigos de fallas detectados</w:t>
-            </w:r>
-            <w:r>
-              <w:rPr>
-                <w:sz w:val="24"/>
-                <w:szCs w:val="24"/>
-              </w:rPr>
-              <w:t>, lectura fiel del ECU.</w:t>
+              <w:t xml:space="preserve">Estatus de luz MIL. </w:t>
+            </w:r>
+          </w:p>
+          <w:p>
+            <w:pPr>
+              <w:jc w:val="both"/>
+              <w:rPr>
+                <w:sz w:val="24"/>
+                <w:szCs w:val="24"/>
+              </w:rPr>
+            </w:pPr>
+            <w:r>
+              <w:rPr>
+                <w:sz w:val="24"/>
+                <w:szCs w:val="24"/>
+              </w:rPr>
+              <w:t xml:space="preserve">“0” = Apagada </w:t>
+            </w:r>
+          </w:p>
+          <w:p>
+            <w:pPr>
+              <w:jc w:val="both"/>
+              <w:rPr>
+                <w:sz w:val="24"/>
+                <w:szCs w:val="24"/>
+              </w:rPr>
+            </w:pPr>
+            <w:r>
+              <w:rPr>
+                <w:sz w:val="24"/>
+                <w:szCs w:val="24"/>
+              </w:rPr>
+              <w:t>“1” = Encendida.</w:t>
             </w:r>
           </w:p>
         </w:tc>
@@ -1947,7 +1862,7 @@
                 <w:sz w:val="24"/>
                 <w:szCs w:val="24"/>
               </w:rPr>
-              <w:t>OBDdata_DTC</w:t>
+              <w:t>OBDdata_DTChx</w:t>
             </w:r>
             <w:proofErr w:type="spellEnd"/>
           </w:p>
@@ -1969,21 +1884,53 @@
                 <w:sz w:val="24"/>
                 <w:szCs w:val="24"/>
               </w:rPr>
-              <w:t>C</w:t>
-            </w:r>
-            <w:r>
-              <w:rPr>
-                <w:sz w:val="24"/>
-                <w:szCs w:val="24"/>
-              </w:rPr>
-              <w:t>ódigos de fallas detectados</w:t>
-            </w:r>
-            <w:r>
-              <w:rPr>
-                <w:sz w:val="24"/>
-                <w:szCs w:val="24"/>
-              </w:rPr>
-              <w:t>, separados por comas.</w:t>
+              <w:t>Lectura de códigos de fallas detectados, lectura fiel del ECU.</w:t>
+            </w:r>
+          </w:p>
+        </w:tc>
+      </w:tr>
+      <w:tr>
+        <w:tc>
+          <w:tcPr>
+            <w:tcW w:w="2445" w:type="dxa"/>
+          </w:tcPr>
+          <w:p>
+            <w:pPr>
+              <w:jc w:val="both"/>
+              <w:rPr>
+                <w:sz w:val="24"/>
+                <w:szCs w:val="24"/>
+              </w:rPr>
+            </w:pPr>
+            <w:proofErr w:type="spellStart"/>
+            <w:r>
+              <w:rPr>
+                <w:sz w:val="24"/>
+                <w:szCs w:val="24"/>
+              </w:rPr>
+              <w:t>OBDdata_DTC</w:t>
+            </w:r>
+            <w:proofErr w:type="spellEnd"/>
+          </w:p>
+        </w:tc>
+        <w:tc>
+          <w:tcPr>
+            <w:tcW w:w="7168" w:type="dxa"/>
+          </w:tcPr>
+          <w:p>
+            <w:pPr>
+              <w:jc w:val="both"/>
+              <w:rPr>
+                <w:sz w:val="24"/>
+                <w:szCs w:val="24"/>
+              </w:rPr>
+            </w:pPr>
+            <w:r>
+              <w:rPr>
+                <w:sz w:val="24"/>
+                <w:szCs w:val="24"/>
+              </w:rPr>
+              <w:t>Códigos de fallas detectados, separados por comas.</w:t>
             </w:r>
           </w:p>
         </w:tc>
@@ -8134,7 +8081,7 @@
   <a:extraClrSchemeLst/>
   <a:extLst>
     <a:ext uri="{05A4C25C-085E-4340-85A3-A5531E510DB2}">
-      <thm15:themeFamily xmlns:thm15="http://schemas.microsoft.com/office/thememl/2012/main" xmlns="" name="Office Theme" id="{62F939B6-93AF-4DB8-9C6B-D6C7DFDC589F}" vid="{4A3C46E8-61CC-4603-A589-7422A47A8E4A}"/>
+      <thm15:themeFamily xmlns="" xmlns:thm15="http://schemas.microsoft.com/office/thememl/2012/main" name="Office Theme" id="{62F939B6-93AF-4DB8-9C6B-D6C7DFDC589F}" vid="{4A3C46E8-61CC-4603-A589-7422A47A8E4A}"/>
     </a:ext>
   </a:extLst>
 </a:theme>
@@ -8145,7 +8092,7 @@
 </file>
 
 <file path=customXml/itemProps1.xml><?xml version="1.0" encoding="utf-8"?>
-<ds:datastoreItem xmlns:ds="http://schemas.openxmlformats.org/officeDocument/2006/customXml" ds:itemID="{82FDF978-4CF3-4B9D-8BFB-92B058BE5618}">
+<ds:datastoreItem xmlns:ds="http://schemas.openxmlformats.org/officeDocument/2006/customXml" ds:itemID="{8A1269D8-7020-42E8-A78E-C069869255BB}">
   <ds:schemaRefs>
     <ds:schemaRef ds:uri="http://schemas.openxmlformats.org/officeDocument/2006/bibliography"/>
   </ds:schemaRefs>

</xml_diff>

<commit_message>
Se agrega reloj de conexión / Thread.
</commit_message>
<xml_diff>
--- a/OpusIMCleanOBD_061125.docx
+++ b/OpusIMCleanOBD_061125.docx
@@ -326,116 +326,9 @@
     <w:p>
       <w:pPr>
         <w:jc w:val="both"/>
-        <w:rPr>
-          <w:sz w:val="24"/>
-          <w:szCs w:val="24"/>
-          <w:lang w:val="en-US"/>
-        </w:rPr>
       </w:pPr>
       <w:r>
-        <w:rPr>
-          <w:sz w:val="24"/>
-          <w:szCs w:val="24"/>
-          <w:lang w:val="en-US"/>
-        </w:rPr>
-        <w:t xml:space="preserve">C:\ </w:t>
-      </w:r>
-      <w:proofErr w:type="spellStart"/>
-      <w:r>
-        <w:rPr>
-          <w:sz w:val="24"/>
-          <w:szCs w:val="24"/>
-          <w:lang w:val="en-US"/>
-        </w:rPr>
-        <w:t>OpusIMClean</w:t>
-      </w:r>
-      <w:proofErr w:type="spellEnd"/>
-      <w:r>
-        <w:rPr>
-          <w:sz w:val="24"/>
-          <w:szCs w:val="24"/>
-          <w:lang w:val="en-US"/>
-        </w:rPr>
-        <w:t>\</w:t>
-      </w:r>
-      <w:r>
-        <w:rPr>
-          <w:sz w:val="24"/>
-          <w:szCs w:val="24"/>
-          <w:lang w:val="en-US"/>
-        </w:rPr>
-        <w:t>IIMCleanDriver.dll</w:t>
-      </w:r>
-    </w:p>
-    <w:p>
-      <w:pPr>
-        <w:jc w:val="both"/>
-        <w:rPr>
-          <w:sz w:val="24"/>
-          <w:szCs w:val="24"/>
-          <w:lang w:val="en-US"/>
-        </w:rPr>
-      </w:pPr>
-      <w:r>
-        <w:rPr>
-          <w:sz w:val="24"/>
-          <w:szCs w:val="24"/>
-          <w:lang w:val="en-US"/>
-        </w:rPr>
-        <w:t xml:space="preserve">C:\ </w:t>
-      </w:r>
-      <w:proofErr w:type="spellStart"/>
-      <w:r>
-        <w:rPr>
-          <w:sz w:val="24"/>
-          <w:szCs w:val="24"/>
-          <w:lang w:val="en-US"/>
-        </w:rPr>
-        <w:t>OpusIMClean</w:t>
-      </w:r>
-      <w:proofErr w:type="spellEnd"/>
-      <w:r>
-        <w:rPr>
-          <w:sz w:val="24"/>
-          <w:szCs w:val="24"/>
-          <w:lang w:val="en-US"/>
-        </w:rPr>
-        <w:t>\IMCleanDriver.dll</w:t>
-      </w:r>
-    </w:p>
-    <w:p>
-      <w:pPr>
-        <w:jc w:val="both"/>
-      </w:pPr>
-      <w:r>
-        <w:rPr>
-          <w:sz w:val="24"/>
-          <w:szCs w:val="24"/>
-        </w:rPr>
-        <w:t>C:\</w:t>
-      </w:r>
-      <w:r>
-        <w:rPr>
-          <w:sz w:val="24"/>
-          <w:szCs w:val="24"/>
-        </w:rPr>
-        <w:t xml:space="preserve"> </w:t>
-      </w:r>
-      <w:proofErr w:type="spellStart"/>
-      <w:r>
-        <w:rPr>
-          <w:sz w:val="24"/>
-          <w:szCs w:val="24"/>
-        </w:rPr>
-        <w:t>OpusIMClean</w:t>
-      </w:r>
-      <w:proofErr w:type="spellEnd"/>
-      <w:r>
-        <w:rPr>
-          <w:sz w:val="24"/>
-          <w:szCs w:val="24"/>
-        </w:rPr>
-        <w:t>\</w:t>
+        <w:t>El “</w:t>
       </w:r>
       <w:r>
         <w:rPr>
@@ -445,7 +338,50 @@
         <w:t>OpusIMCleanOBDdrv.dll</w:t>
       </w:r>
       <w:r>
-        <w:t xml:space="preserve"> </w:t>
+        <w:rPr>
+          <w:sz w:val="24"/>
+          <w:szCs w:val="24"/>
+        </w:rPr>
+        <w:t xml:space="preserve">” es una </w:t>
+      </w:r>
+      <w:r>
+        <w:rPr>
+          <w:sz w:val="24"/>
+          <w:szCs w:val="24"/>
+        </w:rPr>
+        <w:t xml:space="preserve">interface de software de comunicación con el dispositivo OBD </w:t>
+      </w:r>
+      <w:proofErr w:type="spellStart"/>
+      <w:r>
+        <w:rPr>
+          <w:sz w:val="24"/>
+          <w:szCs w:val="24"/>
+        </w:rPr>
+        <w:t>IMClean</w:t>
+      </w:r>
+      <w:proofErr w:type="spellEnd"/>
+      <w:r>
+        <w:rPr>
+          <w:sz w:val="24"/>
+          <w:szCs w:val="24"/>
+        </w:rPr>
+        <w:t xml:space="preserve"> que prescinde de puertos COM o seriales, con lo cual se evita que los datos captados del ECU del vehículo queden expuestos a la intervención de una entidad ajena al proceso. Adicionalmente los registros son firmados con un </w:t>
+      </w:r>
+      <w:proofErr w:type="spellStart"/>
+      <w:r>
+        <w:rPr>
+          <w:sz w:val="24"/>
+          <w:szCs w:val="24"/>
+        </w:rPr>
+        <w:t>chksum</w:t>
+      </w:r>
+      <w:proofErr w:type="spellEnd"/>
+      <w:r>
+        <w:rPr>
+          <w:sz w:val="24"/>
+          <w:szCs w:val="24"/>
+        </w:rPr>
+        <w:t xml:space="preserve"> que asegura su integridad. </w:t>
       </w:r>
     </w:p>
     <w:p>
@@ -456,6 +392,373 @@
           <w:szCs w:val="24"/>
         </w:rPr>
       </w:pPr>
+    </w:p>
+    <w:tbl>
+      <w:tblPr>
+        <w:tblStyle w:val="Tablaconcuadrcula"/>
+        <w:tblW w:w="0" w:type="auto"/>
+        <w:tblLook w:val="04A0" w:firstRow="1" w:lastRow="0" w:firstColumn="1" w:lastColumn="0" w:noHBand="0" w:noVBand="1"/>
+      </w:tblPr>
+      <w:tblGrid>
+        <w:gridCol w:w="4772"/>
+        <w:gridCol w:w="4772"/>
+      </w:tblGrid>
+      <w:tr>
+        <w:tc>
+          <w:tcPr>
+            <w:tcW w:w="4772" w:type="dxa"/>
+          </w:tcPr>
+          <w:p>
+            <w:pPr>
+              <w:jc w:val="both"/>
+              <w:rPr>
+                <w:sz w:val="24"/>
+                <w:szCs w:val="24"/>
+                <w:lang w:val="en-US"/>
+              </w:rPr>
+            </w:pPr>
+            <w:r>
+              <w:rPr>
+                <w:sz w:val="24"/>
+                <w:szCs w:val="24"/>
+                <w:lang w:val="en-US"/>
+              </w:rPr>
+              <w:t xml:space="preserve">C:\ </w:t>
+            </w:r>
+            <w:proofErr w:type="spellStart"/>
+            <w:r>
+              <w:rPr>
+                <w:sz w:val="24"/>
+                <w:szCs w:val="24"/>
+                <w:lang w:val="en-US"/>
+              </w:rPr>
+              <w:t>OpusIMClean</w:t>
+            </w:r>
+            <w:proofErr w:type="spellEnd"/>
+            <w:r>
+              <w:rPr>
+                <w:sz w:val="24"/>
+                <w:szCs w:val="24"/>
+                <w:lang w:val="en-US"/>
+              </w:rPr>
+              <w:t>\OpusIMCleanOBDdrv.dll</w:t>
+            </w:r>
+          </w:p>
+        </w:tc>
+        <w:tc>
+          <w:tcPr>
+            <w:tcW w:w="4772" w:type="dxa"/>
+          </w:tcPr>
+          <w:p>
+            <w:pPr>
+              <w:jc w:val="both"/>
+              <w:rPr>
+                <w:sz w:val="24"/>
+                <w:szCs w:val="24"/>
+              </w:rPr>
+            </w:pPr>
+            <w:r>
+              <w:rPr>
+                <w:sz w:val="24"/>
+                <w:szCs w:val="24"/>
+              </w:rPr>
+              <w:t>Driver de operación del dispositivo.</w:t>
+            </w:r>
+            <w:bookmarkStart w:id="0" w:name="_GoBack"/>
+            <w:bookmarkEnd w:id="0"/>
+          </w:p>
+        </w:tc>
+      </w:tr>
+      <w:tr>
+        <w:tc>
+          <w:tcPr>
+            <w:tcW w:w="4772" w:type="dxa"/>
+          </w:tcPr>
+          <w:p>
+            <w:pPr>
+              <w:jc w:val="both"/>
+              <w:rPr>
+                <w:sz w:val="24"/>
+                <w:szCs w:val="24"/>
+                <w:lang w:val="en-US"/>
+              </w:rPr>
+            </w:pPr>
+            <w:r>
+              <w:rPr>
+                <w:sz w:val="24"/>
+                <w:szCs w:val="24"/>
+                <w:lang w:val="en-US"/>
+              </w:rPr>
+              <w:t xml:space="preserve">C:\ </w:t>
+            </w:r>
+            <w:proofErr w:type="spellStart"/>
+            <w:r>
+              <w:rPr>
+                <w:sz w:val="24"/>
+                <w:szCs w:val="24"/>
+                <w:lang w:val="en-US"/>
+              </w:rPr>
+              <w:t>OpusIMClean</w:t>
+            </w:r>
+            <w:proofErr w:type="spellEnd"/>
+            <w:r>
+              <w:rPr>
+                <w:sz w:val="24"/>
+                <w:szCs w:val="24"/>
+                <w:lang w:val="en-US"/>
+              </w:rPr>
+              <w:t>\IIMCleanDriver.dll</w:t>
+            </w:r>
+          </w:p>
+        </w:tc>
+        <w:tc>
+          <w:tcPr>
+            <w:tcW w:w="4772" w:type="dxa"/>
+          </w:tcPr>
+          <w:p>
+            <w:pPr>
+              <w:jc w:val="both"/>
+              <w:rPr>
+                <w:sz w:val="24"/>
+                <w:szCs w:val="24"/>
+                <w:lang w:val="en-US"/>
+              </w:rPr>
+            </w:pPr>
+            <w:r>
+              <w:rPr>
+                <w:sz w:val="24"/>
+                <w:szCs w:val="24"/>
+                <w:lang w:val="en-US"/>
+              </w:rPr>
+              <w:t xml:space="preserve">DLL del </w:t>
+            </w:r>
+            <w:proofErr w:type="spellStart"/>
+            <w:r>
+              <w:rPr>
+                <w:sz w:val="24"/>
+                <w:szCs w:val="24"/>
+                <w:lang w:val="en-US"/>
+              </w:rPr>
+              <w:t>fabricante</w:t>
+            </w:r>
+            <w:proofErr w:type="spellEnd"/>
+            <w:r>
+              <w:rPr>
+                <w:sz w:val="24"/>
+                <w:szCs w:val="24"/>
+                <w:lang w:val="en-US"/>
+              </w:rPr>
+              <w:t>.</w:t>
+            </w:r>
+          </w:p>
+        </w:tc>
+      </w:tr>
+      <w:tr>
+        <w:tc>
+          <w:tcPr>
+            <w:tcW w:w="4772" w:type="dxa"/>
+          </w:tcPr>
+          <w:p>
+            <w:pPr>
+              <w:jc w:val="both"/>
+              <w:rPr>
+                <w:sz w:val="24"/>
+                <w:szCs w:val="24"/>
+                <w:lang w:val="en-US"/>
+              </w:rPr>
+            </w:pPr>
+            <w:r>
+              <w:rPr>
+                <w:sz w:val="24"/>
+                <w:szCs w:val="24"/>
+                <w:lang w:val="en-US"/>
+              </w:rPr>
+              <w:t xml:space="preserve">C:\ </w:t>
+            </w:r>
+            <w:proofErr w:type="spellStart"/>
+            <w:r>
+              <w:rPr>
+                <w:sz w:val="24"/>
+                <w:szCs w:val="24"/>
+                <w:lang w:val="en-US"/>
+              </w:rPr>
+              <w:t>OpusIMClean</w:t>
+            </w:r>
+            <w:proofErr w:type="spellEnd"/>
+            <w:r>
+              <w:rPr>
+                <w:sz w:val="24"/>
+                <w:szCs w:val="24"/>
+                <w:lang w:val="en-US"/>
+              </w:rPr>
+              <w:t>\IMCleanDriver.dll</w:t>
+            </w:r>
+          </w:p>
+        </w:tc>
+        <w:tc>
+          <w:tcPr>
+            <w:tcW w:w="4772" w:type="dxa"/>
+          </w:tcPr>
+          <w:p>
+            <w:pPr>
+              <w:jc w:val="both"/>
+              <w:rPr>
+                <w:sz w:val="24"/>
+                <w:szCs w:val="24"/>
+                <w:lang w:val="en-US"/>
+              </w:rPr>
+            </w:pPr>
+            <w:r>
+              <w:rPr>
+                <w:sz w:val="24"/>
+                <w:szCs w:val="24"/>
+                <w:lang w:val="en-US"/>
+              </w:rPr>
+              <w:t xml:space="preserve">DLL del </w:t>
+            </w:r>
+            <w:proofErr w:type="spellStart"/>
+            <w:r>
+              <w:rPr>
+                <w:sz w:val="24"/>
+                <w:szCs w:val="24"/>
+                <w:lang w:val="en-US"/>
+              </w:rPr>
+              <w:t>fabricante</w:t>
+            </w:r>
+            <w:proofErr w:type="spellEnd"/>
+            <w:r>
+              <w:rPr>
+                <w:sz w:val="24"/>
+                <w:szCs w:val="24"/>
+                <w:lang w:val="en-US"/>
+              </w:rPr>
+              <w:t>.</w:t>
+            </w:r>
+          </w:p>
+        </w:tc>
+      </w:tr>
+      <w:tr>
+        <w:tc>
+          <w:tcPr>
+            <w:tcW w:w="4772" w:type="dxa"/>
+          </w:tcPr>
+          <w:p>
+            <w:pPr>
+              <w:jc w:val="both"/>
+              <w:rPr>
+                <w:sz w:val="24"/>
+                <w:szCs w:val="24"/>
+                <w:lang w:val="en-US"/>
+              </w:rPr>
+            </w:pPr>
+            <w:r>
+              <w:rPr>
+                <w:sz w:val="24"/>
+                <w:szCs w:val="24"/>
+                <w:lang w:val="en-US"/>
+              </w:rPr>
+              <w:t xml:space="preserve">C:\ </w:t>
+            </w:r>
+            <w:proofErr w:type="spellStart"/>
+            <w:r>
+              <w:rPr>
+                <w:sz w:val="24"/>
+                <w:szCs w:val="24"/>
+                <w:lang w:val="en-US"/>
+              </w:rPr>
+              <w:t>OpusIMClean</w:t>
+            </w:r>
+            <w:proofErr w:type="spellEnd"/>
+            <w:r>
+              <w:rPr>
+                <w:sz w:val="24"/>
+                <w:szCs w:val="24"/>
+                <w:lang w:val="en-US"/>
+              </w:rPr>
+              <w:t>\</w:t>
+            </w:r>
+            <w:r>
+              <w:rPr>
+                <w:sz w:val="24"/>
+                <w:szCs w:val="24"/>
+                <w:lang w:val="en-US"/>
+              </w:rPr>
+              <w:t>MySql.Data.dll</w:t>
+            </w:r>
+          </w:p>
+        </w:tc>
+        <w:tc>
+          <w:tcPr>
+            <w:tcW w:w="4772" w:type="dxa"/>
+          </w:tcPr>
+          <w:p>
+            <w:pPr>
+              <w:jc w:val="both"/>
+              <w:rPr>
+                <w:sz w:val="24"/>
+                <w:szCs w:val="24"/>
+              </w:rPr>
+            </w:pPr>
+            <w:r>
+              <w:rPr>
+                <w:sz w:val="24"/>
+                <w:szCs w:val="24"/>
+              </w:rPr>
+              <w:t xml:space="preserve">DLL de comunicación con </w:t>
+            </w:r>
+            <w:proofErr w:type="spellStart"/>
+            <w:r>
+              <w:rPr>
+                <w:sz w:val="24"/>
+                <w:szCs w:val="24"/>
+              </w:rPr>
+              <w:t>M</w:t>
+            </w:r>
+            <w:r>
+              <w:rPr>
+                <w:sz w:val="24"/>
+                <w:szCs w:val="24"/>
+              </w:rPr>
+              <w:t>ySQL</w:t>
+            </w:r>
+            <w:proofErr w:type="spellEnd"/>
+            <w:r>
+              <w:rPr>
+                <w:sz w:val="24"/>
+                <w:szCs w:val="24"/>
+              </w:rPr>
+              <w:t>.</w:t>
+            </w:r>
+          </w:p>
+        </w:tc>
+      </w:tr>
+    </w:tbl>
+    <w:p>
+      <w:pPr>
+        <w:jc w:val="both"/>
+        <w:rPr>
+          <w:sz w:val="24"/>
+          <w:szCs w:val="24"/>
+        </w:rPr>
+      </w:pPr>
+    </w:p>
+    <w:p>
+      <w:pPr>
+        <w:jc w:val="both"/>
+        <w:rPr>
+          <w:b/>
+          <w:sz w:val="24"/>
+          <w:szCs w:val="24"/>
+        </w:rPr>
+      </w:pPr>
+      <w:r>
+        <w:rPr>
+          <w:b/>
+          <w:sz w:val="24"/>
+          <w:szCs w:val="24"/>
+        </w:rPr>
+        <w:t>Descripción de campos y funciones del DLL.</w:t>
+      </w:r>
     </w:p>
     <w:tbl>
       <w:tblPr>
@@ -505,10 +808,18 @@
             </w:pPr>
             <w:r>
               <w:rPr>
-                <w:sz w:val="24"/>
-                <w:szCs w:val="24"/>
-              </w:rPr>
-              <w:t>Tipo: Función.</w:t>
+                <w:b/>
+                <w:sz w:val="24"/>
+                <w:szCs w:val="24"/>
+              </w:rPr>
+              <w:t>Tipo:</w:t>
+            </w:r>
+            <w:r>
+              <w:rPr>
+                <w:sz w:val="24"/>
+                <w:szCs w:val="24"/>
+              </w:rPr>
+              <w:t xml:space="preserve"> Función.</w:t>
             </w:r>
           </w:p>
           <w:p>
@@ -535,8 +846,19 @@
                 <w:szCs w:val="24"/>
               </w:rPr>
             </w:pPr>
-            <w:r>
-              <w:rPr>
+          </w:p>
+          <w:p>
+            <w:pPr>
+              <w:jc w:val="both"/>
+              <w:rPr>
+                <w:b/>
+                <w:sz w:val="24"/>
+                <w:szCs w:val="24"/>
+              </w:rPr>
+            </w:pPr>
+            <w:r>
+              <w:rPr>
+                <w:b/>
                 <w:sz w:val="24"/>
                 <w:szCs w:val="24"/>
               </w:rPr>
@@ -670,16 +992,14 @@
               </w:rPr>
               <w:t xml:space="preserve">. Esta respuesta se obtiene si no se identifica la licencia de usuario, </w:t>
             </w:r>
-            <w:proofErr w:type="spellStart"/>
             <w:r>
               <w:rPr>
                 <w:sz w:val="24"/>
                 <w:szCs w:val="24"/>
                 <w:lang w:eastAsia="es-MX"/>
               </w:rPr>
-              <w:t>envie</w:t>
-            </w:r>
-            <w:proofErr w:type="spellEnd"/>
+              <w:t>envié</w:t>
+            </w:r>
             <w:r>
               <w:rPr>
                 <w:sz w:val="24"/>
@@ -735,6 +1055,7 @@
                 <w:sz w:val="24"/>
                 <w:szCs w:val="24"/>
               </w:rPr>
+              <w:lastRenderedPageBreak/>
               <w:t>InitIMCleanDevice</w:t>
             </w:r>
             <w:proofErr w:type="spellEnd"/>
@@ -754,11 +1075,230 @@
             </w:pPr>
             <w:r>
               <w:rPr>
-                <w:sz w:val="24"/>
-                <w:szCs w:val="24"/>
-              </w:rPr>
-              <w:t>Tipo: Función.</w:t>
-            </w:r>
+                <w:b/>
+                <w:sz w:val="24"/>
+                <w:szCs w:val="24"/>
+              </w:rPr>
+              <w:t>Tipo</w:t>
+            </w:r>
+            <w:r>
+              <w:rPr>
+                <w:sz w:val="24"/>
+                <w:szCs w:val="24"/>
+              </w:rPr>
+              <w:t>: Función.</w:t>
+            </w:r>
+          </w:p>
+          <w:p>
+            <w:pPr>
+              <w:jc w:val="both"/>
+              <w:rPr>
+                <w:sz w:val="24"/>
+                <w:szCs w:val="24"/>
+              </w:rPr>
+            </w:pPr>
+            <w:r>
+              <w:rPr>
+                <w:sz w:val="24"/>
+                <w:szCs w:val="24"/>
+              </w:rPr>
+              <w:t xml:space="preserve">Inicia dispositivo OBD, previamente se debe haber validado que está conectado al CPU del equipo. Esta función demora 2 minutos aproximadamente en levantar todos los servicios del dispositivo. </w:t>
+            </w:r>
+          </w:p>
+          <w:p>
+            <w:pPr>
+              <w:jc w:val="both"/>
+              <w:rPr>
+                <w:rFonts w:cs="Calibri"/>
+                <w:color w:val="000000"/>
+                <w:sz w:val="24"/>
+                <w:szCs w:val="19"/>
+              </w:rPr>
+            </w:pPr>
+            <w:r>
+              <w:rPr>
+                <w:sz w:val="24"/>
+                <w:szCs w:val="24"/>
+              </w:rPr>
+              <w:t>Los datos resultantes se almacenan en la sección “</w:t>
+            </w:r>
+            <w:proofErr w:type="spellStart"/>
+            <w:r>
+              <w:rPr>
+                <w:b/>
+                <w:sz w:val="24"/>
+                <w:szCs w:val="24"/>
+              </w:rPr>
+              <w:t>DeviceData</w:t>
+            </w:r>
+            <w:proofErr w:type="spellEnd"/>
+            <w:r>
+              <w:rPr>
+                <w:rFonts w:ascii="Cascadia Mono" w:hAnsi="Cascadia Mono" w:cs="Cascadia Mono"/>
+                <w:b/>
+                <w:color w:val="000000"/>
+                <w:sz w:val="19"/>
+                <w:szCs w:val="19"/>
+              </w:rPr>
+              <w:t>”</w:t>
+            </w:r>
+            <w:r>
+              <w:rPr>
+                <w:rFonts w:ascii="Cascadia Mono" w:hAnsi="Cascadia Mono" w:cs="Cascadia Mono"/>
+                <w:color w:val="000000"/>
+                <w:sz w:val="19"/>
+                <w:szCs w:val="19"/>
+              </w:rPr>
+              <w:t>.</w:t>
+            </w:r>
+            <w:r>
+              <w:rPr>
+                <w:rFonts w:ascii="Cascadia Mono" w:hAnsi="Cascadia Mono" w:cs="Cascadia Mono"/>
+                <w:color w:val="000000"/>
+                <w:sz w:val="19"/>
+                <w:szCs w:val="19"/>
+              </w:rPr>
+              <w:t xml:space="preserve"> </w:t>
+            </w:r>
+            <w:r>
+              <w:rPr>
+                <w:rFonts w:cs="Calibri"/>
+                <w:color w:val="000000"/>
+                <w:sz w:val="24"/>
+                <w:szCs w:val="19"/>
+              </w:rPr>
+              <w:t xml:space="preserve">El OBD debe estar conectado al puerto de pruebas del equipo. </w:t>
+            </w:r>
+          </w:p>
+          <w:p>
+            <w:pPr>
+              <w:jc w:val="both"/>
+              <w:rPr>
+                <w:sz w:val="24"/>
+                <w:szCs w:val="24"/>
+              </w:rPr>
+            </w:pPr>
+          </w:p>
+          <w:p>
+            <w:pPr>
+              <w:jc w:val="both"/>
+              <w:rPr>
+                <w:b/>
+                <w:sz w:val="24"/>
+                <w:szCs w:val="24"/>
+              </w:rPr>
+            </w:pPr>
+            <w:r>
+              <w:rPr>
+                <w:b/>
+                <w:sz w:val="24"/>
+                <w:szCs w:val="24"/>
+              </w:rPr>
+              <w:t>Valores de respuesta:</w:t>
+            </w:r>
+          </w:p>
+          <w:p>
+            <w:pPr>
+              <w:pStyle w:val="Prrafodelista"/>
+              <w:numPr>
+                <w:ilvl w:val="0"/>
+                <w:numId w:val="36"/>
+              </w:numPr>
+              <w:spacing w:after="0" w:line="240" w:lineRule="auto"/>
+              <w:jc w:val="both"/>
+              <w:rPr>
+                <w:sz w:val="24"/>
+                <w:szCs w:val="24"/>
+                <w:lang w:eastAsia="es-MX"/>
+              </w:rPr>
+            </w:pPr>
+            <w:r>
+              <w:rPr>
+                <w:sz w:val="24"/>
+                <w:szCs w:val="24"/>
+                <w:lang w:eastAsia="es-MX"/>
+              </w:rPr>
+              <w:t xml:space="preserve">Pass: </w:t>
+            </w:r>
+            <w:proofErr w:type="spellStart"/>
+            <w:r>
+              <w:rPr>
+                <w:sz w:val="24"/>
+                <w:szCs w:val="24"/>
+                <w:lang w:eastAsia="es-MX"/>
+              </w:rPr>
+              <w:t>IMClean</w:t>
+            </w:r>
+            <w:proofErr w:type="spellEnd"/>
+            <w:r>
+              <w:rPr>
+                <w:sz w:val="24"/>
+                <w:szCs w:val="24"/>
+                <w:lang w:eastAsia="es-MX"/>
+              </w:rPr>
+              <w:t xml:space="preserve"> OBD en línea.</w:t>
+            </w:r>
+          </w:p>
+          <w:p>
+            <w:pPr>
+              <w:pStyle w:val="Prrafodelista"/>
+              <w:numPr>
+                <w:ilvl w:val="0"/>
+                <w:numId w:val="36"/>
+              </w:numPr>
+              <w:spacing w:after="0" w:line="240" w:lineRule="auto"/>
+              <w:jc w:val="both"/>
+              <w:rPr>
+                <w:sz w:val="24"/>
+                <w:szCs w:val="24"/>
+                <w:lang w:eastAsia="es-MX"/>
+              </w:rPr>
+            </w:pPr>
+            <w:proofErr w:type="spellStart"/>
+            <w:r>
+              <w:rPr>
+                <w:sz w:val="24"/>
+                <w:szCs w:val="24"/>
+                <w:lang w:eastAsia="es-MX"/>
+              </w:rPr>
+              <w:t>Err</w:t>
+            </w:r>
+            <w:proofErr w:type="spellEnd"/>
+            <w:r>
+              <w:rPr>
+                <w:sz w:val="24"/>
+                <w:szCs w:val="24"/>
+                <w:lang w:eastAsia="es-MX"/>
+              </w:rPr>
+              <w:t xml:space="preserve">: </w:t>
+            </w:r>
+            <w:proofErr w:type="spellStart"/>
+            <w:r>
+              <w:rPr>
+                <w:sz w:val="24"/>
+                <w:szCs w:val="24"/>
+                <w:lang w:eastAsia="es-MX"/>
+              </w:rPr>
+              <w:t>IMClean</w:t>
+            </w:r>
+            <w:proofErr w:type="spellEnd"/>
+            <w:r>
+              <w:rPr>
+                <w:sz w:val="24"/>
+                <w:szCs w:val="24"/>
+                <w:lang w:eastAsia="es-MX"/>
+              </w:rPr>
+              <w:t xml:space="preserve"> OBD fuera de línea.</w:t>
+            </w:r>
+          </w:p>
+          <w:p>
+            <w:pPr>
+              <w:jc w:val="both"/>
+              <w:rPr>
+                <w:sz w:val="24"/>
+                <w:szCs w:val="24"/>
+              </w:rPr>
+            </w:pPr>
           </w:p>
         </w:tc>
       </w:tr>
@@ -781,7 +1321,6 @@
                 <w:sz w:val="24"/>
                 <w:szCs w:val="24"/>
               </w:rPr>
-              <w:lastRenderedPageBreak/>
               <w:t>VehiculoLink</w:t>
             </w:r>
             <w:proofErr w:type="spellEnd"/>
@@ -801,11 +1340,195 @@
             </w:pPr>
             <w:r>
               <w:rPr>
-                <w:sz w:val="24"/>
-                <w:szCs w:val="24"/>
-              </w:rPr>
-              <w:t>Tipo: Función.</w:t>
-            </w:r>
+                <w:b/>
+                <w:sz w:val="24"/>
+                <w:szCs w:val="24"/>
+              </w:rPr>
+              <w:t>Tipo</w:t>
+            </w:r>
+            <w:r>
+              <w:rPr>
+                <w:sz w:val="24"/>
+                <w:szCs w:val="24"/>
+              </w:rPr>
+              <w:t>: Función.</w:t>
+            </w:r>
+          </w:p>
+          <w:p>
+            <w:pPr>
+              <w:jc w:val="both"/>
+              <w:rPr>
+                <w:rFonts w:ascii="Cascadia Mono" w:hAnsi="Cascadia Mono" w:cs="Cascadia Mono"/>
+                <w:color w:val="000000"/>
+                <w:sz w:val="19"/>
+                <w:szCs w:val="19"/>
+              </w:rPr>
+            </w:pPr>
+            <w:r>
+              <w:rPr>
+                <w:sz w:val="24"/>
+                <w:szCs w:val="24"/>
+              </w:rPr>
+              <w:t>Realiza la comunicación con el ECU del vehículo e interpreta el estado de los monitores así como los DTC almacenados. Los datos resultantes se almacenan en la sección “</w:t>
+            </w:r>
+            <w:proofErr w:type="spellStart"/>
+            <w:r>
+              <w:rPr>
+                <w:rFonts w:ascii="Cascadia Mono" w:hAnsi="Cascadia Mono" w:cs="Cascadia Mono"/>
+                <w:b/>
+                <w:color w:val="000000"/>
+                <w:sz w:val="19"/>
+                <w:szCs w:val="19"/>
+                <w:highlight w:val="white"/>
+              </w:rPr>
+              <w:t>InspectionData</w:t>
+            </w:r>
+            <w:proofErr w:type="spellEnd"/>
+            <w:r>
+              <w:rPr>
+                <w:rFonts w:ascii="Cascadia Mono" w:hAnsi="Cascadia Mono" w:cs="Cascadia Mono"/>
+                <w:b/>
+                <w:color w:val="000000"/>
+                <w:sz w:val="19"/>
+                <w:szCs w:val="19"/>
+              </w:rPr>
+              <w:t>”</w:t>
+            </w:r>
+            <w:r>
+              <w:rPr>
+                <w:rFonts w:ascii="Cascadia Mono" w:hAnsi="Cascadia Mono" w:cs="Cascadia Mono"/>
+                <w:color w:val="000000"/>
+                <w:sz w:val="19"/>
+                <w:szCs w:val="19"/>
+              </w:rPr>
+              <w:t>.</w:t>
+            </w:r>
+          </w:p>
+          <w:p>
+            <w:pPr>
+              <w:jc w:val="both"/>
+              <w:rPr>
+                <w:rFonts w:cs="Calibri"/>
+                <w:color w:val="000000"/>
+                <w:sz w:val="19"/>
+                <w:szCs w:val="19"/>
+              </w:rPr>
+            </w:pPr>
+            <w:r>
+              <w:rPr>
+                <w:rFonts w:cs="Calibri"/>
+                <w:color w:val="000000"/>
+                <w:sz w:val="24"/>
+                <w:szCs w:val="19"/>
+              </w:rPr>
+              <w:t>El OBD debe estar conectado al OBD del vehículo.</w:t>
+            </w:r>
+          </w:p>
+          <w:p>
+            <w:pPr>
+              <w:jc w:val="both"/>
+              <w:rPr>
+                <w:rFonts w:ascii="Cascadia Mono" w:hAnsi="Cascadia Mono" w:cs="Cascadia Mono"/>
+                <w:color w:val="000000"/>
+                <w:sz w:val="19"/>
+                <w:szCs w:val="19"/>
+              </w:rPr>
+            </w:pPr>
+          </w:p>
+          <w:p>
+            <w:pPr>
+              <w:jc w:val="both"/>
+              <w:rPr>
+                <w:b/>
+                <w:sz w:val="24"/>
+                <w:szCs w:val="24"/>
+              </w:rPr>
+            </w:pPr>
+            <w:r>
+              <w:rPr>
+                <w:b/>
+                <w:sz w:val="24"/>
+                <w:szCs w:val="24"/>
+              </w:rPr>
+              <w:t>Valores de respuesta:</w:t>
+            </w:r>
+          </w:p>
+          <w:p>
+            <w:pPr>
+              <w:pStyle w:val="Prrafodelista"/>
+              <w:numPr>
+                <w:ilvl w:val="0"/>
+                <w:numId w:val="37"/>
+              </w:numPr>
+              <w:spacing w:after="0" w:line="240" w:lineRule="auto"/>
+              <w:jc w:val="both"/>
+              <w:rPr>
+                <w:sz w:val="24"/>
+                <w:szCs w:val="24"/>
+                <w:lang w:eastAsia="es-MX"/>
+              </w:rPr>
+            </w:pPr>
+            <w:r>
+              <w:rPr>
+                <w:sz w:val="24"/>
+                <w:szCs w:val="24"/>
+                <w:lang w:eastAsia="es-MX"/>
+              </w:rPr>
+              <w:t>Pass: Inspección vehicular OBD exitosa.</w:t>
+            </w:r>
+          </w:p>
+          <w:p>
+            <w:pPr>
+              <w:pStyle w:val="Prrafodelista"/>
+              <w:numPr>
+                <w:ilvl w:val="0"/>
+                <w:numId w:val="37"/>
+              </w:numPr>
+              <w:spacing w:after="0" w:line="240" w:lineRule="auto"/>
+              <w:jc w:val="both"/>
+              <w:rPr>
+                <w:i/>
+                <w:sz w:val="24"/>
+                <w:szCs w:val="24"/>
+                <w:lang w:eastAsia="es-MX"/>
+              </w:rPr>
+            </w:pPr>
+            <w:proofErr w:type="spellStart"/>
+            <w:r>
+              <w:rPr>
+                <w:sz w:val="24"/>
+                <w:szCs w:val="24"/>
+                <w:lang w:eastAsia="es-MX"/>
+              </w:rPr>
+              <w:t>Err</w:t>
+            </w:r>
+            <w:proofErr w:type="spellEnd"/>
+            <w:r>
+              <w:rPr>
+                <w:sz w:val="24"/>
+                <w:szCs w:val="24"/>
+                <w:lang w:eastAsia="es-MX"/>
+              </w:rPr>
+              <w:t xml:space="preserve">: Inspección vehicular OBD fallo | </w:t>
+            </w:r>
+            <w:r>
+              <w:rPr>
+                <w:i/>
+                <w:sz w:val="24"/>
+                <w:szCs w:val="24"/>
+                <w:lang w:eastAsia="es-MX"/>
+              </w:rPr>
+              <w:t>(descripción de error).</w:t>
+            </w:r>
+          </w:p>
+          <w:p>
+            <w:pPr>
+              <w:jc w:val="both"/>
+              <w:rPr>
+                <w:sz w:val="24"/>
+                <w:szCs w:val="24"/>
+              </w:rPr>
+            </w:pPr>
           </w:p>
         </w:tc>
       </w:tr>
@@ -847,10 +1570,18 @@
             </w:pPr>
             <w:r>
               <w:rPr>
-                <w:sz w:val="24"/>
-                <w:szCs w:val="24"/>
-              </w:rPr>
-              <w:t>Tipo: Función.</w:t>
+                <w:b/>
+                <w:sz w:val="24"/>
+                <w:szCs w:val="24"/>
+              </w:rPr>
+              <w:t>Tipo:</w:t>
+            </w:r>
+            <w:r>
+              <w:rPr>
+                <w:sz w:val="24"/>
+                <w:szCs w:val="24"/>
+              </w:rPr>
+              <w:t xml:space="preserve"> Función.</w:t>
             </w:r>
           </w:p>
           <w:p>
@@ -1077,7 +1808,244 @@
                 <w:sz w:val="24"/>
                 <w:szCs w:val="24"/>
               </w:rPr>
-              <w:t>un año a partir de la fecha de emisión, esto con la finalidad de controlar y asegurar siempre cuente con la versión del driver vigente más actualizada.</w:t>
+              <w:t xml:space="preserve">un año a partir de la fecha de </w:t>
+            </w:r>
+            <w:r>
+              <w:rPr>
+                <w:sz w:val="24"/>
+                <w:szCs w:val="24"/>
+              </w:rPr>
+              <w:lastRenderedPageBreak/>
+              <w:t>emisión, esto con la finalidad de controlar y asegurar siempre cuente con la versión del driver vigente más actualizada.</w:t>
+            </w:r>
+          </w:p>
+          <w:p>
+            <w:pPr>
+              <w:jc w:val="both"/>
+              <w:rPr>
+                <w:sz w:val="24"/>
+                <w:szCs w:val="24"/>
+              </w:rPr>
+            </w:pPr>
+          </w:p>
+          <w:p>
+            <w:pPr>
+              <w:jc w:val="both"/>
+              <w:rPr>
+                <w:b/>
+                <w:sz w:val="24"/>
+                <w:szCs w:val="24"/>
+              </w:rPr>
+            </w:pPr>
+            <w:r>
+              <w:rPr>
+                <w:b/>
+                <w:sz w:val="24"/>
+                <w:szCs w:val="24"/>
+              </w:rPr>
+              <w:t>Valores de respuesta:</w:t>
+            </w:r>
+          </w:p>
+          <w:p>
+            <w:pPr>
+              <w:pStyle w:val="Prrafodelista"/>
+              <w:numPr>
+                <w:ilvl w:val="0"/>
+                <w:numId w:val="35"/>
+              </w:numPr>
+              <w:spacing w:after="0" w:line="240" w:lineRule="auto"/>
+              <w:jc w:val="both"/>
+              <w:rPr>
+                <w:sz w:val="24"/>
+                <w:szCs w:val="24"/>
+                <w:lang w:eastAsia="es-MX"/>
+              </w:rPr>
+            </w:pPr>
+            <w:proofErr w:type="spellStart"/>
+            <w:r>
+              <w:rPr>
+                <w:sz w:val="24"/>
+                <w:szCs w:val="24"/>
+                <w:lang w:eastAsia="es-MX"/>
+              </w:rPr>
+              <w:t>Pass</w:t>
+            </w:r>
+            <w:proofErr w:type="gramStart"/>
+            <w:r>
+              <w:rPr>
+                <w:sz w:val="24"/>
+                <w:szCs w:val="24"/>
+                <w:lang w:eastAsia="es-MX"/>
+              </w:rPr>
+              <w:t>:Opus</w:t>
+            </w:r>
+            <w:proofErr w:type="spellEnd"/>
+            <w:proofErr w:type="gramEnd"/>
+            <w:r>
+              <w:rPr>
+                <w:sz w:val="24"/>
+                <w:szCs w:val="24"/>
+                <w:lang w:eastAsia="es-MX"/>
+              </w:rPr>
+              <w:t xml:space="preserve"> </w:t>
+            </w:r>
+            <w:proofErr w:type="spellStart"/>
+            <w:r>
+              <w:rPr>
+                <w:sz w:val="24"/>
+                <w:szCs w:val="24"/>
+                <w:lang w:eastAsia="es-MX"/>
+              </w:rPr>
+              <w:t>IMClean</w:t>
+            </w:r>
+            <w:proofErr w:type="spellEnd"/>
+            <w:r>
+              <w:rPr>
+                <w:sz w:val="24"/>
+                <w:szCs w:val="24"/>
+                <w:lang w:eastAsia="es-MX"/>
+              </w:rPr>
+              <w:t xml:space="preserve"> OBD r</w:t>
+            </w:r>
+            <w:r>
+              <w:rPr>
+                <w:sz w:val="24"/>
+                <w:szCs w:val="24"/>
+                <w:lang w:eastAsia="es-MX"/>
+              </w:rPr>
+              <w:t>egistrado exitosamente.</w:t>
+            </w:r>
+          </w:p>
+          <w:p>
+            <w:pPr>
+              <w:pStyle w:val="Prrafodelista"/>
+              <w:numPr>
+                <w:ilvl w:val="0"/>
+                <w:numId w:val="35"/>
+              </w:numPr>
+              <w:spacing w:after="0" w:line="240" w:lineRule="auto"/>
+              <w:jc w:val="both"/>
+              <w:rPr>
+                <w:sz w:val="24"/>
+                <w:szCs w:val="24"/>
+                <w:lang w:eastAsia="es-MX"/>
+              </w:rPr>
+            </w:pPr>
+            <w:proofErr w:type="spellStart"/>
+            <w:r>
+              <w:rPr>
+                <w:sz w:val="24"/>
+                <w:szCs w:val="24"/>
+                <w:lang w:eastAsia="es-MX"/>
+              </w:rPr>
+              <w:t>Err</w:t>
+            </w:r>
+            <w:proofErr w:type="gramStart"/>
+            <w:r>
+              <w:rPr>
+                <w:sz w:val="24"/>
+                <w:szCs w:val="24"/>
+                <w:lang w:eastAsia="es-MX"/>
+              </w:rPr>
+              <w:t>:Opus</w:t>
+            </w:r>
+            <w:proofErr w:type="spellEnd"/>
+            <w:proofErr w:type="gramEnd"/>
+            <w:r>
+              <w:rPr>
+                <w:sz w:val="24"/>
+                <w:szCs w:val="24"/>
+                <w:lang w:eastAsia="es-MX"/>
+              </w:rPr>
+              <w:t xml:space="preserve"> </w:t>
+            </w:r>
+            <w:proofErr w:type="spellStart"/>
+            <w:r>
+              <w:rPr>
+                <w:sz w:val="24"/>
+                <w:szCs w:val="24"/>
+                <w:lang w:eastAsia="es-MX"/>
+              </w:rPr>
+              <w:t>IMClean</w:t>
+            </w:r>
+            <w:proofErr w:type="spellEnd"/>
+            <w:r>
+              <w:rPr>
+                <w:sz w:val="24"/>
+                <w:szCs w:val="24"/>
+                <w:lang w:eastAsia="es-MX"/>
+              </w:rPr>
+              <w:t xml:space="preserve"> OBD licencia no valida o expirada.</w:t>
+            </w:r>
+          </w:p>
+          <w:p>
+            <w:pPr>
+              <w:pStyle w:val="Prrafodelista"/>
+              <w:numPr>
+                <w:ilvl w:val="0"/>
+                <w:numId w:val="35"/>
+              </w:numPr>
+              <w:spacing w:after="0" w:line="240" w:lineRule="auto"/>
+              <w:jc w:val="both"/>
+              <w:rPr>
+                <w:sz w:val="24"/>
+                <w:szCs w:val="24"/>
+                <w:lang w:eastAsia="es-MX"/>
+              </w:rPr>
+            </w:pPr>
+            <w:proofErr w:type="spellStart"/>
+            <w:r>
+              <w:rPr>
+                <w:sz w:val="24"/>
+                <w:szCs w:val="24"/>
+                <w:lang w:eastAsia="es-MX"/>
+              </w:rPr>
+              <w:t>Err</w:t>
+            </w:r>
+            <w:proofErr w:type="gramStart"/>
+            <w:r>
+              <w:rPr>
+                <w:sz w:val="24"/>
+                <w:szCs w:val="24"/>
+                <w:lang w:eastAsia="es-MX"/>
+              </w:rPr>
+              <w:t>:set</w:t>
+            </w:r>
+            <w:proofErr w:type="gramEnd"/>
+            <w:r>
+              <w:rPr>
+                <w:sz w:val="24"/>
+                <w:szCs w:val="24"/>
+                <w:lang w:eastAsia="es-MX"/>
+              </w:rPr>
+              <w:t>_OpusKeyDevice</w:t>
+            </w:r>
+            <w:proofErr w:type="spellEnd"/>
+            <w:r>
+              <w:rPr>
+                <w:sz w:val="24"/>
+                <w:szCs w:val="24"/>
+                <w:lang w:eastAsia="es-MX"/>
+              </w:rPr>
+              <w:t xml:space="preserve"> | </w:t>
+            </w:r>
+            <w:r>
+              <w:rPr>
+                <w:i/>
+                <w:sz w:val="24"/>
+                <w:szCs w:val="24"/>
+                <w:lang w:eastAsia="es-MX"/>
+              </w:rPr>
+              <w:t>(descripción de error)</w:t>
+            </w:r>
+            <w:r>
+              <w:rPr>
+                <w:i/>
+                <w:sz w:val="24"/>
+                <w:szCs w:val="24"/>
+                <w:lang w:eastAsia="es-MX"/>
+              </w:rPr>
+              <w:t>.</w:t>
             </w:r>
           </w:p>
           <w:p>
@@ -1110,6 +2078,7 @@
                 <w:sz w:val="24"/>
                 <w:szCs w:val="24"/>
               </w:rPr>
+              <w:lastRenderedPageBreak/>
               <w:t>DriverVersion</w:t>
             </w:r>
             <w:proofErr w:type="spellEnd"/>
@@ -1261,6 +2230,13 @@
                 <w:szCs w:val="24"/>
               </w:rPr>
             </w:pPr>
+            <w:r>
+              <w:rPr>
+                <w:sz w:val="24"/>
+                <w:szCs w:val="24"/>
+              </w:rPr>
+              <w:t>Identificación del dispositivo, número de serie.</w:t>
+            </w:r>
           </w:p>
         </w:tc>
       </w:tr>
@@ -1300,6 +2276,27 @@
                 <w:szCs w:val="24"/>
               </w:rPr>
             </w:pPr>
+            <w:r>
+              <w:rPr>
+                <w:sz w:val="24"/>
+                <w:szCs w:val="24"/>
+              </w:rPr>
+              <w:t>Identificación del har</w:t>
+            </w:r>
+            <w:r>
+              <w:rPr>
+                <w:sz w:val="24"/>
+                <w:szCs w:val="24"/>
+              </w:rPr>
+              <w:t>d</w:t>
+            </w:r>
+            <w:r>
+              <w:rPr>
+                <w:sz w:val="24"/>
+                <w:szCs w:val="24"/>
+              </w:rPr>
+              <w:t>ware del dispositivo.</w:t>
+            </w:r>
           </w:p>
         </w:tc>
       </w:tr>
@@ -1339,6 +2336,13 @@
                 <w:szCs w:val="24"/>
               </w:rPr>
             </w:pPr>
+            <w:r>
+              <w:rPr>
+                <w:sz w:val="24"/>
+                <w:szCs w:val="24"/>
+              </w:rPr>
+              <w:t>Fabricante del dispositivo.</w:t>
+            </w:r>
           </w:p>
         </w:tc>
       </w:tr>
@@ -1378,6 +2382,13 @@
                 <w:szCs w:val="24"/>
               </w:rPr>
             </w:pPr>
+            <w:r>
+              <w:rPr>
+                <w:sz w:val="24"/>
+                <w:szCs w:val="24"/>
+              </w:rPr>
+              <w:t>Descripción del dispositivo.</w:t>
+            </w:r>
           </w:p>
         </w:tc>
       </w:tr>
@@ -1417,6 +2428,13 @@
                 <w:szCs w:val="24"/>
               </w:rPr>
             </w:pPr>
+            <w:r>
+              <w:rPr>
+                <w:sz w:val="24"/>
+                <w:szCs w:val="24"/>
+              </w:rPr>
+              <w:t>Versión de firmware del dispositivo.</w:t>
+            </w:r>
           </w:p>
         </w:tc>
       </w:tr>
@@ -1456,6 +2474,13 @@
                 <w:szCs w:val="24"/>
               </w:rPr>
             </w:pPr>
+            <w:r>
+              <w:rPr>
+                <w:sz w:val="24"/>
+                <w:szCs w:val="24"/>
+              </w:rPr>
+              <w:t>Tipo de dispositivo.</w:t>
+            </w:r>
           </w:p>
         </w:tc>
       </w:tr>
@@ -1495,6 +2520,13 @@
                 <w:szCs w:val="24"/>
               </w:rPr>
             </w:pPr>
+            <w:r>
+              <w:rPr>
+                <w:sz w:val="24"/>
+                <w:szCs w:val="24"/>
+              </w:rPr>
+              <w:t>Voltaje de operación.</w:t>
+            </w:r>
           </w:p>
         </w:tc>
       </w:tr>
@@ -1534,6 +2566,13 @@
                 <w:szCs w:val="24"/>
               </w:rPr>
             </w:pPr>
+            <w:r>
+              <w:rPr>
+                <w:sz w:val="24"/>
+                <w:szCs w:val="24"/>
+              </w:rPr>
+              <w:t xml:space="preserve">Voltaje DLC. </w:t>
+            </w:r>
           </w:p>
         </w:tc>
       </w:tr>
@@ -1600,8 +2639,6 @@
               </w:rPr>
               <w:t>Fecha_Test</w:t>
             </w:r>
-            <w:bookmarkStart w:id="0" w:name="_GoBack"/>
-            <w:bookmarkEnd w:id="0"/>
           </w:p>
         </w:tc>
         <w:tc>
@@ -1616,6 +2653,13 @@
                 <w:szCs w:val="24"/>
               </w:rPr>
             </w:pPr>
+            <w:r>
+              <w:rPr>
+                <w:sz w:val="24"/>
+                <w:szCs w:val="24"/>
+              </w:rPr>
+              <w:t>“ddmmyyyy”</w:t>
+            </w:r>
           </w:p>
         </w:tc>
       </w:tr>
@@ -1667,8 +2711,125 @@
                 <w:sz w:val="24"/>
                 <w:szCs w:val="24"/>
               </w:rPr>
-              <w:t>lectura fiel del ECU.</w:t>
-            </w:r>
+              <w:t xml:space="preserve">lectura </w:t>
+            </w:r>
+            <w:r>
+              <w:rPr>
+                <w:sz w:val="24"/>
+                <w:szCs w:val="24"/>
+              </w:rPr>
+              <w:t>original</w:t>
+            </w:r>
+            <w:r>
+              <w:rPr>
+                <w:sz w:val="24"/>
+                <w:szCs w:val="24"/>
+              </w:rPr>
+              <w:t xml:space="preserve"> del ECU.</w:t>
+            </w:r>
+            <w:r>
+              <w:rPr>
+                <w:sz w:val="24"/>
+                <w:szCs w:val="24"/>
+              </w:rPr>
+              <w:t xml:space="preserve"> Y </w:t>
+            </w:r>
+            <w:proofErr w:type="spellStart"/>
+            <w:r>
+              <w:rPr>
+                <w:sz w:val="24"/>
+                <w:szCs w:val="24"/>
+              </w:rPr>
+              <w:t>Chksum</w:t>
+            </w:r>
+            <w:proofErr w:type="spellEnd"/>
+            <w:r>
+              <w:rPr>
+                <w:sz w:val="24"/>
+                <w:szCs w:val="24"/>
+              </w:rPr>
+              <w:t xml:space="preserve"> del registro para aseguramiento de veracidad</w:t>
+            </w:r>
+            <w:r>
+              <w:rPr>
+                <w:sz w:val="24"/>
+                <w:szCs w:val="24"/>
+              </w:rPr>
+              <w:t xml:space="preserve"> del registro, el </w:t>
+            </w:r>
+            <w:proofErr w:type="spellStart"/>
+            <w:r>
+              <w:rPr>
+                <w:sz w:val="24"/>
+                <w:szCs w:val="24"/>
+              </w:rPr>
+              <w:t>chksum</w:t>
+            </w:r>
+            <w:proofErr w:type="spellEnd"/>
+            <w:r>
+              <w:rPr>
+                <w:sz w:val="24"/>
+                <w:szCs w:val="24"/>
+              </w:rPr>
+              <w:t xml:space="preserve"> inicia con el carácter “#” y se compone de 6 caracteres</w:t>
+            </w:r>
+            <w:r>
+              <w:rPr>
+                <w:sz w:val="24"/>
+                <w:szCs w:val="24"/>
+              </w:rPr>
+              <w:t>.</w:t>
+            </w:r>
+          </w:p>
+          <w:p>
+            <w:pPr>
+              <w:jc w:val="both"/>
+              <w:rPr>
+                <w:sz w:val="24"/>
+                <w:szCs w:val="24"/>
+              </w:rPr>
+            </w:pPr>
+          </w:p>
+          <w:p>
+            <w:pPr>
+              <w:jc w:val="both"/>
+              <w:rPr>
+                <w:sz w:val="24"/>
+                <w:szCs w:val="24"/>
+              </w:rPr>
+            </w:pPr>
+            <w:r>
+              <w:rPr>
+                <w:sz w:val="24"/>
+                <w:szCs w:val="24"/>
+              </w:rPr>
+              <w:t xml:space="preserve">Ejemplo: </w:t>
+            </w:r>
+          </w:p>
+          <w:p>
+            <w:pPr>
+              <w:jc w:val="both"/>
+              <w:rPr>
+                <w:b/>
+                <w:szCs w:val="24"/>
+              </w:rPr>
+            </w:pPr>
+            <w:r>
+              <w:rPr>
+                <w:b/>
+                <w:szCs w:val="24"/>
+              </w:rPr>
+              <w:t>00 00 07 E8 49 02 01 4D 45 58 36 48 32 36 30 58 4E 54 30 33 33 32 30 34 #FCZCSF</w:t>
+            </w:r>
+          </w:p>
+          <w:p>
+            <w:pPr>
+              <w:jc w:val="both"/>
+              <w:rPr>
+                <w:sz w:val="24"/>
+                <w:szCs w:val="24"/>
+              </w:rPr>
+            </w:pPr>
           </w:p>
         </w:tc>
       </w:tr>
@@ -1759,7 +2920,396 @@
                 <w:sz w:val="24"/>
                 <w:szCs w:val="24"/>
               </w:rPr>
-              <w:t xml:space="preserve">Lectura de monitores y luz MIL, formato hexadecimal, lectura fiel del ECU. </w:t>
+              <w:t xml:space="preserve">Lectura de monitores y luz MIL, formato hexadecimal, </w:t>
+            </w:r>
+            <w:r>
+              <w:rPr>
+                <w:sz w:val="24"/>
+                <w:szCs w:val="24"/>
+              </w:rPr>
+              <w:t xml:space="preserve">PID 01 01, </w:t>
+            </w:r>
+            <w:r>
+              <w:rPr>
+                <w:sz w:val="24"/>
+                <w:szCs w:val="24"/>
+              </w:rPr>
+              <w:t xml:space="preserve">lectura </w:t>
+            </w:r>
+            <w:r>
+              <w:rPr>
+                <w:sz w:val="24"/>
+                <w:szCs w:val="24"/>
+              </w:rPr>
+              <w:t>original</w:t>
+            </w:r>
+            <w:r>
+              <w:rPr>
+                <w:sz w:val="24"/>
+                <w:szCs w:val="24"/>
+              </w:rPr>
+              <w:t xml:space="preserve"> del ECU. </w:t>
+            </w:r>
+            <w:r>
+              <w:rPr>
+                <w:sz w:val="24"/>
+                <w:szCs w:val="24"/>
+              </w:rPr>
+              <w:t xml:space="preserve">Y </w:t>
+            </w:r>
+            <w:proofErr w:type="spellStart"/>
+            <w:r>
+              <w:rPr>
+                <w:sz w:val="24"/>
+                <w:szCs w:val="24"/>
+              </w:rPr>
+              <w:t>Chksum</w:t>
+            </w:r>
+            <w:proofErr w:type="spellEnd"/>
+            <w:r>
+              <w:rPr>
+                <w:sz w:val="24"/>
+                <w:szCs w:val="24"/>
+              </w:rPr>
+              <w:t xml:space="preserve"> del registro para aseguramiento de veracidad del registro, el </w:t>
+            </w:r>
+            <w:proofErr w:type="spellStart"/>
+            <w:r>
+              <w:rPr>
+                <w:sz w:val="24"/>
+                <w:szCs w:val="24"/>
+              </w:rPr>
+              <w:t>chksum</w:t>
+            </w:r>
+            <w:proofErr w:type="spellEnd"/>
+            <w:r>
+              <w:rPr>
+                <w:sz w:val="24"/>
+                <w:szCs w:val="24"/>
+              </w:rPr>
+              <w:t xml:space="preserve"> inicia con el carácter “#” y se compone de 6 caracteres.</w:t>
+            </w:r>
+          </w:p>
+          <w:p>
+            <w:pPr>
+              <w:jc w:val="both"/>
+              <w:rPr>
+                <w:sz w:val="24"/>
+                <w:szCs w:val="24"/>
+              </w:rPr>
+            </w:pPr>
+          </w:p>
+          <w:p>
+            <w:pPr>
+              <w:jc w:val="both"/>
+              <w:rPr>
+                <w:sz w:val="24"/>
+                <w:szCs w:val="24"/>
+              </w:rPr>
+            </w:pPr>
+            <w:r>
+              <w:rPr>
+                <w:sz w:val="24"/>
+                <w:szCs w:val="24"/>
+              </w:rPr>
+              <w:t>Ejemplo:</w:t>
+            </w:r>
+          </w:p>
+          <w:p>
+            <w:pPr>
+              <w:jc w:val="both"/>
+              <w:rPr>
+                <w:b/>
+                <w:szCs w:val="24"/>
+                <w:lang w:val="en-US"/>
+              </w:rPr>
+            </w:pPr>
+            <w:r>
+              <w:rPr>
+                <w:b/>
+                <w:szCs w:val="24"/>
+                <w:lang w:val="en-US"/>
+              </w:rPr>
+              <w:t xml:space="preserve">00 00 07 E8 41 01 FF </w:t>
+            </w:r>
+            <w:proofErr w:type="spellStart"/>
+            <w:r>
+              <w:rPr>
+                <w:b/>
+                <w:szCs w:val="24"/>
+                <w:lang w:val="en-US"/>
+              </w:rPr>
+              <w:t>FF</w:t>
+            </w:r>
+            <w:proofErr w:type="spellEnd"/>
+            <w:r>
+              <w:rPr>
+                <w:b/>
+                <w:szCs w:val="24"/>
+                <w:lang w:val="en-US"/>
+              </w:rPr>
+              <w:t xml:space="preserve"> </w:t>
+            </w:r>
+            <w:proofErr w:type="spellStart"/>
+            <w:r>
+              <w:rPr>
+                <w:b/>
+                <w:szCs w:val="24"/>
+                <w:lang w:val="en-US"/>
+              </w:rPr>
+              <w:t>FF</w:t>
+            </w:r>
+            <w:proofErr w:type="spellEnd"/>
+            <w:r>
+              <w:rPr>
+                <w:b/>
+                <w:szCs w:val="24"/>
+                <w:lang w:val="en-US"/>
+              </w:rPr>
+              <w:t xml:space="preserve"> </w:t>
+            </w:r>
+            <w:proofErr w:type="spellStart"/>
+            <w:r>
+              <w:rPr>
+                <w:b/>
+                <w:szCs w:val="24"/>
+                <w:lang w:val="en-US"/>
+              </w:rPr>
+              <w:t>FF</w:t>
+            </w:r>
+            <w:proofErr w:type="spellEnd"/>
+            <w:r>
+              <w:rPr>
+                <w:b/>
+                <w:szCs w:val="24"/>
+                <w:lang w:val="en-US"/>
+              </w:rPr>
+              <w:t xml:space="preserve"> </w:t>
+            </w:r>
+            <w:proofErr w:type="spellStart"/>
+            <w:r>
+              <w:rPr>
+                <w:b/>
+                <w:szCs w:val="24"/>
+                <w:lang w:val="en-US"/>
+              </w:rPr>
+              <w:t>FF</w:t>
+            </w:r>
+            <w:proofErr w:type="spellEnd"/>
+            <w:r>
+              <w:rPr>
+                <w:b/>
+                <w:szCs w:val="24"/>
+                <w:lang w:val="en-US"/>
+              </w:rPr>
+              <w:t xml:space="preserve"> #ZYTSKC</w:t>
+            </w:r>
+          </w:p>
+          <w:p>
+            <w:pPr>
+              <w:jc w:val="both"/>
+              <w:rPr>
+                <w:sz w:val="24"/>
+                <w:szCs w:val="24"/>
+                <w:lang w:val="en-US"/>
+              </w:rPr>
+            </w:pPr>
+          </w:p>
+          <w:p>
+            <w:pPr>
+              <w:jc w:val="both"/>
+              <w:rPr>
+                <w:sz w:val="24"/>
+                <w:szCs w:val="24"/>
+              </w:rPr>
+            </w:pPr>
+            <w:r>
+              <w:rPr>
+                <w:sz w:val="24"/>
+                <w:szCs w:val="24"/>
+              </w:rPr>
+              <w:t xml:space="preserve">La interpretación de lecturas del ECU se realiza en base a lo establecido por </w:t>
+            </w:r>
+            <w:r>
+              <w:rPr>
+                <w:sz w:val="24"/>
+                <w:szCs w:val="24"/>
+              </w:rPr>
+              <w:t>el estándar OBD-II SAE J1979</w:t>
+            </w:r>
+            <w:r>
+              <w:rPr>
+                <w:sz w:val="24"/>
+                <w:szCs w:val="24"/>
+              </w:rPr>
+              <w:t xml:space="preserve"> y se describe más detalladamente más adelante. La interpretación de los resultados se almacenan en los campos:</w:t>
+            </w:r>
+          </w:p>
+          <w:p>
+            <w:pPr>
+              <w:jc w:val="both"/>
+              <w:rPr>
+                <w:sz w:val="24"/>
+                <w:szCs w:val="24"/>
+              </w:rPr>
+            </w:pPr>
+            <w:proofErr w:type="spellStart"/>
+            <w:r>
+              <w:rPr>
+                <w:sz w:val="24"/>
+                <w:szCs w:val="24"/>
+              </w:rPr>
+              <w:t>OBDdata_MIL</w:t>
+            </w:r>
+            <w:proofErr w:type="spellEnd"/>
+            <w:r>
+              <w:rPr>
+                <w:sz w:val="24"/>
+                <w:szCs w:val="24"/>
+              </w:rPr>
+              <w:t xml:space="preserve">, OBD_MSI, </w:t>
+            </w:r>
+            <w:r>
+              <w:rPr>
+                <w:sz w:val="24"/>
+                <w:szCs w:val="24"/>
+              </w:rPr>
+              <w:t>OBD_</w:t>
+            </w:r>
+            <w:r>
+              <w:rPr>
+                <w:sz w:val="24"/>
+                <w:szCs w:val="24"/>
+              </w:rPr>
+              <w:t xml:space="preserve">CCM, </w:t>
+            </w:r>
+            <w:r>
+              <w:rPr>
+                <w:sz w:val="24"/>
+                <w:szCs w:val="24"/>
+              </w:rPr>
+              <w:t>OBD_</w:t>
+            </w:r>
+            <w:r>
+              <w:rPr>
+                <w:sz w:val="24"/>
+                <w:szCs w:val="24"/>
+              </w:rPr>
+              <w:t xml:space="preserve">CMB, </w:t>
+            </w:r>
+            <w:r>
+              <w:rPr>
+                <w:sz w:val="24"/>
+                <w:szCs w:val="24"/>
+              </w:rPr>
+              <w:t>OBD_</w:t>
+            </w:r>
+            <w:r>
+              <w:rPr>
+                <w:sz w:val="24"/>
+                <w:szCs w:val="24"/>
+              </w:rPr>
+              <w:t xml:space="preserve">O2S, </w:t>
+            </w:r>
+            <w:r>
+              <w:rPr>
+                <w:sz w:val="24"/>
+                <w:szCs w:val="24"/>
+              </w:rPr>
+              <w:t>OBD_</w:t>
+            </w:r>
+            <w:r>
+              <w:rPr>
+                <w:sz w:val="24"/>
+                <w:szCs w:val="24"/>
+              </w:rPr>
+              <w:t xml:space="preserve">CAT, </w:t>
+            </w:r>
+            <w:r>
+              <w:rPr>
+                <w:sz w:val="24"/>
+                <w:szCs w:val="24"/>
+              </w:rPr>
+              <w:t>OBD_</w:t>
+            </w:r>
+            <w:r>
+              <w:rPr>
+                <w:sz w:val="24"/>
+                <w:szCs w:val="24"/>
+              </w:rPr>
+              <w:t xml:space="preserve">CCC, </w:t>
+            </w:r>
+            <w:r>
+              <w:rPr>
+                <w:sz w:val="24"/>
+                <w:szCs w:val="24"/>
+              </w:rPr>
+              <w:t>OBD_</w:t>
+            </w:r>
+            <w:r>
+              <w:rPr>
+                <w:sz w:val="24"/>
+                <w:szCs w:val="24"/>
+              </w:rPr>
+              <w:t xml:space="preserve">EVS, </w:t>
+            </w:r>
+            <w:r>
+              <w:rPr>
+                <w:sz w:val="24"/>
+                <w:szCs w:val="24"/>
+              </w:rPr>
+              <w:t>OBD_</w:t>
+            </w:r>
+            <w:r>
+              <w:rPr>
+                <w:sz w:val="24"/>
+                <w:szCs w:val="24"/>
+              </w:rPr>
+              <w:t xml:space="preserve">SAS, </w:t>
+            </w:r>
+            <w:r>
+              <w:rPr>
+                <w:sz w:val="24"/>
+                <w:szCs w:val="24"/>
+              </w:rPr>
+              <w:t>OBD_</w:t>
+            </w:r>
+            <w:r>
+              <w:rPr>
+                <w:sz w:val="24"/>
+                <w:szCs w:val="24"/>
+              </w:rPr>
+              <w:t xml:space="preserve">FAA, </w:t>
+            </w:r>
+            <w:r>
+              <w:rPr>
+                <w:sz w:val="24"/>
+                <w:szCs w:val="24"/>
+              </w:rPr>
+              <w:t>OBD_</w:t>
+            </w:r>
+            <w:r>
+              <w:rPr>
+                <w:sz w:val="24"/>
+                <w:szCs w:val="24"/>
+              </w:rPr>
+              <w:t xml:space="preserve">O2C. </w:t>
+            </w:r>
+          </w:p>
+          <w:p>
+            <w:pPr>
+              <w:jc w:val="both"/>
+              <w:rPr>
+                <w:sz w:val="24"/>
+                <w:szCs w:val="24"/>
+              </w:rPr>
+            </w:pPr>
+            <w:r>
+              <w:rPr>
+                <w:sz w:val="24"/>
+                <w:szCs w:val="24"/>
+              </w:rPr>
+              <w:t xml:space="preserve"> </w:t>
             </w:r>
           </w:p>
         </w:tc>
@@ -1884,7 +3434,109 @@
                 <w:sz w:val="24"/>
                 <w:szCs w:val="24"/>
               </w:rPr>
-              <w:t>Lectura de códigos de fallas detectados, lectura fiel del ECU.</w:t>
+              <w:t>Lectura de códigos de fallas detectados, lectura del ECU.</w:t>
+            </w:r>
+            <w:r>
+              <w:rPr>
+                <w:sz w:val="24"/>
+                <w:szCs w:val="24"/>
+              </w:rPr>
+              <w:t xml:space="preserve"> F</w:t>
+            </w:r>
+            <w:r>
+              <w:rPr>
+                <w:sz w:val="24"/>
+                <w:szCs w:val="24"/>
+              </w:rPr>
+              <w:t xml:space="preserve">ormato hexadecimal, PID 01 01, lectura original del ECU. </w:t>
+            </w:r>
+            <w:r>
+              <w:rPr>
+                <w:sz w:val="24"/>
+                <w:szCs w:val="24"/>
+              </w:rPr>
+              <w:t xml:space="preserve">Y </w:t>
+            </w:r>
+            <w:proofErr w:type="spellStart"/>
+            <w:r>
+              <w:rPr>
+                <w:sz w:val="24"/>
+                <w:szCs w:val="24"/>
+              </w:rPr>
+              <w:t>c</w:t>
+            </w:r>
+            <w:r>
+              <w:rPr>
+                <w:sz w:val="24"/>
+                <w:szCs w:val="24"/>
+              </w:rPr>
+              <w:t>hksum</w:t>
+            </w:r>
+            <w:proofErr w:type="spellEnd"/>
+            <w:r>
+              <w:rPr>
+                <w:sz w:val="24"/>
+                <w:szCs w:val="24"/>
+              </w:rPr>
+              <w:t xml:space="preserve"> del registro para aseguramiento de veracidad del registro, el </w:t>
+            </w:r>
+            <w:proofErr w:type="spellStart"/>
+            <w:r>
+              <w:rPr>
+                <w:sz w:val="24"/>
+                <w:szCs w:val="24"/>
+              </w:rPr>
+              <w:t>chksum</w:t>
+            </w:r>
+            <w:proofErr w:type="spellEnd"/>
+            <w:r>
+              <w:rPr>
+                <w:sz w:val="24"/>
+                <w:szCs w:val="24"/>
+              </w:rPr>
+              <w:t xml:space="preserve"> inicia con el carácter “#” y se compone de 6 caracteres.</w:t>
+            </w:r>
+          </w:p>
+          <w:p>
+            <w:pPr>
+              <w:jc w:val="both"/>
+              <w:rPr>
+                <w:sz w:val="24"/>
+                <w:szCs w:val="24"/>
+              </w:rPr>
+            </w:pPr>
+          </w:p>
+          <w:p>
+            <w:pPr>
+              <w:jc w:val="both"/>
+              <w:rPr>
+                <w:sz w:val="24"/>
+                <w:szCs w:val="24"/>
+              </w:rPr>
+            </w:pPr>
+            <w:r>
+              <w:rPr>
+                <w:sz w:val="24"/>
+                <w:szCs w:val="24"/>
+              </w:rPr>
+              <w:t xml:space="preserve">Ejemplo: </w:t>
+            </w:r>
+          </w:p>
+          <w:p>
+            <w:pPr>
+              <w:jc w:val="both"/>
+              <w:rPr>
+                <w:b/>
+                <w:sz w:val="24"/>
+                <w:szCs w:val="24"/>
+              </w:rPr>
+            </w:pPr>
+            <w:r>
+              <w:rPr>
+                <w:b/>
+                <w:szCs w:val="24"/>
+              </w:rPr>
+              <w:t>00 00 07 E8 43 03 04 32 04 26 04 20 #ZYJKTZ</w:t>
             </w:r>
           </w:p>
         </w:tc>
@@ -1971,6 +3623,13 @@
                 <w:szCs w:val="24"/>
               </w:rPr>
             </w:pPr>
+            <w:r>
+              <w:rPr>
+                <w:sz w:val="24"/>
+                <w:szCs w:val="24"/>
+              </w:rPr>
+              <w:t xml:space="preserve">Protocolo del OBD del ECU del vehículo inspeccionado. </w:t>
+            </w:r>
           </w:p>
         </w:tc>
       </w:tr>
@@ -2023,6 +3682,133 @@
               <w:t>.</w:t>
             </w:r>
           </w:p>
+          <w:p>
+            <w:pPr>
+              <w:jc w:val="both"/>
+              <w:rPr>
+                <w:szCs w:val="24"/>
+              </w:rPr>
+            </w:pPr>
+            <w:r>
+              <w:rPr>
+                <w:szCs w:val="24"/>
+              </w:rPr>
+              <w:t>Salida en 3 dígitos: “1” “2” “3”</w:t>
+            </w:r>
+          </w:p>
+          <w:p>
+            <w:pPr>
+              <w:jc w:val="both"/>
+              <w:rPr>
+                <w:szCs w:val="24"/>
+              </w:rPr>
+            </w:pPr>
+            <w:r>
+              <w:rPr>
+                <w:szCs w:val="24"/>
+              </w:rPr>
+              <w:t>Digito 1 = “1” Monitor disponible, “0” Monitor NO disponible.</w:t>
+            </w:r>
+          </w:p>
+          <w:p>
+            <w:pPr>
+              <w:jc w:val="both"/>
+              <w:rPr>
+                <w:szCs w:val="24"/>
+              </w:rPr>
+            </w:pPr>
+            <w:r>
+              <w:rPr>
+                <w:szCs w:val="24"/>
+              </w:rPr>
+              <w:t>Digito 2 = “1” Monitor completado, “0” Monitor NO completado.</w:t>
+            </w:r>
+          </w:p>
+          <w:p>
+            <w:pPr>
+              <w:jc w:val="both"/>
+              <w:rPr>
+                <w:szCs w:val="24"/>
+              </w:rPr>
+            </w:pPr>
+            <w:r>
+              <w:rPr>
+                <w:szCs w:val="24"/>
+              </w:rPr>
+              <w:t>Digito 3 = “0” Monitor sin DTC, “1” Monitor con DTC, “9” No completado, sin lectura de DTC.</w:t>
+            </w:r>
+          </w:p>
+          <w:p>
+            <w:pPr>
+              <w:jc w:val="both"/>
+              <w:rPr>
+                <w:szCs w:val="24"/>
+              </w:rPr>
+            </w:pPr>
+            <w:r>
+              <w:rPr>
+                <w:szCs w:val="24"/>
+              </w:rPr>
+              <w:t>Salidas esperas:</w:t>
+            </w:r>
+          </w:p>
+          <w:p>
+            <w:pPr>
+              <w:jc w:val="both"/>
+              <w:rPr>
+                <w:szCs w:val="24"/>
+              </w:rPr>
+            </w:pPr>
+            <w:r>
+              <w:rPr>
+                <w:szCs w:val="24"/>
+              </w:rPr>
+              <w:t>110 = Monitor disponible, completado, sin DTC, califica PASO.</w:t>
+            </w:r>
+          </w:p>
+          <w:p>
+            <w:pPr>
+              <w:jc w:val="both"/>
+              <w:rPr>
+                <w:szCs w:val="24"/>
+              </w:rPr>
+            </w:pPr>
+            <w:r>
+              <w:rPr>
+                <w:szCs w:val="24"/>
+              </w:rPr>
+              <w:t>111 = Monitor disponible, completado, con DTC, califica FALLO.</w:t>
+            </w:r>
+          </w:p>
+          <w:p>
+            <w:pPr>
+              <w:jc w:val="both"/>
+              <w:rPr>
+                <w:szCs w:val="24"/>
+              </w:rPr>
+            </w:pPr>
+            <w:r>
+              <w:rPr>
+                <w:szCs w:val="24"/>
+              </w:rPr>
+              <w:t>109 = Monitor disponible, no completado, sin DTC, sin calificación.</w:t>
+            </w:r>
+          </w:p>
+          <w:p>
+            <w:pPr>
+              <w:jc w:val="both"/>
+              <w:rPr>
+                <w:sz w:val="24"/>
+                <w:szCs w:val="24"/>
+              </w:rPr>
+            </w:pPr>
+            <w:r>
+              <w:rPr>
+                <w:szCs w:val="24"/>
+              </w:rPr>
+              <w:t>009 = Monitor no disponible, no completado, sin DTC, sin calificación.</w:t>
+            </w:r>
+          </w:p>
         </w:tc>
       </w:tr>
       <w:tr>
@@ -2074,6 +3860,158 @@
               <w:t>catalítico.</w:t>
             </w:r>
           </w:p>
+          <w:p>
+            <w:pPr>
+              <w:jc w:val="both"/>
+              <w:rPr>
+                <w:szCs w:val="24"/>
+              </w:rPr>
+            </w:pPr>
+            <w:r>
+              <w:rPr>
+                <w:szCs w:val="24"/>
+              </w:rPr>
+              <w:t>Salida en 3 dígitos: “1” “2” “3”</w:t>
+            </w:r>
+          </w:p>
+          <w:p>
+            <w:pPr>
+              <w:jc w:val="both"/>
+              <w:rPr>
+                <w:szCs w:val="24"/>
+              </w:rPr>
+            </w:pPr>
+            <w:r>
+              <w:rPr>
+                <w:szCs w:val="24"/>
+              </w:rPr>
+              <w:t>Digito 1 = “1” Monitor disponible, “0” Monitor NO disponible.</w:t>
+            </w:r>
+          </w:p>
+          <w:p>
+            <w:pPr>
+              <w:jc w:val="both"/>
+              <w:rPr>
+                <w:szCs w:val="24"/>
+              </w:rPr>
+            </w:pPr>
+            <w:r>
+              <w:rPr>
+                <w:szCs w:val="24"/>
+              </w:rPr>
+              <w:t>Digito 2 = “1” Monitor completado, “0” Monitor NO completado.</w:t>
+            </w:r>
+          </w:p>
+          <w:p>
+            <w:pPr>
+              <w:jc w:val="both"/>
+              <w:rPr>
+                <w:szCs w:val="24"/>
+              </w:rPr>
+            </w:pPr>
+            <w:r>
+              <w:rPr>
+                <w:szCs w:val="24"/>
+              </w:rPr>
+              <w:t>Digito 3 = “0” Monitor sin DTC, “1” Monitor con DTC, “9” No completado, sin lectura de DTC.</w:t>
+            </w:r>
+          </w:p>
+          <w:p>
+            <w:pPr>
+              <w:jc w:val="both"/>
+              <w:rPr>
+                <w:szCs w:val="24"/>
+              </w:rPr>
+            </w:pPr>
+            <w:r>
+              <w:rPr>
+                <w:szCs w:val="24"/>
+              </w:rPr>
+              <w:t>Salidas esperas:</w:t>
+            </w:r>
+          </w:p>
+          <w:p>
+            <w:pPr>
+              <w:jc w:val="both"/>
+              <w:rPr>
+                <w:szCs w:val="24"/>
+              </w:rPr>
+            </w:pPr>
+            <w:r>
+              <w:rPr>
+                <w:szCs w:val="24"/>
+              </w:rPr>
+              <w:t xml:space="preserve">110 = Monitor disponible, completado, sin DTC, </w:t>
+            </w:r>
+            <w:r>
+              <w:rPr>
+                <w:szCs w:val="24"/>
+              </w:rPr>
+              <w:t>califica</w:t>
+            </w:r>
+            <w:r>
+              <w:rPr>
+                <w:szCs w:val="24"/>
+              </w:rPr>
+              <w:t xml:space="preserve"> </w:t>
+            </w:r>
+            <w:r>
+              <w:rPr>
+                <w:szCs w:val="24"/>
+              </w:rPr>
+              <w:t>PASO</w:t>
+            </w:r>
+            <w:r>
+              <w:rPr>
+                <w:szCs w:val="24"/>
+              </w:rPr>
+              <w:t>.</w:t>
+            </w:r>
+          </w:p>
+          <w:p>
+            <w:pPr>
+              <w:jc w:val="both"/>
+              <w:rPr>
+                <w:szCs w:val="24"/>
+              </w:rPr>
+            </w:pPr>
+            <w:r>
+              <w:rPr>
+                <w:szCs w:val="24"/>
+              </w:rPr>
+              <w:t>111 = Monitor disponible, completado, con DTC, califica FALLO.</w:t>
+            </w:r>
+          </w:p>
+          <w:p>
+            <w:pPr>
+              <w:jc w:val="both"/>
+              <w:rPr>
+                <w:szCs w:val="24"/>
+              </w:rPr>
+            </w:pPr>
+            <w:r>
+              <w:rPr>
+                <w:szCs w:val="24"/>
+              </w:rPr>
+              <w:lastRenderedPageBreak/>
+              <w:t>109 = Monitor disponible, no completado, sin DTC, sin calificación.</w:t>
+            </w:r>
+          </w:p>
+          <w:p>
+            <w:pPr>
+              <w:jc w:val="both"/>
+              <w:rPr>
+                <w:sz w:val="24"/>
+                <w:szCs w:val="24"/>
+              </w:rPr>
+            </w:pPr>
+            <w:r>
+              <w:rPr>
+                <w:szCs w:val="24"/>
+              </w:rPr>
+              <w:t>009 = Monitor no disponible, no completado, sin DTC, sin calificación.</w:t>
+            </w:r>
+          </w:p>
         </w:tc>
       </w:tr>
       <w:tr>
@@ -2094,6 +4032,7 @@
                 <w:sz w:val="24"/>
                 <w:szCs w:val="24"/>
               </w:rPr>
+              <w:lastRenderedPageBreak/>
               <w:t>OBD_CMB</w:t>
             </w:r>
           </w:p>
@@ -2123,6 +4062,133 @@
                 <w:szCs w:val="24"/>
               </w:rPr>
               <w:t>.</w:t>
+            </w:r>
+          </w:p>
+          <w:p>
+            <w:pPr>
+              <w:jc w:val="both"/>
+              <w:rPr>
+                <w:szCs w:val="24"/>
+              </w:rPr>
+            </w:pPr>
+            <w:r>
+              <w:rPr>
+                <w:szCs w:val="24"/>
+              </w:rPr>
+              <w:t>Salida en 3 dígitos: “1” “2” “3”</w:t>
+            </w:r>
+          </w:p>
+          <w:p>
+            <w:pPr>
+              <w:jc w:val="both"/>
+              <w:rPr>
+                <w:szCs w:val="24"/>
+              </w:rPr>
+            </w:pPr>
+            <w:r>
+              <w:rPr>
+                <w:szCs w:val="24"/>
+              </w:rPr>
+              <w:t>Digito 1 = “1” Monitor disponible, “0” Monitor NO disponible.</w:t>
+            </w:r>
+          </w:p>
+          <w:p>
+            <w:pPr>
+              <w:jc w:val="both"/>
+              <w:rPr>
+                <w:szCs w:val="24"/>
+              </w:rPr>
+            </w:pPr>
+            <w:r>
+              <w:rPr>
+                <w:szCs w:val="24"/>
+              </w:rPr>
+              <w:t>Digito 2 = “1” Monitor completado, “0” Monitor NO completado.</w:t>
+            </w:r>
+          </w:p>
+          <w:p>
+            <w:pPr>
+              <w:jc w:val="both"/>
+              <w:rPr>
+                <w:szCs w:val="24"/>
+              </w:rPr>
+            </w:pPr>
+            <w:r>
+              <w:rPr>
+                <w:szCs w:val="24"/>
+              </w:rPr>
+              <w:t>Digito 3 = “0” Monitor sin DTC, “1” Monitor con DTC, “9” No completado, sin lectura de DTC.</w:t>
+            </w:r>
+          </w:p>
+          <w:p>
+            <w:pPr>
+              <w:jc w:val="both"/>
+              <w:rPr>
+                <w:szCs w:val="24"/>
+              </w:rPr>
+            </w:pPr>
+            <w:r>
+              <w:rPr>
+                <w:szCs w:val="24"/>
+              </w:rPr>
+              <w:t>Salidas esperas:</w:t>
+            </w:r>
+          </w:p>
+          <w:p>
+            <w:pPr>
+              <w:jc w:val="both"/>
+              <w:rPr>
+                <w:szCs w:val="24"/>
+              </w:rPr>
+            </w:pPr>
+            <w:r>
+              <w:rPr>
+                <w:szCs w:val="24"/>
+              </w:rPr>
+              <w:t>110 = Monitor disponible, completado, sin DTC, califica PASO.</w:t>
+            </w:r>
+          </w:p>
+          <w:p>
+            <w:pPr>
+              <w:jc w:val="both"/>
+              <w:rPr>
+                <w:szCs w:val="24"/>
+              </w:rPr>
+            </w:pPr>
+            <w:r>
+              <w:rPr>
+                <w:szCs w:val="24"/>
+              </w:rPr>
+              <w:t>111 = Monitor disponible, completado, con DTC, califica FALLO.</w:t>
+            </w:r>
+          </w:p>
+          <w:p>
+            <w:pPr>
+              <w:jc w:val="both"/>
+              <w:rPr>
+                <w:szCs w:val="24"/>
+              </w:rPr>
+            </w:pPr>
+            <w:r>
+              <w:rPr>
+                <w:szCs w:val="24"/>
+              </w:rPr>
+              <w:t>109 = Monitor disponible, no completado, sin DTC, sin calificación.</w:t>
+            </w:r>
+          </w:p>
+          <w:p>
+            <w:pPr>
+              <w:jc w:val="both"/>
+              <w:rPr>
+                <w:sz w:val="24"/>
+                <w:szCs w:val="24"/>
+              </w:rPr>
+            </w:pPr>
+            <w:r>
+              <w:rPr>
+                <w:szCs w:val="24"/>
+              </w:rPr>
+              <w:t>009 = Monitor no disponible, no completado, sin DTC, sin calificación.</w:t>
             </w:r>
           </w:p>
         </w:tc>
@@ -2176,6 +4242,134 @@
               <w:t>.</w:t>
             </w:r>
           </w:p>
+          <w:p>
+            <w:pPr>
+              <w:jc w:val="both"/>
+              <w:rPr>
+                <w:szCs w:val="24"/>
+              </w:rPr>
+            </w:pPr>
+            <w:r>
+              <w:rPr>
+                <w:szCs w:val="24"/>
+              </w:rPr>
+              <w:t>Salida en 3 dígitos: “1” “2” “3”</w:t>
+            </w:r>
+          </w:p>
+          <w:p>
+            <w:pPr>
+              <w:jc w:val="both"/>
+              <w:rPr>
+                <w:szCs w:val="24"/>
+              </w:rPr>
+            </w:pPr>
+            <w:r>
+              <w:rPr>
+                <w:szCs w:val="24"/>
+              </w:rPr>
+              <w:t>Digito 1 = “1” Monitor disponible, “0” Monitor NO disponible.</w:t>
+            </w:r>
+          </w:p>
+          <w:p>
+            <w:pPr>
+              <w:jc w:val="both"/>
+              <w:rPr>
+                <w:szCs w:val="24"/>
+              </w:rPr>
+            </w:pPr>
+            <w:r>
+              <w:rPr>
+                <w:szCs w:val="24"/>
+              </w:rPr>
+              <w:t>Digito 2 = “1” Monitor completado, “0” Monitor NO completado.</w:t>
+            </w:r>
+          </w:p>
+          <w:p>
+            <w:pPr>
+              <w:jc w:val="both"/>
+              <w:rPr>
+                <w:szCs w:val="24"/>
+              </w:rPr>
+            </w:pPr>
+            <w:r>
+              <w:rPr>
+                <w:szCs w:val="24"/>
+              </w:rPr>
+              <w:t>Digito 3 = “0” Monitor sin DTC, “1” Monitor con DTC, “9” No completado, sin lectura de DTC.</w:t>
+            </w:r>
+          </w:p>
+          <w:p>
+            <w:pPr>
+              <w:jc w:val="both"/>
+              <w:rPr>
+                <w:szCs w:val="24"/>
+              </w:rPr>
+            </w:pPr>
+            <w:r>
+              <w:rPr>
+                <w:szCs w:val="24"/>
+              </w:rPr>
+              <w:t>Salidas esperas:</w:t>
+            </w:r>
+          </w:p>
+          <w:p>
+            <w:pPr>
+              <w:jc w:val="both"/>
+              <w:rPr>
+                <w:sz w:val="22"/>
+                <w:szCs w:val="24"/>
+              </w:rPr>
+            </w:pPr>
+            <w:r>
+              <w:rPr>
+                <w:szCs w:val="24"/>
+              </w:rPr>
+              <w:t>110 = Monitor disponible, completado, sin DTC, califica PASO.</w:t>
+            </w:r>
+          </w:p>
+          <w:p>
+            <w:pPr>
+              <w:jc w:val="both"/>
+              <w:rPr>
+                <w:szCs w:val="24"/>
+              </w:rPr>
+            </w:pPr>
+            <w:r>
+              <w:rPr>
+                <w:szCs w:val="24"/>
+              </w:rPr>
+              <w:t>111 = Monitor disponible, completado, con DTC, califica FALLO.</w:t>
+            </w:r>
+          </w:p>
+          <w:p>
+            <w:pPr>
+              <w:jc w:val="both"/>
+              <w:rPr>
+                <w:szCs w:val="24"/>
+              </w:rPr>
+            </w:pPr>
+            <w:r>
+              <w:rPr>
+                <w:szCs w:val="24"/>
+              </w:rPr>
+              <w:t>109 = Monitor disponible, no completado, sin DTC, sin calificación.</w:t>
+            </w:r>
+          </w:p>
+          <w:p>
+            <w:pPr>
+              <w:jc w:val="both"/>
+              <w:rPr>
+                <w:sz w:val="24"/>
+                <w:szCs w:val="24"/>
+              </w:rPr>
+            </w:pPr>
+            <w:r>
+              <w:rPr>
+                <w:szCs w:val="24"/>
+              </w:rPr>
+              <w:t>009 = Monitor no disponible, no completado, sin DTC, sin calificación.</w:t>
+            </w:r>
+          </w:p>
         </w:tc>
       </w:tr>
       <w:tr>
@@ -2227,6 +4421,133 @@
               <w:t>.</w:t>
             </w:r>
           </w:p>
+          <w:p>
+            <w:pPr>
+              <w:jc w:val="both"/>
+              <w:rPr>
+                <w:szCs w:val="24"/>
+              </w:rPr>
+            </w:pPr>
+            <w:r>
+              <w:rPr>
+                <w:szCs w:val="24"/>
+              </w:rPr>
+              <w:t>Salida en 3 dígitos: “1” “2” “3”</w:t>
+            </w:r>
+          </w:p>
+          <w:p>
+            <w:pPr>
+              <w:jc w:val="both"/>
+              <w:rPr>
+                <w:szCs w:val="24"/>
+              </w:rPr>
+            </w:pPr>
+            <w:r>
+              <w:rPr>
+                <w:szCs w:val="24"/>
+              </w:rPr>
+              <w:t>Digito 1 = “1” Monitor disponible, “0” Monitor NO disponible.</w:t>
+            </w:r>
+          </w:p>
+          <w:p>
+            <w:pPr>
+              <w:jc w:val="both"/>
+              <w:rPr>
+                <w:szCs w:val="24"/>
+              </w:rPr>
+            </w:pPr>
+            <w:r>
+              <w:rPr>
+                <w:szCs w:val="24"/>
+              </w:rPr>
+              <w:t>Digito 2 = “1” Monitor completado, “0” Monitor NO completado.</w:t>
+            </w:r>
+          </w:p>
+          <w:p>
+            <w:pPr>
+              <w:jc w:val="both"/>
+              <w:rPr>
+                <w:szCs w:val="24"/>
+              </w:rPr>
+            </w:pPr>
+            <w:r>
+              <w:rPr>
+                <w:szCs w:val="24"/>
+              </w:rPr>
+              <w:t>Digito 3 = “0” Monitor sin DTC, “1” Monitor con DTC, “9” No completado, sin lectura de DTC.</w:t>
+            </w:r>
+          </w:p>
+          <w:p>
+            <w:pPr>
+              <w:jc w:val="both"/>
+              <w:rPr>
+                <w:szCs w:val="24"/>
+              </w:rPr>
+            </w:pPr>
+            <w:r>
+              <w:rPr>
+                <w:szCs w:val="24"/>
+              </w:rPr>
+              <w:t>Salidas esperas:</w:t>
+            </w:r>
+          </w:p>
+          <w:p>
+            <w:pPr>
+              <w:jc w:val="both"/>
+              <w:rPr>
+                <w:szCs w:val="24"/>
+              </w:rPr>
+            </w:pPr>
+            <w:r>
+              <w:rPr>
+                <w:szCs w:val="24"/>
+              </w:rPr>
+              <w:t>110 = Monitor disponible, completado, sin DTC, califica PASO.</w:t>
+            </w:r>
+          </w:p>
+          <w:p>
+            <w:pPr>
+              <w:jc w:val="both"/>
+              <w:rPr>
+                <w:szCs w:val="24"/>
+              </w:rPr>
+            </w:pPr>
+            <w:r>
+              <w:rPr>
+                <w:szCs w:val="24"/>
+              </w:rPr>
+              <w:t>111 = Monitor disponible, completado, con DTC, califica FALLO.</w:t>
+            </w:r>
+          </w:p>
+          <w:p>
+            <w:pPr>
+              <w:jc w:val="both"/>
+              <w:rPr>
+                <w:szCs w:val="24"/>
+              </w:rPr>
+            </w:pPr>
+            <w:r>
+              <w:rPr>
+                <w:szCs w:val="24"/>
+              </w:rPr>
+              <w:t>109 = Monitor disponible, no completado, sin DTC, sin calificación.</w:t>
+            </w:r>
+          </w:p>
+          <w:p>
+            <w:pPr>
+              <w:jc w:val="both"/>
+              <w:rPr>
+                <w:sz w:val="24"/>
+                <w:szCs w:val="24"/>
+              </w:rPr>
+            </w:pPr>
+            <w:r>
+              <w:rPr>
+                <w:szCs w:val="24"/>
+              </w:rPr>
+              <w:t>009 = Monitor no disponible, no completado, sin DTC, sin calificación.</w:t>
+            </w:r>
+          </w:p>
         </w:tc>
       </w:tr>
       <w:tr>
@@ -2278,6 +4599,133 @@
               <w:t>catalítico.</w:t>
             </w:r>
           </w:p>
+          <w:p>
+            <w:pPr>
+              <w:jc w:val="both"/>
+              <w:rPr>
+                <w:szCs w:val="24"/>
+              </w:rPr>
+            </w:pPr>
+            <w:r>
+              <w:rPr>
+                <w:szCs w:val="24"/>
+              </w:rPr>
+              <w:t>Salida en 3 dígitos: “1” “2” “3”</w:t>
+            </w:r>
+          </w:p>
+          <w:p>
+            <w:pPr>
+              <w:jc w:val="both"/>
+              <w:rPr>
+                <w:szCs w:val="24"/>
+              </w:rPr>
+            </w:pPr>
+            <w:r>
+              <w:rPr>
+                <w:szCs w:val="24"/>
+              </w:rPr>
+              <w:t>Digito 1 = “1” Monitor disponible, “0” Monitor NO disponible.</w:t>
+            </w:r>
+          </w:p>
+          <w:p>
+            <w:pPr>
+              <w:jc w:val="both"/>
+              <w:rPr>
+                <w:szCs w:val="24"/>
+              </w:rPr>
+            </w:pPr>
+            <w:r>
+              <w:rPr>
+                <w:szCs w:val="24"/>
+              </w:rPr>
+              <w:t>Digito 2 = “1” Monitor completado, “0” Monitor NO completado.</w:t>
+            </w:r>
+          </w:p>
+          <w:p>
+            <w:pPr>
+              <w:jc w:val="both"/>
+              <w:rPr>
+                <w:szCs w:val="24"/>
+              </w:rPr>
+            </w:pPr>
+            <w:r>
+              <w:rPr>
+                <w:szCs w:val="24"/>
+              </w:rPr>
+              <w:t>Digito 3 = “0” Monitor sin DTC, “1” Monitor con DTC, “9” No completado, sin lectura de DTC.</w:t>
+            </w:r>
+          </w:p>
+          <w:p>
+            <w:pPr>
+              <w:jc w:val="both"/>
+              <w:rPr>
+                <w:szCs w:val="24"/>
+              </w:rPr>
+            </w:pPr>
+            <w:r>
+              <w:rPr>
+                <w:szCs w:val="24"/>
+              </w:rPr>
+              <w:t>Salidas esperas:</w:t>
+            </w:r>
+          </w:p>
+          <w:p>
+            <w:pPr>
+              <w:jc w:val="both"/>
+              <w:rPr>
+                <w:szCs w:val="24"/>
+              </w:rPr>
+            </w:pPr>
+            <w:r>
+              <w:rPr>
+                <w:szCs w:val="24"/>
+              </w:rPr>
+              <w:t>110 = Monitor disponible, completado, sin DTC, califica PASO.</w:t>
+            </w:r>
+          </w:p>
+          <w:p>
+            <w:pPr>
+              <w:jc w:val="both"/>
+              <w:rPr>
+                <w:szCs w:val="24"/>
+              </w:rPr>
+            </w:pPr>
+            <w:r>
+              <w:rPr>
+                <w:szCs w:val="24"/>
+              </w:rPr>
+              <w:t>111 = Monitor disponible, completado, con DTC, califica FALLO.</w:t>
+            </w:r>
+          </w:p>
+          <w:p>
+            <w:pPr>
+              <w:jc w:val="both"/>
+              <w:rPr>
+                <w:szCs w:val="24"/>
+              </w:rPr>
+            </w:pPr>
+            <w:r>
+              <w:rPr>
+                <w:szCs w:val="24"/>
+              </w:rPr>
+              <w:t>109 = Monitor disponible, no completado, sin DTC, sin calificación.</w:t>
+            </w:r>
+          </w:p>
+          <w:p>
+            <w:pPr>
+              <w:jc w:val="both"/>
+              <w:rPr>
+                <w:sz w:val="24"/>
+                <w:szCs w:val="24"/>
+              </w:rPr>
+            </w:pPr>
+            <w:r>
+              <w:rPr>
+                <w:szCs w:val="24"/>
+              </w:rPr>
+              <w:t>009 = Monitor no disponible, no completado, sin DTC, sin calificación.</w:t>
+            </w:r>
+          </w:p>
         </w:tc>
       </w:tr>
       <w:tr>
@@ -2329,6 +4777,134 @@
               <w:t>.</w:t>
             </w:r>
           </w:p>
+          <w:p>
+            <w:pPr>
+              <w:jc w:val="both"/>
+              <w:rPr>
+                <w:szCs w:val="24"/>
+              </w:rPr>
+            </w:pPr>
+            <w:r>
+              <w:rPr>
+                <w:szCs w:val="24"/>
+              </w:rPr>
+              <w:t>Salida en 3 dígitos: “1” “2” “3”</w:t>
+            </w:r>
+          </w:p>
+          <w:p>
+            <w:pPr>
+              <w:jc w:val="both"/>
+              <w:rPr>
+                <w:szCs w:val="24"/>
+              </w:rPr>
+            </w:pPr>
+            <w:r>
+              <w:rPr>
+                <w:szCs w:val="24"/>
+              </w:rPr>
+              <w:lastRenderedPageBreak/>
+              <w:t>Digito 1 = “1” Monitor disponible, “0” Monitor NO disponible.</w:t>
+            </w:r>
+          </w:p>
+          <w:p>
+            <w:pPr>
+              <w:jc w:val="both"/>
+              <w:rPr>
+                <w:szCs w:val="24"/>
+              </w:rPr>
+            </w:pPr>
+            <w:r>
+              <w:rPr>
+                <w:szCs w:val="24"/>
+              </w:rPr>
+              <w:t>Digito 2 = “1” Monitor completado, “0” Monitor NO completado.</w:t>
+            </w:r>
+          </w:p>
+          <w:p>
+            <w:pPr>
+              <w:jc w:val="both"/>
+              <w:rPr>
+                <w:szCs w:val="24"/>
+              </w:rPr>
+            </w:pPr>
+            <w:r>
+              <w:rPr>
+                <w:szCs w:val="24"/>
+              </w:rPr>
+              <w:t>Digito 3 = “0” Monitor sin DTC, “1” Monitor con DTC, “9” No completado, sin lectura de DTC.</w:t>
+            </w:r>
+          </w:p>
+          <w:p>
+            <w:pPr>
+              <w:jc w:val="both"/>
+              <w:rPr>
+                <w:szCs w:val="24"/>
+              </w:rPr>
+            </w:pPr>
+            <w:r>
+              <w:rPr>
+                <w:szCs w:val="24"/>
+              </w:rPr>
+              <w:t>Salidas esperas:</w:t>
+            </w:r>
+          </w:p>
+          <w:p>
+            <w:pPr>
+              <w:jc w:val="both"/>
+              <w:rPr>
+                <w:szCs w:val="24"/>
+              </w:rPr>
+            </w:pPr>
+            <w:r>
+              <w:rPr>
+                <w:szCs w:val="24"/>
+              </w:rPr>
+              <w:t>110 = Monitor disponible, completado, sin DTC, califica PASO.</w:t>
+            </w:r>
+          </w:p>
+          <w:p>
+            <w:pPr>
+              <w:jc w:val="both"/>
+              <w:rPr>
+                <w:szCs w:val="24"/>
+              </w:rPr>
+            </w:pPr>
+            <w:r>
+              <w:rPr>
+                <w:szCs w:val="24"/>
+              </w:rPr>
+              <w:t>111 = Monitor disponible, completado, con DTC, califica FALLO.</w:t>
+            </w:r>
+          </w:p>
+          <w:p>
+            <w:pPr>
+              <w:jc w:val="both"/>
+              <w:rPr>
+                <w:szCs w:val="24"/>
+              </w:rPr>
+            </w:pPr>
+            <w:r>
+              <w:rPr>
+                <w:szCs w:val="24"/>
+              </w:rPr>
+              <w:t>109 = Monitor disponible, no completado, sin DTC, sin calificación.</w:t>
+            </w:r>
+          </w:p>
+          <w:p>
+            <w:pPr>
+              <w:jc w:val="both"/>
+              <w:rPr>
+                <w:sz w:val="24"/>
+                <w:szCs w:val="24"/>
+              </w:rPr>
+            </w:pPr>
+            <w:r>
+              <w:rPr>
+                <w:szCs w:val="24"/>
+              </w:rPr>
+              <w:t>009 = Monitor no disponible, no completado, sin DTC, sin calificación.</w:t>
+            </w:r>
+          </w:p>
         </w:tc>
       </w:tr>
       <w:tr>
@@ -2349,6 +4925,7 @@
                 <w:sz w:val="24"/>
                 <w:szCs w:val="24"/>
               </w:rPr>
+              <w:lastRenderedPageBreak/>
               <w:t>OBD_SAS</w:t>
             </w:r>
           </w:p>
@@ -2378,6 +4955,135 @@
                 <w:szCs w:val="24"/>
               </w:rPr>
               <w:t>.</w:t>
+            </w:r>
+          </w:p>
+          <w:p>
+            <w:pPr>
+              <w:jc w:val="both"/>
+              <w:rPr>
+                <w:szCs w:val="24"/>
+              </w:rPr>
+            </w:pPr>
+            <w:r>
+              <w:rPr>
+                <w:szCs w:val="24"/>
+              </w:rPr>
+              <w:t>Salida en 3 dígitos: “1” “2” “3”</w:t>
+            </w:r>
+          </w:p>
+          <w:p>
+            <w:pPr>
+              <w:jc w:val="both"/>
+              <w:rPr>
+                <w:szCs w:val="24"/>
+              </w:rPr>
+            </w:pPr>
+            <w:r>
+              <w:rPr>
+                <w:szCs w:val="24"/>
+              </w:rPr>
+              <w:t>Digito 1 = “1” Monitor disponible, “0” Monitor NO disponible.</w:t>
+            </w:r>
+          </w:p>
+          <w:p>
+            <w:pPr>
+              <w:jc w:val="both"/>
+              <w:rPr>
+                <w:szCs w:val="24"/>
+              </w:rPr>
+            </w:pPr>
+            <w:r>
+              <w:rPr>
+                <w:szCs w:val="24"/>
+              </w:rPr>
+              <w:t>Digito 2 = “1” Monitor completado, “0” Monitor NO completado.</w:t>
+            </w:r>
+          </w:p>
+          <w:p>
+            <w:pPr>
+              <w:jc w:val="both"/>
+              <w:rPr>
+                <w:szCs w:val="24"/>
+              </w:rPr>
+            </w:pPr>
+            <w:r>
+              <w:rPr>
+                <w:szCs w:val="24"/>
+              </w:rPr>
+              <w:t>Digito 3 = “0” Monitor sin DTC, “1” Monitor con DTC, “9” No completado, sin lectura de DTC.</w:t>
+            </w:r>
+          </w:p>
+          <w:p>
+            <w:pPr>
+              <w:jc w:val="both"/>
+              <w:rPr>
+                <w:szCs w:val="24"/>
+              </w:rPr>
+            </w:pPr>
+            <w:r>
+              <w:rPr>
+                <w:szCs w:val="24"/>
+              </w:rPr>
+              <w:t>Salidas esperas:</w:t>
+            </w:r>
+          </w:p>
+          <w:p>
+            <w:pPr>
+              <w:jc w:val="both"/>
+              <w:rPr>
+                <w:sz w:val="22"/>
+                <w:szCs w:val="24"/>
+              </w:rPr>
+            </w:pPr>
+            <w:r>
+              <w:rPr>
+                <w:szCs w:val="24"/>
+              </w:rPr>
+              <w:t>110 = Monitor disponible, completado, sin DTC, califica PASO.</w:t>
+            </w:r>
+          </w:p>
+          <w:p>
+            <w:pPr>
+              <w:jc w:val="both"/>
+              <w:rPr>
+                <w:sz w:val="22"/>
+                <w:szCs w:val="24"/>
+              </w:rPr>
+            </w:pPr>
+            <w:r>
+              <w:rPr>
+                <w:szCs w:val="24"/>
+              </w:rPr>
+              <w:t>111 = Monitor disponible, completado, con DTC, califica FALLO.</w:t>
+            </w:r>
+          </w:p>
+          <w:p>
+            <w:pPr>
+              <w:jc w:val="both"/>
+              <w:rPr>
+                <w:szCs w:val="24"/>
+              </w:rPr>
+            </w:pPr>
+            <w:r>
+              <w:rPr>
+                <w:szCs w:val="24"/>
+              </w:rPr>
+              <w:t>109 = Monitor disponible, no completado, sin DTC, sin calificación.</w:t>
+            </w:r>
+          </w:p>
+          <w:p>
+            <w:pPr>
+              <w:jc w:val="both"/>
+              <w:rPr>
+                <w:sz w:val="24"/>
+                <w:szCs w:val="24"/>
+              </w:rPr>
+            </w:pPr>
+            <w:r>
+              <w:rPr>
+                <w:szCs w:val="24"/>
+              </w:rPr>
+              <w:t>009 = Monitor no disponible, no completado, sin DTC, sin calificación.</w:t>
             </w:r>
           </w:p>
         </w:tc>
@@ -2431,6 +5137,133 @@
               <w:t>.</w:t>
             </w:r>
           </w:p>
+          <w:p>
+            <w:pPr>
+              <w:jc w:val="both"/>
+              <w:rPr>
+                <w:szCs w:val="24"/>
+              </w:rPr>
+            </w:pPr>
+            <w:r>
+              <w:rPr>
+                <w:szCs w:val="24"/>
+              </w:rPr>
+              <w:t>Salida en 3 dígitos: “1” “2” “3”</w:t>
+            </w:r>
+          </w:p>
+          <w:p>
+            <w:pPr>
+              <w:jc w:val="both"/>
+              <w:rPr>
+                <w:szCs w:val="24"/>
+              </w:rPr>
+            </w:pPr>
+            <w:r>
+              <w:rPr>
+                <w:szCs w:val="24"/>
+              </w:rPr>
+              <w:t>Digito 1 = “1” Monitor disponible, “0” Monitor NO disponible.</w:t>
+            </w:r>
+          </w:p>
+          <w:p>
+            <w:pPr>
+              <w:jc w:val="both"/>
+              <w:rPr>
+                <w:szCs w:val="24"/>
+              </w:rPr>
+            </w:pPr>
+            <w:r>
+              <w:rPr>
+                <w:szCs w:val="24"/>
+              </w:rPr>
+              <w:t>Digito 2 = “1” Monitor completado, “0” Monitor NO completado.</w:t>
+            </w:r>
+          </w:p>
+          <w:p>
+            <w:pPr>
+              <w:jc w:val="both"/>
+              <w:rPr>
+                <w:szCs w:val="24"/>
+              </w:rPr>
+            </w:pPr>
+            <w:r>
+              <w:rPr>
+                <w:szCs w:val="24"/>
+              </w:rPr>
+              <w:t>Digito 3 = “0” Monitor sin DTC, “1” Monitor con DTC, “9” No completado, sin lectura de DTC.</w:t>
+            </w:r>
+          </w:p>
+          <w:p>
+            <w:pPr>
+              <w:jc w:val="both"/>
+              <w:rPr>
+                <w:szCs w:val="24"/>
+              </w:rPr>
+            </w:pPr>
+            <w:r>
+              <w:rPr>
+                <w:szCs w:val="24"/>
+              </w:rPr>
+              <w:t>Salidas esperas:</w:t>
+            </w:r>
+          </w:p>
+          <w:p>
+            <w:pPr>
+              <w:jc w:val="both"/>
+              <w:rPr>
+                <w:szCs w:val="24"/>
+              </w:rPr>
+            </w:pPr>
+            <w:r>
+              <w:rPr>
+                <w:szCs w:val="24"/>
+              </w:rPr>
+              <w:t>110 = Monitor disponible, completado, sin DTC, califica PASO.</w:t>
+            </w:r>
+          </w:p>
+          <w:p>
+            <w:pPr>
+              <w:jc w:val="both"/>
+              <w:rPr>
+                <w:szCs w:val="24"/>
+              </w:rPr>
+            </w:pPr>
+            <w:r>
+              <w:rPr>
+                <w:szCs w:val="24"/>
+              </w:rPr>
+              <w:t>111 = Monitor disponible, completado, con DTC, califica FALLO.</w:t>
+            </w:r>
+          </w:p>
+          <w:p>
+            <w:pPr>
+              <w:jc w:val="both"/>
+              <w:rPr>
+                <w:szCs w:val="24"/>
+              </w:rPr>
+            </w:pPr>
+            <w:r>
+              <w:rPr>
+                <w:szCs w:val="24"/>
+              </w:rPr>
+              <w:t>109 = Monitor disponible, no completado, sin DTC, sin calificación.</w:t>
+            </w:r>
+          </w:p>
+          <w:p>
+            <w:pPr>
+              <w:jc w:val="both"/>
+              <w:rPr>
+                <w:sz w:val="24"/>
+                <w:szCs w:val="24"/>
+              </w:rPr>
+            </w:pPr>
+            <w:r>
+              <w:rPr>
+                <w:szCs w:val="24"/>
+              </w:rPr>
+              <w:t>009 = Monitor no disponible, no completado, sin DTC, sin calificación.</w:t>
+            </w:r>
+          </w:p>
         </w:tc>
       </w:tr>
       <w:tr>
@@ -2485,6 +5318,136 @@
               <w:t>.</w:t>
             </w:r>
           </w:p>
+          <w:p>
+            <w:pPr>
+              <w:jc w:val="both"/>
+              <w:rPr>
+                <w:szCs w:val="24"/>
+              </w:rPr>
+            </w:pPr>
+            <w:r>
+              <w:rPr>
+                <w:szCs w:val="24"/>
+              </w:rPr>
+              <w:t>Salida en 3 dígitos: “1” “2” “3”</w:t>
+            </w:r>
+          </w:p>
+          <w:p>
+            <w:pPr>
+              <w:jc w:val="both"/>
+              <w:rPr>
+                <w:szCs w:val="24"/>
+              </w:rPr>
+            </w:pPr>
+            <w:r>
+              <w:rPr>
+                <w:szCs w:val="24"/>
+              </w:rPr>
+              <w:t>Digito 1 = “1” Monitor disponible, “0” Monitor NO disponible.</w:t>
+            </w:r>
+          </w:p>
+          <w:p>
+            <w:pPr>
+              <w:jc w:val="both"/>
+              <w:rPr>
+                <w:szCs w:val="24"/>
+              </w:rPr>
+            </w:pPr>
+            <w:r>
+              <w:rPr>
+                <w:szCs w:val="24"/>
+              </w:rPr>
+              <w:t>Digito 2 = “1” Monitor completado, “0” Monitor NO completado.</w:t>
+            </w:r>
+          </w:p>
+          <w:p>
+            <w:pPr>
+              <w:jc w:val="both"/>
+              <w:rPr>
+                <w:szCs w:val="24"/>
+              </w:rPr>
+            </w:pPr>
+            <w:r>
+              <w:rPr>
+                <w:szCs w:val="24"/>
+              </w:rPr>
+              <w:t>Digito 3 = “0” Monitor sin DTC, “1” Monitor con DTC, “9” No completado, sin lectura de DTC.</w:t>
+            </w:r>
+          </w:p>
+          <w:p>
+            <w:pPr>
+              <w:jc w:val="both"/>
+              <w:rPr>
+                <w:szCs w:val="24"/>
+              </w:rPr>
+            </w:pPr>
+            <w:r>
+              <w:rPr>
+                <w:szCs w:val="24"/>
+              </w:rPr>
+              <w:t>Salidas esperas:</w:t>
+            </w:r>
+          </w:p>
+          <w:p>
+            <w:pPr>
+              <w:jc w:val="both"/>
+              <w:rPr>
+                <w:szCs w:val="24"/>
+              </w:rPr>
+            </w:pPr>
+            <w:r>
+              <w:rPr>
+                <w:szCs w:val="24"/>
+              </w:rPr>
+              <w:t>110 = Monitor disponible, completado, sin DTC, califica PASO.</w:t>
+            </w:r>
+          </w:p>
+          <w:p>
+            <w:pPr>
+              <w:jc w:val="both"/>
+              <w:rPr>
+                <w:szCs w:val="24"/>
+              </w:rPr>
+            </w:pPr>
+            <w:r>
+              <w:rPr>
+                <w:szCs w:val="24"/>
+              </w:rPr>
+              <w:t>111 = Monitor disponible, completado, con DTC, califica FALLO.</w:t>
+            </w:r>
+          </w:p>
+          <w:p>
+            <w:pPr>
+              <w:jc w:val="both"/>
+              <w:rPr>
+                <w:szCs w:val="24"/>
+              </w:rPr>
+            </w:pPr>
+            <w:r>
+              <w:rPr>
+                <w:szCs w:val="24"/>
+              </w:rPr>
+              <w:t>109 = Monitor disponible, no completado, sin DTC, sin calificación.</w:t>
+            </w:r>
+          </w:p>
+          <w:p>
+            <w:pPr>
+              <w:tabs>
+                <w:tab w:val="left" w:pos="2850"/>
+              </w:tabs>
+              <w:jc w:val="both"/>
+              <w:rPr>
+                <w:sz w:val="24"/>
+                <w:szCs w:val="24"/>
+              </w:rPr>
+            </w:pPr>
+            <w:r>
+              <w:rPr>
+                <w:szCs w:val="24"/>
+              </w:rPr>
+              <w:t>009 = Monitor no disponible, no completado, sin DTC, sin calificación.</w:t>
+            </w:r>
+          </w:p>
         </w:tc>
       </w:tr>
     </w:tbl>
@@ -2501,10 +5464,445 @@
       <w:pPr>
         <w:jc w:val="both"/>
         <w:rPr>
+          <w:b/>
           <w:sz w:val="24"/>
           <w:szCs w:val="24"/>
         </w:rPr>
       </w:pPr>
+      <w:r>
+        <w:rPr>
+          <w:b/>
+          <w:sz w:val="24"/>
+          <w:szCs w:val="24"/>
+        </w:rPr>
+        <w:t>CHKSUM de registros.</w:t>
+      </w:r>
+    </w:p>
+    <w:p>
+      <w:pPr>
+        <w:jc w:val="both"/>
+        <w:rPr>
+          <w:rFonts w:ascii="Calibri" w:hAnsi="Calibri" w:cs="Calibri"/>
+          <w:sz w:val="24"/>
+          <w:szCs w:val="24"/>
+        </w:rPr>
+      </w:pPr>
+      <w:r>
+        <w:rPr>
+          <w:rFonts w:ascii="Calibri" w:hAnsi="Calibri" w:cs="Calibri"/>
+          <w:sz w:val="24"/>
+          <w:szCs w:val="24"/>
+        </w:rPr>
+        <w:t>A l</w:t>
+      </w:r>
+      <w:r>
+        <w:rPr>
+          <w:rFonts w:ascii="Calibri" w:hAnsi="Calibri" w:cs="Calibri"/>
+          <w:sz w:val="24"/>
+          <w:szCs w:val="24"/>
+        </w:rPr>
+        <w:t xml:space="preserve">os registros </w:t>
+      </w:r>
+      <w:r>
+        <w:rPr>
+          <w:rFonts w:ascii="Calibri" w:hAnsi="Calibri" w:cs="Calibri"/>
+          <w:sz w:val="24"/>
+          <w:szCs w:val="24"/>
+        </w:rPr>
+        <w:t>captados</w:t>
+      </w:r>
+      <w:r>
+        <w:rPr>
+          <w:rFonts w:ascii="Calibri" w:hAnsi="Calibri" w:cs="Calibri"/>
+          <w:sz w:val="24"/>
+          <w:szCs w:val="24"/>
+        </w:rPr>
+        <w:t xml:space="preserve"> del ECU de</w:t>
+      </w:r>
+      <w:r>
+        <w:rPr>
+          <w:rFonts w:ascii="Calibri" w:hAnsi="Calibri" w:cs="Calibri"/>
+          <w:sz w:val="24"/>
+          <w:szCs w:val="24"/>
+        </w:rPr>
+        <w:t xml:space="preserve"> un</w:t>
+      </w:r>
+      <w:r>
+        <w:rPr>
+          <w:rFonts w:ascii="Calibri" w:hAnsi="Calibri" w:cs="Calibri"/>
+          <w:sz w:val="24"/>
+          <w:szCs w:val="24"/>
+        </w:rPr>
+        <w:t xml:space="preserve"> vehículo, se les agrega una cadena llave, denominada “</w:t>
+      </w:r>
+      <w:proofErr w:type="spellStart"/>
+      <w:r>
+        <w:rPr>
+          <w:rFonts w:ascii="Calibri" w:hAnsi="Calibri" w:cs="Calibri"/>
+          <w:sz w:val="24"/>
+          <w:szCs w:val="24"/>
+        </w:rPr>
+        <w:t>chksum</w:t>
+      </w:r>
+      <w:proofErr w:type="spellEnd"/>
+      <w:r>
+        <w:rPr>
+          <w:rFonts w:ascii="Calibri" w:hAnsi="Calibri" w:cs="Calibri"/>
+          <w:sz w:val="24"/>
+          <w:szCs w:val="24"/>
+        </w:rPr>
+        <w:t>” al final</w:t>
+      </w:r>
+      <w:r>
+        <w:rPr>
+          <w:rFonts w:ascii="Calibri" w:hAnsi="Calibri" w:cs="Calibri"/>
+          <w:sz w:val="24"/>
+          <w:szCs w:val="24"/>
+        </w:rPr>
+        <w:t xml:space="preserve"> del mismo, separada por el carácter “#”</w:t>
+      </w:r>
+      <w:r>
+        <w:rPr>
+          <w:rFonts w:ascii="Calibri" w:hAnsi="Calibri" w:cs="Calibri"/>
+          <w:sz w:val="24"/>
+          <w:szCs w:val="24"/>
+        </w:rPr>
+        <w:t xml:space="preserve">, que permite asegurar la integridad de </w:t>
+      </w:r>
+      <w:r>
+        <w:rPr>
+          <w:rFonts w:ascii="Calibri" w:hAnsi="Calibri" w:cs="Calibri"/>
+          <w:sz w:val="24"/>
+          <w:szCs w:val="24"/>
+        </w:rPr>
+        <w:lastRenderedPageBreak/>
+        <w:t xml:space="preserve">su contenido. El </w:t>
+      </w:r>
+      <w:proofErr w:type="spellStart"/>
+      <w:r>
+        <w:rPr>
+          <w:rFonts w:ascii="Calibri" w:hAnsi="Calibri" w:cs="Calibri"/>
+          <w:sz w:val="24"/>
+          <w:szCs w:val="24"/>
+        </w:rPr>
+        <w:t>chksum</w:t>
+      </w:r>
+      <w:proofErr w:type="spellEnd"/>
+      <w:r>
+        <w:rPr>
+          <w:rFonts w:ascii="Calibri" w:hAnsi="Calibri" w:cs="Calibri"/>
+          <w:sz w:val="24"/>
+          <w:szCs w:val="24"/>
+        </w:rPr>
+        <w:t xml:space="preserve"> se calcula de todos los campos del registro </w:t>
+      </w:r>
+      <w:r>
+        <w:rPr>
+          <w:rFonts w:ascii="Calibri" w:hAnsi="Calibri" w:cs="Calibri"/>
+          <w:sz w:val="24"/>
+          <w:szCs w:val="24"/>
+        </w:rPr>
+        <w:t>más</w:t>
+      </w:r>
+      <w:r>
+        <w:rPr>
+          <w:rFonts w:ascii="Calibri" w:hAnsi="Calibri" w:cs="Calibri"/>
+          <w:sz w:val="24"/>
+          <w:szCs w:val="24"/>
+        </w:rPr>
+        <w:t xml:space="preserve"> el ID del dispositivo OBD y el ID del equipo anfitrión así como la fecha de la prueba</w:t>
+      </w:r>
+      <w:r>
+        <w:rPr>
+          <w:rFonts w:ascii="Calibri" w:hAnsi="Calibri" w:cs="Calibri"/>
+          <w:sz w:val="24"/>
+          <w:szCs w:val="24"/>
+        </w:rPr>
+        <w:t>, por lo que cada registro tiene un identificador único sin importar que los registros provengan del mismo vehículo en diferente estación de inspección.</w:t>
+      </w:r>
+      <w:r>
+        <w:rPr>
+          <w:rFonts w:ascii="Calibri" w:hAnsi="Calibri" w:cs="Calibri"/>
+          <w:sz w:val="24"/>
+          <w:szCs w:val="24"/>
+        </w:rPr>
+        <w:t xml:space="preserve">  </w:t>
+      </w:r>
+    </w:p>
+    <w:p>
+      <w:pPr>
+        <w:jc w:val="both"/>
+        <w:rPr>
+          <w:b/>
+          <w:sz w:val="24"/>
+          <w:szCs w:val="24"/>
+        </w:rPr>
+      </w:pPr>
+      <w:r>
+        <w:rPr>
+          <w:b/>
+          <w:sz w:val="24"/>
+          <w:szCs w:val="24"/>
+        </w:rPr>
+        <w:t>Interpretación de lecturas del ECU.</w:t>
+      </w:r>
+    </w:p>
+    <w:p>
+      <w:pPr>
+        <w:jc w:val="both"/>
+        <w:rPr>
+          <w:sz w:val="24"/>
+          <w:szCs w:val="24"/>
+        </w:rPr>
+      </w:pPr>
+      <w:r>
+        <w:rPr>
+          <w:sz w:val="24"/>
+          <w:szCs w:val="24"/>
+        </w:rPr>
+        <w:t>La interpretación de las lecturas del ECU del vehículo inspeccionado se basa en los criterios establecidos por el estándar OBD-II SAE J1979 y la NOM-167-SEMARNAT-2017.</w:t>
+      </w:r>
+    </w:p>
+    <w:p>
+      <w:pPr>
+        <w:jc w:val="both"/>
+        <w:rPr>
+          <w:sz w:val="24"/>
+          <w:szCs w:val="24"/>
+        </w:rPr>
+      </w:pPr>
+      <w:r>
+        <w:rPr>
+          <w:sz w:val="24"/>
+          <w:szCs w:val="24"/>
+        </w:rPr>
+        <w:t>La Sociedad de Ingenieros Automotrices (SAE) definió códigos PID para cada modo de operación bajo el estándar J1939. El fabricante del vehículo no</w:t>
+      </w:r>
+      <w:r>
+        <w:rPr>
+          <w:sz w:val="24"/>
+          <w:szCs w:val="24"/>
+        </w:rPr>
+        <w:t xml:space="preserve"> </w:t>
+      </w:r>
+      <w:r>
+        <w:rPr>
+          <w:sz w:val="24"/>
+          <w:szCs w:val="24"/>
+        </w:rPr>
+        <w:t>está obligado a implementar todos los modos de operación o códigos, y tiene la libertad de añadir sus propios.</w:t>
+      </w:r>
+    </w:p>
+    <w:p>
+      <w:pPr>
+        <w:jc w:val="both"/>
+        <w:rPr>
+          <w:sz w:val="24"/>
+          <w:szCs w:val="24"/>
+        </w:rPr>
+      </w:pPr>
+      <w:r>
+        <w:rPr>
+          <w:sz w:val="24"/>
+          <w:szCs w:val="24"/>
+        </w:rPr>
+        <w:t xml:space="preserve">Los bytes de respuesta </w:t>
+      </w:r>
+      <w:r>
+        <w:rPr>
+          <w:sz w:val="24"/>
+          <w:szCs w:val="24"/>
+        </w:rPr>
+        <w:t xml:space="preserve">del ECU </w:t>
+      </w:r>
+      <w:r>
+        <w:rPr>
+          <w:sz w:val="24"/>
+          <w:szCs w:val="24"/>
+        </w:rPr>
+        <w:t>se representan con las letras A, B, C, etc. A es el byte más significativo. Los bits de cada byte se representan del más significativo</w:t>
+      </w:r>
+      <w:r>
+        <w:rPr>
+          <w:sz w:val="24"/>
+          <w:szCs w:val="24"/>
+        </w:rPr>
+        <w:t xml:space="preserve"> </w:t>
+      </w:r>
+      <w:r>
+        <w:rPr>
+          <w:sz w:val="24"/>
+          <w:szCs w:val="24"/>
+        </w:rPr>
+        <w:t>al menos con los números del 7 al 0</w:t>
+      </w:r>
+      <w:r>
+        <w:rPr>
+          <w:sz w:val="24"/>
+          <w:szCs w:val="24"/>
+        </w:rPr>
+        <w:t>:</w:t>
+      </w:r>
+    </w:p>
+    <w:p>
+      <w:pPr>
+        <w:jc w:val="both"/>
+        <w:rPr>
+          <w:sz w:val="24"/>
+          <w:szCs w:val="24"/>
+        </w:rPr>
+      </w:pPr>
+      <w:r>
+        <w:rPr>
+          <w:sz w:val="24"/>
+          <w:szCs w:val="24"/>
+        </w:rPr>
+        <w:drawing>
+          <wp:inline distT="0" distB="0" distL="0" distR="0" wp14:anchorId="691D1BD9" wp14:editId="1CC249C6">
+            <wp:extent cx="5612130" cy="332740"/>
+            <wp:effectExtent l="0" t="0" r="7620" b="0"/>
+            <wp:docPr id="6" name="Imagen 6"/>
+            <wp:cNvGraphicFramePr>
+              <a:graphicFrameLocks xmlns:a="http://schemas.openxmlformats.org/drawingml/2006/main" noChangeAspect="1"/>
+            </wp:cNvGraphicFramePr>
+            <a:graphic xmlns:a="http://schemas.openxmlformats.org/drawingml/2006/main">
+              <a:graphicData uri="http://schemas.openxmlformats.org/drawingml/2006/picture">
+                <pic:pic xmlns:pic="http://schemas.openxmlformats.org/drawingml/2006/picture">
+                  <pic:nvPicPr>
+                    <pic:cNvPr id="0" name=""/>
+                    <pic:cNvPicPr/>
+                  </pic:nvPicPr>
+                  <pic:blipFill>
+                    <a:blip r:embed="rId11"/>
+                    <a:stretch>
+                      <a:fillRect/>
+                    </a:stretch>
+                  </pic:blipFill>
+                  <pic:spPr>
+                    <a:xfrm>
+                      <a:off x="0" y="0"/>
+                      <a:ext cx="5612130" cy="332740"/>
+                    </a:xfrm>
+                    <a:prstGeom prst="rect">
+                      <a:avLst/>
+                    </a:prstGeom>
+                  </pic:spPr>
+                </pic:pic>
+              </a:graphicData>
+            </a:graphic>
+          </wp:inline>
+        </w:drawing>
+      </w:r>
+    </w:p>
+    <w:p>
+      <w:pPr>
+        <w:jc w:val="both"/>
+        <w:rPr>
+          <w:sz w:val="24"/>
+          <w:szCs w:val="24"/>
+        </w:rPr>
+      </w:pPr>
+    </w:p>
+    <w:p>
+      <w:pPr>
+        <w:jc w:val="both"/>
+        <w:rPr>
+          <w:sz w:val="24"/>
+          <w:szCs w:val="24"/>
+        </w:rPr>
+      </w:pPr>
+      <w:r>
+        <w:rPr>
+          <w:sz w:val="24"/>
+          <w:szCs w:val="24"/>
+        </w:rPr>
+        <w:drawing>
+          <wp:inline distT="0" distB="0" distL="0" distR="0" wp14:anchorId="08188F99" wp14:editId="3149940F">
+            <wp:extent cx="5612130" cy="2971165"/>
+            <wp:effectExtent l="0" t="0" r="7620" b="635"/>
+            <wp:docPr id="4" name="Imagen 4"/>
+            <wp:cNvGraphicFramePr>
+              <a:graphicFrameLocks xmlns:a="http://schemas.openxmlformats.org/drawingml/2006/main" noChangeAspect="1"/>
+            </wp:cNvGraphicFramePr>
+            <a:graphic xmlns:a="http://schemas.openxmlformats.org/drawingml/2006/main">
+              <a:graphicData uri="http://schemas.openxmlformats.org/drawingml/2006/picture">
+                <pic:pic xmlns:pic="http://schemas.openxmlformats.org/drawingml/2006/picture">
+                  <pic:nvPicPr>
+                    <pic:cNvPr id="0" name=""/>
+                    <pic:cNvPicPr/>
+                  </pic:nvPicPr>
+                  <pic:blipFill>
+                    <a:blip r:embed="rId12"/>
+                    <a:stretch>
+                      <a:fillRect/>
+                    </a:stretch>
+                  </pic:blipFill>
+                  <pic:spPr>
+                    <a:xfrm>
+                      <a:off x="0" y="0"/>
+                      <a:ext cx="5612130" cy="2971165"/>
+                    </a:xfrm>
+                    <a:prstGeom prst="rect">
+                      <a:avLst/>
+                    </a:prstGeom>
+                  </pic:spPr>
+                </pic:pic>
+              </a:graphicData>
+            </a:graphic>
+          </wp:inline>
+        </w:drawing>
+      </w:r>
+    </w:p>
+    <w:p>
+      <w:pPr>
+        <w:jc w:val="both"/>
+        <w:rPr>
+          <w:sz w:val="24"/>
+          <w:szCs w:val="24"/>
+        </w:rPr>
+      </w:pPr>
+      <w:r>
+        <w:rPr>
+          <w:sz w:val="24"/>
+          <w:szCs w:val="24"/>
+        </w:rPr>
+        <w:lastRenderedPageBreak/>
+        <w:drawing>
+          <wp:inline distT="0" distB="0" distL="0" distR="0" wp14:anchorId="5852EEE9" wp14:editId="00A44C52">
+            <wp:extent cx="5612130" cy="3371850"/>
+            <wp:effectExtent l="0" t="0" r="7620" b="0"/>
+            <wp:docPr id="5" name="Imagen 5"/>
+            <wp:cNvGraphicFramePr>
+              <a:graphicFrameLocks xmlns:a="http://schemas.openxmlformats.org/drawingml/2006/main" noChangeAspect="1"/>
+            </wp:cNvGraphicFramePr>
+            <a:graphic xmlns:a="http://schemas.openxmlformats.org/drawingml/2006/main">
+              <a:graphicData uri="http://schemas.openxmlformats.org/drawingml/2006/picture">
+                <pic:pic xmlns:pic="http://schemas.openxmlformats.org/drawingml/2006/picture">
+                  <pic:nvPicPr>
+                    <pic:cNvPr id="0" name=""/>
+                    <pic:cNvPicPr/>
+                  </pic:nvPicPr>
+                  <pic:blipFill>
+                    <a:blip r:embed="rId13"/>
+                    <a:stretch>
+                      <a:fillRect/>
+                    </a:stretch>
+                  </pic:blipFill>
+                  <pic:spPr>
+                    <a:xfrm>
+                      <a:off x="0" y="0"/>
+                      <a:ext cx="5612130" cy="3371850"/>
+                    </a:xfrm>
+                    <a:prstGeom prst="rect">
+                      <a:avLst/>
+                    </a:prstGeom>
+                  </pic:spPr>
+                </pic:pic>
+              </a:graphicData>
+            </a:graphic>
+          </wp:inline>
+        </w:drawing>
+      </w:r>
     </w:p>
     <w:p>
       <w:pPr>
@@ -2565,7 +5963,7 @@
                     </pic:cNvPicPr>
                   </pic:nvPicPr>
                   <pic:blipFill>
-                    <a:blip r:embed="rId11">
+                    <a:blip r:embed="rId14">
                       <a:extLst>
                         <a:ext uri="{28A0092B-C50C-407E-A947-70E740481C1C}">
                           <a14:useLocalDpi xmlns:a14="http://schemas.microsoft.com/office/drawing/2010/main" val="0"/>
@@ -2598,8 +5996,8 @@
       </w:r>
     </w:p>
     <w:sectPr>
-      <w:headerReference w:type="default" r:id="rId12"/>
-      <w:footerReference w:type="default" r:id="rId13"/>
+      <w:headerReference w:type="default" r:id="rId15"/>
+      <w:footerReference w:type="default" r:id="rId16"/>
       <w:pgSz w:w="12240" w:h="15840"/>
       <w:pgMar w:top="2268" w:right="1418" w:bottom="1418" w:left="1418" w:header="709" w:footer="709" w:gutter="0"/>
       <w:cols w:space="708"/>
@@ -3267,6 +6665,119 @@
     </w:lvl>
   </w:abstractNum>
   <w:abstractNum w:abstractNumId="4">
+    <w:nsid w:val="04B3097A"/>
+    <w:multiLevelType w:val="hybridMultilevel"/>
+    <w:tmpl w:val="8F842F58"/>
+    <w:lvl w:ilvl="0" w:tplc="080A0001">
+      <w:start w:val="1"/>
+      <w:numFmt w:val="bullet"/>
+      <w:lvlText w:val=""/>
+      <w:lvlJc w:val="left"/>
+      <w:pPr>
+        <w:ind w:left="360" w:hanging="360"/>
+      </w:pPr>
+      <w:rPr>
+        <w:rFonts w:ascii="Symbol" w:hAnsi="Symbol" w:hint="default"/>
+      </w:rPr>
+    </w:lvl>
+    <w:lvl w:ilvl="1" w:tplc="080A0003" w:tentative="1">
+      <w:start w:val="1"/>
+      <w:numFmt w:val="bullet"/>
+      <w:lvlText w:val="o"/>
+      <w:lvlJc w:val="left"/>
+      <w:pPr>
+        <w:ind w:left="1080" w:hanging="360"/>
+      </w:pPr>
+      <w:rPr>
+        <w:rFonts w:ascii="Courier New" w:hAnsi="Courier New" w:cs="Courier New" w:hint="default"/>
+      </w:rPr>
+    </w:lvl>
+    <w:lvl w:ilvl="2" w:tplc="080A0005" w:tentative="1">
+      <w:start w:val="1"/>
+      <w:numFmt w:val="bullet"/>
+      <w:lvlText w:val=""/>
+      <w:lvlJc w:val="left"/>
+      <w:pPr>
+        <w:ind w:left="1800" w:hanging="360"/>
+      </w:pPr>
+      <w:rPr>
+        <w:rFonts w:ascii="Wingdings" w:hAnsi="Wingdings" w:hint="default"/>
+      </w:rPr>
+    </w:lvl>
+    <w:lvl w:ilvl="3" w:tplc="080A0001" w:tentative="1">
+      <w:start w:val="1"/>
+      <w:numFmt w:val="bullet"/>
+      <w:lvlText w:val=""/>
+      <w:lvlJc w:val="left"/>
+      <w:pPr>
+        <w:ind w:left="2520" w:hanging="360"/>
+      </w:pPr>
+      <w:rPr>
+        <w:rFonts w:ascii="Symbol" w:hAnsi="Symbol" w:hint="default"/>
+      </w:rPr>
+    </w:lvl>
+    <w:lvl w:ilvl="4" w:tplc="080A0003" w:tentative="1">
+      <w:start w:val="1"/>
+      <w:numFmt w:val="bullet"/>
+      <w:lvlText w:val="o"/>
+      <w:lvlJc w:val="left"/>
+      <w:pPr>
+        <w:ind w:left="3240" w:hanging="360"/>
+      </w:pPr>
+      <w:rPr>
+        <w:rFonts w:ascii="Courier New" w:hAnsi="Courier New" w:cs="Courier New" w:hint="default"/>
+      </w:rPr>
+    </w:lvl>
+    <w:lvl w:ilvl="5" w:tplc="080A0005" w:tentative="1">
+      <w:start w:val="1"/>
+      <w:numFmt w:val="bullet"/>
+      <w:lvlText w:val=""/>
+      <w:lvlJc w:val="left"/>
+      <w:pPr>
+        <w:ind w:left="3960" w:hanging="360"/>
+      </w:pPr>
+      <w:rPr>
+        <w:rFonts w:ascii="Wingdings" w:hAnsi="Wingdings" w:hint="default"/>
+      </w:rPr>
+    </w:lvl>
+    <w:lvl w:ilvl="6" w:tplc="080A0001" w:tentative="1">
+      <w:start w:val="1"/>
+      <w:numFmt w:val="bullet"/>
+      <w:lvlText w:val=""/>
+      <w:lvlJc w:val="left"/>
+      <w:pPr>
+        <w:ind w:left="4680" w:hanging="360"/>
+      </w:pPr>
+      <w:rPr>
+        <w:rFonts w:ascii="Symbol" w:hAnsi="Symbol" w:hint="default"/>
+      </w:rPr>
+    </w:lvl>
+    <w:lvl w:ilvl="7" w:tplc="080A0003" w:tentative="1">
+      <w:start w:val="1"/>
+      <w:numFmt w:val="bullet"/>
+      <w:lvlText w:val="o"/>
+      <w:lvlJc w:val="left"/>
+      <w:pPr>
+        <w:ind w:left="5400" w:hanging="360"/>
+      </w:pPr>
+      <w:rPr>
+        <w:rFonts w:ascii="Courier New" w:hAnsi="Courier New" w:cs="Courier New" w:hint="default"/>
+      </w:rPr>
+    </w:lvl>
+    <w:lvl w:ilvl="8" w:tplc="080A0005" w:tentative="1">
+      <w:start w:val="1"/>
+      <w:numFmt w:val="bullet"/>
+      <w:lvlText w:val=""/>
+      <w:lvlJc w:val="left"/>
+      <w:pPr>
+        <w:ind w:left="6120" w:hanging="360"/>
+      </w:pPr>
+      <w:rPr>
+        <w:rFonts w:ascii="Wingdings" w:hAnsi="Wingdings" w:hint="default"/>
+      </w:rPr>
+    </w:lvl>
+  </w:abstractNum>
+  <w:abstractNum w:abstractNumId="5">
     <w:nsid w:val="04FC7173"/>
     <w:multiLevelType w:val="hybridMultilevel"/>
     <w:tmpl w:val="12803CB6"/>
@@ -3379,7 +6890,7 @@
       </w:rPr>
     </w:lvl>
   </w:abstractNum>
-  <w:abstractNum w:abstractNumId="5">
+  <w:abstractNum w:abstractNumId="6">
     <w:nsid w:val="10B766D9"/>
     <w:multiLevelType w:val="multilevel"/>
     <w:tmpl w:val="3606F11E"/>
@@ -3494,7 +7005,7 @@
       </w:rPr>
     </w:lvl>
   </w:abstractNum>
-  <w:abstractNum w:abstractNumId="6">
+  <w:abstractNum w:abstractNumId="7">
     <w:nsid w:val="17EF5B77"/>
     <w:multiLevelType w:val="hybridMultilevel"/>
     <w:tmpl w:val="7D44F952"/>
@@ -3607,7 +7118,7 @@
       </w:rPr>
     </w:lvl>
   </w:abstractNum>
-  <w:abstractNum w:abstractNumId="7">
+  <w:abstractNum w:abstractNumId="8">
     <w:nsid w:val="181509F8"/>
     <w:multiLevelType w:val="hybridMultilevel"/>
     <w:tmpl w:val="40AC61BA"/>
@@ -3720,7 +7231,7 @@
       </w:rPr>
     </w:lvl>
   </w:abstractNum>
-  <w:abstractNum w:abstractNumId="8">
+  <w:abstractNum w:abstractNumId="9">
     <w:nsid w:val="195A4F5F"/>
     <w:multiLevelType w:val="hybridMultilevel"/>
     <w:tmpl w:val="501EEBA8"/>
@@ -3809,7 +7320,7 @@
       </w:pPr>
     </w:lvl>
   </w:abstractNum>
-  <w:abstractNum w:abstractNumId="9">
+  <w:abstractNum w:abstractNumId="10">
     <w:nsid w:val="1A5A1ABC"/>
     <w:multiLevelType w:val="hybridMultilevel"/>
     <w:tmpl w:val="A6C2F3A0"/>
@@ -3922,7 +7433,7 @@
       </w:rPr>
     </w:lvl>
   </w:abstractNum>
-  <w:abstractNum w:abstractNumId="10">
+  <w:abstractNum w:abstractNumId="11">
     <w:nsid w:val="1CAB05F8"/>
     <w:multiLevelType w:val="multilevel"/>
     <w:tmpl w:val="4BCA035A"/>
@@ -4048,7 +7559,7 @@
       </w:rPr>
     </w:lvl>
   </w:abstractNum>
-  <w:abstractNum w:abstractNumId="11">
+  <w:abstractNum w:abstractNumId="12">
     <w:nsid w:val="1DCC59BA"/>
     <w:multiLevelType w:val="hybridMultilevel"/>
     <w:tmpl w:val="E7F64E38"/>
@@ -4161,7 +7672,7 @@
       </w:rPr>
     </w:lvl>
   </w:abstractNum>
-  <w:abstractNum w:abstractNumId="12">
+  <w:abstractNum w:abstractNumId="13">
     <w:nsid w:val="21660F6C"/>
     <w:multiLevelType w:val="multilevel"/>
     <w:tmpl w:val="A9A6C9C6"/>
@@ -4275,7 +7786,7 @@
       </w:rPr>
     </w:lvl>
   </w:abstractNum>
-  <w:abstractNum w:abstractNumId="13">
+  <w:abstractNum w:abstractNumId="14">
     <w:nsid w:val="289C2629"/>
     <w:multiLevelType w:val="hybridMultilevel"/>
     <w:tmpl w:val="641AD828"/>
@@ -4388,7 +7899,7 @@
       </w:rPr>
     </w:lvl>
   </w:abstractNum>
-  <w:abstractNum w:abstractNumId="14">
+  <w:abstractNum w:abstractNumId="15">
     <w:nsid w:val="327A309A"/>
     <w:multiLevelType w:val="hybridMultilevel"/>
     <w:tmpl w:val="7E5AABAC"/>
@@ -4501,7 +8012,7 @@
       </w:rPr>
     </w:lvl>
   </w:abstractNum>
-  <w:abstractNum w:abstractNumId="15">
+  <w:abstractNum w:abstractNumId="16">
     <w:nsid w:val="37D63CDA"/>
     <w:multiLevelType w:val="hybridMultilevel"/>
     <w:tmpl w:val="19846078"/>
@@ -4614,7 +8125,7 @@
       </w:rPr>
     </w:lvl>
   </w:abstractNum>
-  <w:abstractNum w:abstractNumId="16">
+  <w:abstractNum w:abstractNumId="17">
     <w:nsid w:val="4052455A"/>
     <w:multiLevelType w:val="singleLevel"/>
     <w:tmpl w:val="9C82D766"/>
@@ -4634,7 +8145,7 @@
       </w:rPr>
     </w:lvl>
   </w:abstractNum>
-  <w:abstractNum w:abstractNumId="17">
+  <w:abstractNum w:abstractNumId="18">
     <w:nsid w:val="46486C12"/>
     <w:multiLevelType w:val="hybridMultilevel"/>
     <w:tmpl w:val="64187D12"/>
@@ -4723,7 +8234,7 @@
       </w:pPr>
     </w:lvl>
   </w:abstractNum>
-  <w:abstractNum w:abstractNumId="18">
+  <w:abstractNum w:abstractNumId="19">
     <w:nsid w:val="4790322A"/>
     <w:multiLevelType w:val="hybridMultilevel"/>
     <w:tmpl w:val="4CB06DC0"/>
@@ -4836,7 +8347,7 @@
       </w:rPr>
     </w:lvl>
   </w:abstractNum>
-  <w:abstractNum w:abstractNumId="19">
+  <w:abstractNum w:abstractNumId="20">
     <w:nsid w:val="4E055363"/>
     <w:multiLevelType w:val="hybridMultilevel"/>
     <w:tmpl w:val="25662F64"/>
@@ -4949,7 +8460,7 @@
       </w:rPr>
     </w:lvl>
   </w:abstractNum>
-  <w:abstractNum w:abstractNumId="20">
+  <w:abstractNum w:abstractNumId="21">
     <w:nsid w:val="52484A71"/>
     <w:multiLevelType w:val="hybridMultilevel"/>
     <w:tmpl w:val="188AC498"/>
@@ -5038,7 +8549,7 @@
       </w:pPr>
     </w:lvl>
   </w:abstractNum>
-  <w:abstractNum w:abstractNumId="21">
+  <w:abstractNum w:abstractNumId="22">
     <w:nsid w:val="61BB1171"/>
     <w:multiLevelType w:val="hybridMultilevel"/>
     <w:tmpl w:val="91C00138"/>
@@ -5151,7 +8662,7 @@
       </w:rPr>
     </w:lvl>
   </w:abstractNum>
-  <w:abstractNum w:abstractNumId="22">
+  <w:abstractNum w:abstractNumId="23">
     <w:nsid w:val="621B775E"/>
     <w:multiLevelType w:val="multilevel"/>
     <w:tmpl w:val="C284C004"/>
@@ -5273,7 +8784,7 @@
       </w:rPr>
     </w:lvl>
   </w:abstractNum>
-  <w:abstractNum w:abstractNumId="23">
+  <w:abstractNum w:abstractNumId="24">
     <w:nsid w:val="63352628"/>
     <w:multiLevelType w:val="hybridMultilevel"/>
     <w:tmpl w:val="EA72C3F4"/>
@@ -5362,7 +8873,7 @@
       </w:pPr>
     </w:lvl>
   </w:abstractNum>
-  <w:abstractNum w:abstractNumId="24">
+  <w:abstractNum w:abstractNumId="25">
     <w:nsid w:val="6AF207E0"/>
     <w:multiLevelType w:val="hybridMultilevel"/>
     <w:tmpl w:val="7F183D3C"/>
@@ -5475,7 +8986,7 @@
       </w:rPr>
     </w:lvl>
   </w:abstractNum>
-  <w:abstractNum w:abstractNumId="25">
+  <w:abstractNum w:abstractNumId="26">
     <w:nsid w:val="6B3524A9"/>
     <w:multiLevelType w:val="hybridMultilevel"/>
     <w:tmpl w:val="26248BBE"/>
@@ -5588,7 +9099,7 @@
       </w:rPr>
     </w:lvl>
   </w:abstractNum>
-  <w:abstractNum w:abstractNumId="26">
+  <w:abstractNum w:abstractNumId="27">
     <w:nsid w:val="6C9B418C"/>
     <w:multiLevelType w:val="multilevel"/>
     <w:tmpl w:val="3A9C015C"/>
@@ -5702,7 +9213,7 @@
       </w:rPr>
     </w:lvl>
   </w:abstractNum>
-  <w:abstractNum w:abstractNumId="27">
+  <w:abstractNum w:abstractNumId="28">
     <w:nsid w:val="6F254021"/>
     <w:multiLevelType w:val="multilevel"/>
     <w:tmpl w:val="FFD63982"/>
@@ -5816,7 +9327,7 @@
       </w:rPr>
     </w:lvl>
   </w:abstractNum>
-  <w:abstractNum w:abstractNumId="28">
+  <w:abstractNum w:abstractNumId="29">
     <w:nsid w:val="7109351B"/>
     <w:multiLevelType w:val="hybridMultilevel"/>
     <w:tmpl w:val="C6C4D1D6"/>
@@ -5929,7 +9440,7 @@
       </w:rPr>
     </w:lvl>
   </w:abstractNum>
-  <w:abstractNum w:abstractNumId="29">
+  <w:abstractNum w:abstractNumId="30">
     <w:nsid w:val="73875043"/>
     <w:multiLevelType w:val="hybridMultilevel"/>
     <w:tmpl w:val="003A0D48"/>
@@ -6042,7 +9553,7 @@
       </w:rPr>
     </w:lvl>
   </w:abstractNum>
-  <w:abstractNum w:abstractNumId="30">
+  <w:abstractNum w:abstractNumId="31">
     <w:nsid w:val="76335687"/>
     <w:multiLevelType w:val="hybridMultilevel"/>
     <w:tmpl w:val="9BD6F4E0"/>
@@ -6155,7 +9666,7 @@
       </w:rPr>
     </w:lvl>
   </w:abstractNum>
-  <w:abstractNum w:abstractNumId="31">
+  <w:abstractNum w:abstractNumId="32">
     <w:nsid w:val="773F7E4C"/>
     <w:multiLevelType w:val="hybridMultilevel"/>
     <w:tmpl w:val="F620D19C"/>
@@ -6268,7 +9779,7 @@
       </w:rPr>
     </w:lvl>
   </w:abstractNum>
-  <w:abstractNum w:abstractNumId="32">
+  <w:abstractNum w:abstractNumId="33">
     <w:nsid w:val="77A4325B"/>
     <w:multiLevelType w:val="singleLevel"/>
     <w:tmpl w:val="14F6A31A"/>
@@ -6288,7 +9799,233 @@
       </w:rPr>
     </w:lvl>
   </w:abstractNum>
-  <w:abstractNum w:abstractNumId="33">
+  <w:abstractNum w:abstractNumId="34">
+    <w:nsid w:val="789837B2"/>
+    <w:multiLevelType w:val="hybridMultilevel"/>
+    <w:tmpl w:val="DD86F908"/>
+    <w:lvl w:ilvl="0" w:tplc="080A0001">
+      <w:start w:val="1"/>
+      <w:numFmt w:val="bullet"/>
+      <w:lvlText w:val=""/>
+      <w:lvlJc w:val="left"/>
+      <w:pPr>
+        <w:ind w:left="360" w:hanging="360"/>
+      </w:pPr>
+      <w:rPr>
+        <w:rFonts w:ascii="Symbol" w:hAnsi="Symbol" w:hint="default"/>
+      </w:rPr>
+    </w:lvl>
+    <w:lvl w:ilvl="1" w:tplc="080A0003" w:tentative="1">
+      <w:start w:val="1"/>
+      <w:numFmt w:val="bullet"/>
+      <w:lvlText w:val="o"/>
+      <w:lvlJc w:val="left"/>
+      <w:pPr>
+        <w:ind w:left="1080" w:hanging="360"/>
+      </w:pPr>
+      <w:rPr>
+        <w:rFonts w:ascii="Courier New" w:hAnsi="Courier New" w:cs="Courier New" w:hint="default"/>
+      </w:rPr>
+    </w:lvl>
+    <w:lvl w:ilvl="2" w:tplc="080A0005" w:tentative="1">
+      <w:start w:val="1"/>
+      <w:numFmt w:val="bullet"/>
+      <w:lvlText w:val=""/>
+      <w:lvlJc w:val="left"/>
+      <w:pPr>
+        <w:ind w:left="1800" w:hanging="360"/>
+      </w:pPr>
+      <w:rPr>
+        <w:rFonts w:ascii="Wingdings" w:hAnsi="Wingdings" w:hint="default"/>
+      </w:rPr>
+    </w:lvl>
+    <w:lvl w:ilvl="3" w:tplc="080A0001" w:tentative="1">
+      <w:start w:val="1"/>
+      <w:numFmt w:val="bullet"/>
+      <w:lvlText w:val=""/>
+      <w:lvlJc w:val="left"/>
+      <w:pPr>
+        <w:ind w:left="2520" w:hanging="360"/>
+      </w:pPr>
+      <w:rPr>
+        <w:rFonts w:ascii="Symbol" w:hAnsi="Symbol" w:hint="default"/>
+      </w:rPr>
+    </w:lvl>
+    <w:lvl w:ilvl="4" w:tplc="080A0003" w:tentative="1">
+      <w:start w:val="1"/>
+      <w:numFmt w:val="bullet"/>
+      <w:lvlText w:val="o"/>
+      <w:lvlJc w:val="left"/>
+      <w:pPr>
+        <w:ind w:left="3240" w:hanging="360"/>
+      </w:pPr>
+      <w:rPr>
+        <w:rFonts w:ascii="Courier New" w:hAnsi="Courier New" w:cs="Courier New" w:hint="default"/>
+      </w:rPr>
+    </w:lvl>
+    <w:lvl w:ilvl="5" w:tplc="080A0005" w:tentative="1">
+      <w:start w:val="1"/>
+      <w:numFmt w:val="bullet"/>
+      <w:lvlText w:val=""/>
+      <w:lvlJc w:val="left"/>
+      <w:pPr>
+        <w:ind w:left="3960" w:hanging="360"/>
+      </w:pPr>
+      <w:rPr>
+        <w:rFonts w:ascii="Wingdings" w:hAnsi="Wingdings" w:hint="default"/>
+      </w:rPr>
+    </w:lvl>
+    <w:lvl w:ilvl="6" w:tplc="080A0001" w:tentative="1">
+      <w:start w:val="1"/>
+      <w:numFmt w:val="bullet"/>
+      <w:lvlText w:val=""/>
+      <w:lvlJc w:val="left"/>
+      <w:pPr>
+        <w:ind w:left="4680" w:hanging="360"/>
+      </w:pPr>
+      <w:rPr>
+        <w:rFonts w:ascii="Symbol" w:hAnsi="Symbol" w:hint="default"/>
+      </w:rPr>
+    </w:lvl>
+    <w:lvl w:ilvl="7" w:tplc="080A0003" w:tentative="1">
+      <w:start w:val="1"/>
+      <w:numFmt w:val="bullet"/>
+      <w:lvlText w:val="o"/>
+      <w:lvlJc w:val="left"/>
+      <w:pPr>
+        <w:ind w:left="5400" w:hanging="360"/>
+      </w:pPr>
+      <w:rPr>
+        <w:rFonts w:ascii="Courier New" w:hAnsi="Courier New" w:cs="Courier New" w:hint="default"/>
+      </w:rPr>
+    </w:lvl>
+    <w:lvl w:ilvl="8" w:tplc="080A0005" w:tentative="1">
+      <w:start w:val="1"/>
+      <w:numFmt w:val="bullet"/>
+      <w:lvlText w:val=""/>
+      <w:lvlJc w:val="left"/>
+      <w:pPr>
+        <w:ind w:left="6120" w:hanging="360"/>
+      </w:pPr>
+      <w:rPr>
+        <w:rFonts w:ascii="Wingdings" w:hAnsi="Wingdings" w:hint="default"/>
+      </w:rPr>
+    </w:lvl>
+  </w:abstractNum>
+  <w:abstractNum w:abstractNumId="35">
+    <w:nsid w:val="7ABE23EB"/>
+    <w:multiLevelType w:val="hybridMultilevel"/>
+    <w:tmpl w:val="29B8FBD6"/>
+    <w:lvl w:ilvl="0" w:tplc="080A0001">
+      <w:start w:val="1"/>
+      <w:numFmt w:val="bullet"/>
+      <w:lvlText w:val=""/>
+      <w:lvlJc w:val="left"/>
+      <w:pPr>
+        <w:ind w:left="360" w:hanging="360"/>
+      </w:pPr>
+      <w:rPr>
+        <w:rFonts w:ascii="Symbol" w:hAnsi="Symbol" w:hint="default"/>
+      </w:rPr>
+    </w:lvl>
+    <w:lvl w:ilvl="1" w:tplc="080A0003" w:tentative="1">
+      <w:start w:val="1"/>
+      <w:numFmt w:val="bullet"/>
+      <w:lvlText w:val="o"/>
+      <w:lvlJc w:val="left"/>
+      <w:pPr>
+        <w:ind w:left="1080" w:hanging="360"/>
+      </w:pPr>
+      <w:rPr>
+        <w:rFonts w:ascii="Courier New" w:hAnsi="Courier New" w:cs="Courier New" w:hint="default"/>
+      </w:rPr>
+    </w:lvl>
+    <w:lvl w:ilvl="2" w:tplc="080A0005" w:tentative="1">
+      <w:start w:val="1"/>
+      <w:numFmt w:val="bullet"/>
+      <w:lvlText w:val=""/>
+      <w:lvlJc w:val="left"/>
+      <w:pPr>
+        <w:ind w:left="1800" w:hanging="360"/>
+      </w:pPr>
+      <w:rPr>
+        <w:rFonts w:ascii="Wingdings" w:hAnsi="Wingdings" w:hint="default"/>
+      </w:rPr>
+    </w:lvl>
+    <w:lvl w:ilvl="3" w:tplc="080A0001" w:tentative="1">
+      <w:start w:val="1"/>
+      <w:numFmt w:val="bullet"/>
+      <w:lvlText w:val=""/>
+      <w:lvlJc w:val="left"/>
+      <w:pPr>
+        <w:ind w:left="2520" w:hanging="360"/>
+      </w:pPr>
+      <w:rPr>
+        <w:rFonts w:ascii="Symbol" w:hAnsi="Symbol" w:hint="default"/>
+      </w:rPr>
+    </w:lvl>
+    <w:lvl w:ilvl="4" w:tplc="080A0003" w:tentative="1">
+      <w:start w:val="1"/>
+      <w:numFmt w:val="bullet"/>
+      <w:lvlText w:val="o"/>
+      <w:lvlJc w:val="left"/>
+      <w:pPr>
+        <w:ind w:left="3240" w:hanging="360"/>
+      </w:pPr>
+      <w:rPr>
+        <w:rFonts w:ascii="Courier New" w:hAnsi="Courier New" w:cs="Courier New" w:hint="default"/>
+      </w:rPr>
+    </w:lvl>
+    <w:lvl w:ilvl="5" w:tplc="080A0005" w:tentative="1">
+      <w:start w:val="1"/>
+      <w:numFmt w:val="bullet"/>
+      <w:lvlText w:val=""/>
+      <w:lvlJc w:val="left"/>
+      <w:pPr>
+        <w:ind w:left="3960" w:hanging="360"/>
+      </w:pPr>
+      <w:rPr>
+        <w:rFonts w:ascii="Wingdings" w:hAnsi="Wingdings" w:hint="default"/>
+      </w:rPr>
+    </w:lvl>
+    <w:lvl w:ilvl="6" w:tplc="080A0001" w:tentative="1">
+      <w:start w:val="1"/>
+      <w:numFmt w:val="bullet"/>
+      <w:lvlText w:val=""/>
+      <w:lvlJc w:val="left"/>
+      <w:pPr>
+        <w:ind w:left="4680" w:hanging="360"/>
+      </w:pPr>
+      <w:rPr>
+        <w:rFonts w:ascii="Symbol" w:hAnsi="Symbol" w:hint="default"/>
+      </w:rPr>
+    </w:lvl>
+    <w:lvl w:ilvl="7" w:tplc="080A0003" w:tentative="1">
+      <w:start w:val="1"/>
+      <w:numFmt w:val="bullet"/>
+      <w:lvlText w:val="o"/>
+      <w:lvlJc w:val="left"/>
+      <w:pPr>
+        <w:ind w:left="5400" w:hanging="360"/>
+      </w:pPr>
+      <w:rPr>
+        <w:rFonts w:ascii="Courier New" w:hAnsi="Courier New" w:cs="Courier New" w:hint="default"/>
+      </w:rPr>
+    </w:lvl>
+    <w:lvl w:ilvl="8" w:tplc="080A0005" w:tentative="1">
+      <w:start w:val="1"/>
+      <w:numFmt w:val="bullet"/>
+      <w:lvlText w:val=""/>
+      <w:lvlJc w:val="left"/>
+      <w:pPr>
+        <w:ind w:left="6120" w:hanging="360"/>
+      </w:pPr>
+      <w:rPr>
+        <w:rFonts w:ascii="Wingdings" w:hAnsi="Wingdings" w:hint="default"/>
+      </w:rPr>
+    </w:lvl>
+  </w:abstractNum>
+  <w:abstractNum w:abstractNumId="36">
     <w:nsid w:val="7BF37E2E"/>
     <w:multiLevelType w:val="hybridMultilevel"/>
     <w:tmpl w:val="0B46CE84"/>
@@ -6405,103 +10142,112 @@
     <w:abstractNumId w:val="0"/>
   </w:num>
   <w:num w:numId="2">
+    <w:abstractNumId w:val="8"/>
+  </w:num>
+  <w:num w:numId="3">
+    <w:abstractNumId w:val="12"/>
+  </w:num>
+  <w:num w:numId="4">
     <w:abstractNumId w:val="7"/>
   </w:num>
-  <w:num w:numId="3">
-    <w:abstractNumId w:val="11"/>
-  </w:num>
-  <w:num w:numId="4">
-    <w:abstractNumId w:val="6"/>
-  </w:num>
   <w:num w:numId="5">
-    <w:abstractNumId w:val="21"/>
+    <w:abstractNumId w:val="22"/>
   </w:num>
   <w:num w:numId="6">
-    <w:abstractNumId w:val="33"/>
+    <w:abstractNumId w:val="36"/>
   </w:num>
   <w:num w:numId="7">
-    <w:abstractNumId w:val="25"/>
+    <w:abstractNumId w:val="26"/>
   </w:num>
   <w:num w:numId="8">
-    <w:abstractNumId w:val="15"/>
+    <w:abstractNumId w:val="16"/>
   </w:num>
   <w:num w:numId="9">
     <w:abstractNumId w:val="3"/>
   </w:num>
   <w:num w:numId="10">
-    <w:abstractNumId w:val="8"/>
+    <w:abstractNumId w:val="9"/>
   </w:num>
   <w:num w:numId="11">
-    <w:abstractNumId w:val="28"/>
+    <w:abstractNumId w:val="29"/>
   </w:num>
   <w:num w:numId="12">
-    <w:abstractNumId w:val="29"/>
+    <w:abstractNumId w:val="30"/>
   </w:num>
   <w:num w:numId="13">
-    <w:abstractNumId w:val="31"/>
+    <w:abstractNumId w:val="32"/>
   </w:num>
   <w:num w:numId="14">
-    <w:abstractNumId w:val="17"/>
+    <w:abstractNumId w:val="18"/>
   </w:num>
   <w:num w:numId="15">
+    <w:abstractNumId w:val="21"/>
+  </w:num>
+  <w:num w:numId="16">
+    <w:abstractNumId w:val="24"/>
+  </w:num>
+  <w:num w:numId="17">
+    <w:abstractNumId w:val="19"/>
+  </w:num>
+  <w:num w:numId="18">
     <w:abstractNumId w:val="20"/>
   </w:num>
-  <w:num w:numId="16">
+  <w:num w:numId="19">
+    <w:abstractNumId w:val="11"/>
+  </w:num>
+  <w:num w:numId="20">
     <w:abstractNumId w:val="23"/>
   </w:num>
-  <w:num w:numId="17">
-    <w:abstractNumId w:val="18"/>
+  <w:num w:numId="21">
+    <w:abstractNumId w:val="13"/>
   </w:num>
-  <w:num w:numId="18">
-    <w:abstractNumId w:val="19"/>
+  <w:num w:numId="22">
+    <w:abstractNumId w:val="6"/>
   </w:num>
-  <w:num w:numId="19">
+  <w:num w:numId="23">
+    <w:abstractNumId w:val="15"/>
+  </w:num>
+  <w:num w:numId="24">
     <w:abstractNumId w:val="10"/>
   </w:num>
-  <w:num w:numId="20">
-    <w:abstractNumId w:val="22"/>
-  </w:num>
-  <w:num w:numId="21">
-    <w:abstractNumId w:val="12"/>
-  </w:num>
-  <w:num w:numId="22">
-    <w:abstractNumId w:val="5"/>
-  </w:num>
-  <w:num w:numId="23">
-    <w:abstractNumId w:val="14"/>
-  </w:num>
-  <w:num w:numId="24">
-    <w:abstractNumId w:val="9"/>
-  </w:num>
   <w:num w:numId="25">
-    <w:abstractNumId w:val="26"/>
+    <w:abstractNumId w:val="27"/>
   </w:num>
   <w:num w:numId="26">
-    <w:abstractNumId w:val="27"/>
+    <w:abstractNumId w:val="28"/>
   </w:num>
   <w:num w:numId="27">
     <w:abstractNumId w:val="1"/>
   </w:num>
   <w:num w:numId="28">
-    <w:abstractNumId w:val="13"/>
+    <w:abstractNumId w:val="14"/>
   </w:num>
   <w:num w:numId="29">
-    <w:abstractNumId w:val="4"/>
+    <w:abstractNumId w:val="5"/>
   </w:num>
   <w:num w:numId="30">
-    <w:abstractNumId w:val="30"/>
+    <w:abstractNumId w:val="31"/>
   </w:num>
   <w:num w:numId="31">
     <w:abstractNumId w:val="2"/>
   </w:num>
   <w:num w:numId="32">
-    <w:abstractNumId w:val="16"/>
+    <w:abstractNumId w:val="17"/>
   </w:num>
   <w:num w:numId="33">
-    <w:abstractNumId w:val="32"/>
+    <w:abstractNumId w:val="33"/>
   </w:num>
   <w:num w:numId="34">
-    <w:abstractNumId w:val="24"/>
+    <w:abstractNumId w:val="25"/>
+  </w:num>
+  <w:num w:numId="35">
+    <w:abstractNumId w:val="34"/>
+  </w:num>
+  <w:num w:numId="36">
+    <w:abstractNumId w:val="35"/>
+  </w:num>
+  <w:num w:numId="37">
+    <w:abstractNumId w:val="4"/>
   </w:num>
 </w:numbering>
 </file>
@@ -8092,7 +11838,7 @@
 </file>
 
 <file path=customXml/itemProps1.xml><?xml version="1.0" encoding="utf-8"?>
-<ds:datastoreItem xmlns:ds="http://schemas.openxmlformats.org/officeDocument/2006/customXml" ds:itemID="{8A1269D8-7020-42E8-A78E-C069869255BB}">
+<ds:datastoreItem xmlns:ds="http://schemas.openxmlformats.org/officeDocument/2006/customXml" ds:itemID="{96DDCA91-4842-4283-BB74-C88B3EB221E4}">
   <ds:schemaRefs>
     <ds:schemaRef ds:uri="http://schemas.openxmlformats.org/officeDocument/2006/bibliography"/>
   </ds:schemaRefs>

</xml_diff>

<commit_message>
+ Validación de RPM's para detectar simulador de OBD
</commit_message>
<xml_diff>
--- a/OpusIMCleanOBD_061125.docx
+++ b/OpusIMCleanOBD_061125.docx
@@ -335,14 +335,7 @@
           <w:sz w:val="24"/>
           <w:szCs w:val="24"/>
         </w:rPr>
-        <w:t>OpusIMCleanOBDdrv.dll</w:t>
-      </w:r>
-      <w:r>
-        <w:rPr>
-          <w:sz w:val="24"/>
-          <w:szCs w:val="24"/>
-        </w:rPr>
-        <w:t xml:space="preserve">” es una </w:t>
+        <w:t xml:space="preserve">OpusIMCleanOBDdrv.dll” es una </w:t>
       </w:r>
       <w:r>
         <w:rPr>
@@ -464,8 +457,6 @@
               </w:rPr>
               <w:t>Driver de operación del dispositivo.</w:t>
             </w:r>
-            <w:bookmarkStart w:id="0" w:name="_GoBack"/>
-            <w:bookmarkEnd w:id="0"/>
           </w:p>
         </w:tc>
       </w:tr>
@@ -733,6 +724,122 @@
         </w:tc>
       </w:tr>
     </w:tbl>
+    <w:p>
+      <w:pPr>
+        <w:jc w:val="both"/>
+        <w:rPr>
+          <w:sz w:val="24"/>
+          <w:szCs w:val="24"/>
+        </w:rPr>
+      </w:pPr>
+    </w:p>
+    <w:p>
+      <w:pPr>
+        <w:rPr>
+          <w:sz w:val="24"/>
+          <w:szCs w:val="24"/>
+        </w:rPr>
+      </w:pPr>
+    </w:p>
+    <w:p>
+      <w:pPr>
+        <w:rPr>
+          <w:sz w:val="24"/>
+          <w:szCs w:val="24"/>
+        </w:rPr>
+      </w:pPr>
+    </w:p>
+    <w:p>
+      <w:pPr>
+        <w:rPr>
+          <w:sz w:val="24"/>
+          <w:szCs w:val="24"/>
+        </w:rPr>
+      </w:pPr>
+    </w:p>
+    <w:p>
+      <w:pPr>
+        <w:rPr>
+          <w:b/>
+          <w:sz w:val="24"/>
+          <w:szCs w:val="24"/>
+        </w:rPr>
+      </w:pPr>
+      <w:r>
+        <w:rPr>
+          <w:b/>
+          <w:sz w:val="24"/>
+          <w:szCs w:val="24"/>
+        </w:rPr>
+        <w:lastRenderedPageBreak/>
+        <w:t>Flujo de aplicación de</w:t>
+      </w:r>
+      <w:r>
+        <w:rPr>
+          <w:b/>
+          <w:sz w:val="24"/>
+          <w:szCs w:val="24"/>
+        </w:rPr>
+        <w:t>l DLL en</w:t>
+      </w:r>
+      <w:r>
+        <w:rPr>
+          <w:b/>
+          <w:sz w:val="24"/>
+          <w:szCs w:val="24"/>
+        </w:rPr>
+        <w:t xml:space="preserve"> prueba OBD.</w:t>
+      </w:r>
+    </w:p>
+    <w:p>
+      <w:pPr>
+        <w:jc w:val="both"/>
+      </w:pPr>
+    </w:p>
+    <w:p>
+      <w:pPr>
+        <w:jc w:val="both"/>
+      </w:pPr>
+      <w:r>
+        <w:drawing>
+          <wp:inline distT="0" distB="0" distL="0" distR="0" wp14:anchorId="4C57CBF2" wp14:editId="5F37E212">
+            <wp:extent cx="5525271" cy="5725324"/>
+            <wp:effectExtent l="0" t="0" r="0" b="8890"/>
+            <wp:docPr id="7" name="Imagen 7"/>
+            <wp:cNvGraphicFramePr>
+              <a:graphicFrameLocks xmlns:a="http://schemas.openxmlformats.org/drawingml/2006/main" noChangeAspect="1"/>
+            </wp:cNvGraphicFramePr>
+            <a:graphic xmlns:a="http://schemas.openxmlformats.org/drawingml/2006/main">
+              <a:graphicData uri="http://schemas.openxmlformats.org/drawingml/2006/picture">
+                <pic:pic xmlns:pic="http://schemas.openxmlformats.org/drawingml/2006/picture">
+                  <pic:nvPicPr>
+                    <pic:cNvPr id="0" name=""/>
+                    <pic:cNvPicPr/>
+                  </pic:nvPicPr>
+                  <pic:blipFill>
+                    <a:blip r:embed="rId10"/>
+                    <a:stretch>
+                      <a:fillRect/>
+                    </a:stretch>
+                  </pic:blipFill>
+                  <pic:spPr>
+                    <a:xfrm>
+                      <a:off x="0" y="0"/>
+                      <a:ext cx="5525271" cy="5725324"/>
+                    </a:xfrm>
+                    <a:prstGeom prst="rect">
+                      <a:avLst/>
+                    </a:prstGeom>
+                  </pic:spPr>
+                </pic:pic>
+              </a:graphicData>
+            </a:graphic>
+          </wp:inline>
+        </w:drawing>
+      </w:r>
+      <w:bookmarkStart w:id="0" w:name="_GoBack"/>
+      <w:bookmarkEnd w:id="0"/>
+    </w:p>
     <w:p>
       <w:pPr>
         <w:jc w:val="both"/>
@@ -1763,7 +1870,7 @@
               </w:rPr>
               <w:t xml:space="preserve">” al correo </w:t>
             </w:r>
-            <w:hyperlink r:id="rId10" w:history="1">
+            <w:hyperlink r:id="rId11" w:history="1">
               <w:r>
                 <w:rPr>
                   <w:rStyle w:val="Hipervnculo"/>
@@ -3021,14 +3128,12 @@
               <w:rPr>
                 <w:b/>
                 <w:szCs w:val="24"/>
-                <w:lang w:val="en-US"/>
               </w:rPr>
             </w:pPr>
             <w:r>
               <w:rPr>
                 <w:b/>
                 <w:szCs w:val="24"/>
-                <w:lang w:val="en-US"/>
               </w:rPr>
               <w:t xml:space="preserve">00 00 07 E8 41 01 FF </w:t>
             </w:r>
@@ -3037,7 +3142,6 @@
               <w:rPr>
                 <w:b/>
                 <w:szCs w:val="24"/>
-                <w:lang w:val="en-US"/>
               </w:rPr>
               <w:t>FF</w:t>
             </w:r>
@@ -3046,7 +3150,6 @@
               <w:rPr>
                 <w:b/>
                 <w:szCs w:val="24"/>
-                <w:lang w:val="en-US"/>
               </w:rPr>
               <w:t xml:space="preserve"> </w:t>
             </w:r>
@@ -3055,7 +3158,6 @@
               <w:rPr>
                 <w:b/>
                 <w:szCs w:val="24"/>
-                <w:lang w:val="en-US"/>
               </w:rPr>
               <w:t>FF</w:t>
             </w:r>
@@ -3064,7 +3166,6 @@
               <w:rPr>
                 <w:b/>
                 <w:szCs w:val="24"/>
-                <w:lang w:val="en-US"/>
               </w:rPr>
               <w:t xml:space="preserve"> </w:t>
             </w:r>
@@ -3073,7 +3174,6 @@
               <w:rPr>
                 <w:b/>
                 <w:szCs w:val="24"/>
-                <w:lang w:val="en-US"/>
               </w:rPr>
               <w:t>FF</w:t>
             </w:r>
@@ -3082,7 +3182,6 @@
               <w:rPr>
                 <w:b/>
                 <w:szCs w:val="24"/>
-                <w:lang w:val="en-US"/>
               </w:rPr>
               <w:t xml:space="preserve"> </w:t>
             </w:r>
@@ -3091,7 +3190,6 @@
               <w:rPr>
                 <w:b/>
                 <w:szCs w:val="24"/>
-                <w:lang w:val="en-US"/>
               </w:rPr>
               <w:t>FF</w:t>
             </w:r>
@@ -3100,7 +3198,6 @@
               <w:rPr>
                 <w:b/>
                 <w:szCs w:val="24"/>
-                <w:lang w:val="en-US"/>
               </w:rPr>
               <w:t xml:space="preserve"> #ZYTSKC</w:t>
             </w:r>
@@ -3111,38 +3208,23 @@
               <w:rPr>
                 <w:sz w:val="24"/>
                 <w:szCs w:val="24"/>
-                <w:lang w:val="en-US"/>
-              </w:rPr>
-            </w:pPr>
-          </w:p>
-          <w:p>
-            <w:pPr>
-              <w:jc w:val="both"/>
-              <w:rPr>
-                <w:sz w:val="24"/>
-                <w:szCs w:val="24"/>
-              </w:rPr>
-            </w:pPr>
-            <w:r>
-              <w:rPr>
-                <w:sz w:val="24"/>
-                <w:szCs w:val="24"/>
-              </w:rPr>
-              <w:t xml:space="preserve">La interpretación de lecturas del ECU se realiza en base a lo establecido por </w:t>
-            </w:r>
-            <w:r>
-              <w:rPr>
-                <w:sz w:val="24"/>
-                <w:szCs w:val="24"/>
-              </w:rPr>
-              <w:t>el estándar OBD-II SAE J1979</w:t>
-            </w:r>
-            <w:r>
-              <w:rPr>
-                <w:sz w:val="24"/>
-                <w:szCs w:val="24"/>
-              </w:rPr>
-              <w:t xml:space="preserve"> y se describe más detalladamente más adelante. La interpretación de los resultados se almacenan en los campos:</w:t>
+              </w:rPr>
+            </w:pPr>
+          </w:p>
+          <w:p>
+            <w:pPr>
+              <w:jc w:val="both"/>
+              <w:rPr>
+                <w:sz w:val="24"/>
+                <w:szCs w:val="24"/>
+              </w:rPr>
+            </w:pPr>
+            <w:r>
+              <w:rPr>
+                <w:sz w:val="24"/>
+                <w:szCs w:val="24"/>
+              </w:rPr>
+              <w:t>La interpretación de lecturas del ECU se realiza en base a lo establecido por el estándar OBD-II SAE J1979 y se describe más detalladamente más adelante. La interpretación de los resultados se almacenan en los campos:</w:t>
             </w:r>
           </w:p>
           <w:p>
@@ -3167,133 +3249,7 @@
                 <w:sz w:val="24"/>
                 <w:szCs w:val="24"/>
               </w:rPr>
-              <w:t xml:space="preserve">, OBD_MSI, </w:t>
-            </w:r>
-            <w:r>
-              <w:rPr>
-                <w:sz w:val="24"/>
-                <w:szCs w:val="24"/>
-              </w:rPr>
-              <w:t>OBD_</w:t>
-            </w:r>
-            <w:r>
-              <w:rPr>
-                <w:sz w:val="24"/>
-                <w:szCs w:val="24"/>
-              </w:rPr>
-              <w:t xml:space="preserve">CCM, </w:t>
-            </w:r>
-            <w:r>
-              <w:rPr>
-                <w:sz w:val="24"/>
-                <w:szCs w:val="24"/>
-              </w:rPr>
-              <w:t>OBD_</w:t>
-            </w:r>
-            <w:r>
-              <w:rPr>
-                <w:sz w:val="24"/>
-                <w:szCs w:val="24"/>
-              </w:rPr>
-              <w:t xml:space="preserve">CMB, </w:t>
-            </w:r>
-            <w:r>
-              <w:rPr>
-                <w:sz w:val="24"/>
-                <w:szCs w:val="24"/>
-              </w:rPr>
-              <w:t>OBD_</w:t>
-            </w:r>
-            <w:r>
-              <w:rPr>
-                <w:sz w:val="24"/>
-                <w:szCs w:val="24"/>
-              </w:rPr>
-              <w:t xml:space="preserve">O2S, </w:t>
-            </w:r>
-            <w:r>
-              <w:rPr>
-                <w:sz w:val="24"/>
-                <w:szCs w:val="24"/>
-              </w:rPr>
-              <w:t>OBD_</w:t>
-            </w:r>
-            <w:r>
-              <w:rPr>
-                <w:sz w:val="24"/>
-                <w:szCs w:val="24"/>
-              </w:rPr>
-              <w:t xml:space="preserve">CAT, </w:t>
-            </w:r>
-            <w:r>
-              <w:rPr>
-                <w:sz w:val="24"/>
-                <w:szCs w:val="24"/>
-              </w:rPr>
-              <w:t>OBD_</w:t>
-            </w:r>
-            <w:r>
-              <w:rPr>
-                <w:sz w:val="24"/>
-                <w:szCs w:val="24"/>
-              </w:rPr>
-              <w:t xml:space="preserve">CCC, </w:t>
-            </w:r>
-            <w:r>
-              <w:rPr>
-                <w:sz w:val="24"/>
-                <w:szCs w:val="24"/>
-              </w:rPr>
-              <w:t>OBD_</w:t>
-            </w:r>
-            <w:r>
-              <w:rPr>
-                <w:sz w:val="24"/>
-                <w:szCs w:val="24"/>
-              </w:rPr>
-              <w:t xml:space="preserve">EVS, </w:t>
-            </w:r>
-            <w:r>
-              <w:rPr>
-                <w:sz w:val="24"/>
-                <w:szCs w:val="24"/>
-              </w:rPr>
-              <w:t>OBD_</w:t>
-            </w:r>
-            <w:r>
-              <w:rPr>
-                <w:sz w:val="24"/>
-                <w:szCs w:val="24"/>
-              </w:rPr>
-              <w:t xml:space="preserve">SAS, </w:t>
-            </w:r>
-            <w:r>
-              <w:rPr>
-                <w:sz w:val="24"/>
-                <w:szCs w:val="24"/>
-              </w:rPr>
-              <w:t>OBD_</w:t>
-            </w:r>
-            <w:r>
-              <w:rPr>
-                <w:sz w:val="24"/>
-                <w:szCs w:val="24"/>
-              </w:rPr>
-              <w:t xml:space="preserve">FAA, </w:t>
-            </w:r>
-            <w:r>
-              <w:rPr>
-                <w:sz w:val="24"/>
-                <w:szCs w:val="24"/>
-              </w:rPr>
-              <w:t>OBD_</w:t>
-            </w:r>
-            <w:r>
-              <w:rPr>
-                <w:sz w:val="24"/>
-                <w:szCs w:val="24"/>
-              </w:rPr>
-              <w:t xml:space="preserve">O2C. </w:t>
+              <w:t xml:space="preserve">, OBD_MSI, OBD_CCM, OBD_CMB, OBD_O2S, OBD_CAT, OBD_CCC, OBD_EVS, OBD_SAS, OBD_FAA, OBD_O2C. </w:t>
             </w:r>
           </w:p>
           <w:p>
@@ -3441,14 +3397,7 @@
                 <w:sz w:val="24"/>
                 <w:szCs w:val="24"/>
               </w:rPr>
-              <w:t xml:space="preserve"> F</w:t>
-            </w:r>
-            <w:r>
-              <w:rPr>
-                <w:sz w:val="24"/>
-                <w:szCs w:val="24"/>
-              </w:rPr>
-              <w:t xml:space="preserve">ormato hexadecimal, PID 01 01, lectura original del ECU. </w:t>
+              <w:t xml:space="preserve"> Formato hexadecimal, PID 01 01, lectura original del ECU. </w:t>
             </w:r>
             <w:r>
               <w:rPr>
@@ -5754,8 +5703,10 @@
       </w:pPr>
       <w:r>
         <w:rPr>
+          <w:noProof/>
           <w:sz w:val="24"/>
           <w:szCs w:val="24"/>
+          <w:lang w:eastAsia="es-MX"/>
         </w:rPr>
         <w:drawing>
           <wp:inline distT="0" distB="0" distL="0" distR="0" wp14:anchorId="691D1BD9" wp14:editId="1CC249C6">
@@ -5773,7 +5724,7 @@
                     <pic:cNvPicPr/>
                   </pic:nvPicPr>
                   <pic:blipFill>
-                    <a:blip r:embed="rId11"/>
+                    <a:blip r:embed="rId12"/>
                     <a:stretch>
                       <a:fillRect/>
                     </a:stretch>
@@ -5813,8 +5764,10 @@
       </w:pPr>
       <w:r>
         <w:rPr>
+          <w:noProof/>
           <w:sz w:val="24"/>
           <w:szCs w:val="24"/>
+          <w:lang w:eastAsia="es-MX"/>
         </w:rPr>
         <w:drawing>
           <wp:inline distT="0" distB="0" distL="0" distR="0" wp14:anchorId="08188F99" wp14:editId="3149940F">
@@ -5832,7 +5785,7 @@
                     <pic:cNvPicPr/>
                   </pic:nvPicPr>
                   <pic:blipFill>
-                    <a:blip r:embed="rId12"/>
+                    <a:blip r:embed="rId13"/>
                     <a:stretch>
                       <a:fillRect/>
                     </a:stretch>
@@ -5863,8 +5816,10 @@
       </w:pPr>
       <w:r>
         <w:rPr>
+          <w:noProof/>
           <w:sz w:val="24"/>
           <w:szCs w:val="24"/>
+          <w:lang w:eastAsia="es-MX"/>
         </w:rPr>
         <w:lastRenderedPageBreak/>
         <w:drawing>
@@ -5883,7 +5838,7 @@
                     <pic:cNvPicPr/>
                   </pic:nvPicPr>
                   <pic:blipFill>
-                    <a:blip r:embed="rId13"/>
+                    <a:blip r:embed="rId14"/>
                     <a:stretch>
                       <a:fillRect/>
                     </a:stretch>
@@ -5963,7 +5918,7 @@
                     </pic:cNvPicPr>
                   </pic:nvPicPr>
                   <pic:blipFill>
-                    <a:blip r:embed="rId14">
+                    <a:blip r:embed="rId15">
                       <a:extLst>
                         <a:ext uri="{28A0092B-C50C-407E-A947-70E740481C1C}">
                           <a14:useLocalDpi xmlns:a14="http://schemas.microsoft.com/office/drawing/2010/main" val="0"/>
@@ -5996,8 +5951,8 @@
       </w:r>
     </w:p>
     <w:sectPr>
-      <w:headerReference w:type="default" r:id="rId15"/>
-      <w:footerReference w:type="default" r:id="rId16"/>
+      <w:headerReference w:type="default" r:id="rId16"/>
+      <w:footerReference w:type="default" r:id="rId17"/>
       <w:pgSz w:w="12240" w:h="15840"/>
       <w:pgMar w:top="2268" w:right="1418" w:bottom="1418" w:left="1418" w:header="709" w:footer="709" w:gutter="0"/>
       <w:cols w:space="708"/>
@@ -11827,7 +11782,7 @@
   <a:extraClrSchemeLst/>
   <a:extLst>
     <a:ext uri="{05A4C25C-085E-4340-85A3-A5531E510DB2}">
-      <thm15:themeFamily xmlns="" xmlns:thm15="http://schemas.microsoft.com/office/thememl/2012/main" name="Office Theme" id="{62F939B6-93AF-4DB8-9C6B-D6C7DFDC589F}" vid="{4A3C46E8-61CC-4603-A589-7422A47A8E4A}"/>
+      <thm15:themeFamily xmlns:thm15="http://schemas.microsoft.com/office/thememl/2012/main" xmlns="" name="Office Theme" id="{62F939B6-93AF-4DB8-9C6B-D6C7DFDC589F}" vid="{4A3C46E8-61CC-4603-A589-7422A47A8E4A}"/>
     </a:ext>
   </a:extLst>
 </a:theme>
@@ -11838,7 +11793,7 @@
 </file>
 
 <file path=customXml/itemProps1.xml><?xml version="1.0" encoding="utf-8"?>
-<ds:datastoreItem xmlns:ds="http://schemas.openxmlformats.org/officeDocument/2006/customXml" ds:itemID="{96DDCA91-4842-4283-BB74-C88B3EB221E4}">
+<ds:datastoreItem xmlns:ds="http://schemas.openxmlformats.org/officeDocument/2006/customXml" ds:itemID="{BF7EF6D2-702D-48E6-8573-8581BA6693CC}">
   <ds:schemaRefs>
     <ds:schemaRef ds:uri="http://schemas.openxmlformats.org/officeDocument/2006/bibliography"/>
   </ds:schemaRefs>

</xml_diff>